<commit_message>
Why regression cannot be used inclassification
</commit_message>
<xml_diff>
--- a/ML_Interview_questions.docx
+++ b/ML_Interview_questions.docx
@@ -372,6 +372,104 @@
         <w:t>: If a model learns weights [2, -3, 0.5], L1 would penalize |2| + |-3| + |0.5| = 5.5, while L2 would penalize 2² + (-3)² + 0.5² = 13.25.</w:t>
       </w:r>
     </w:p>
+    <w:p/>
+    <w:p>
+      <w:pPr>
+        <w:rPr>
+          <w:b/>
+          <w:bCs/>
+        </w:rPr>
+      </w:pPr>
+      <w:r>
+        <w:rPr>
+          <w:b/>
+          <w:bCs/>
+        </w:rPr>
+        <w:t xml:space="preserve">4. </w:t>
+      </w:r>
+      <w:r>
+        <w:rPr>
+          <w:b/>
+          <w:bCs/>
+        </w:rPr>
+        <w:t>Why we cannot use linear regression for a classification task?</w:t>
+      </w:r>
+    </w:p>
+    <w:p>
+      <w:r>
+        <w:t>Linear regression gives continuous outputs (like 2.3, -1.5), but classification needs clear categories (like 0 or 1).</w:t>
+      </w:r>
+      <w:r>
+        <w:br/>
+        <w:t>Using it for classification can create a non-convex error curve, which might trap the model in a bad "local minimum."</w:t>
+      </w:r>
+    </w:p>
+    <w:p>
+      <w:r>
+        <w:t>A non-convex error curve is a type of graph that shows the model’s error (or loss) across different values of its parameters, but instead of having just one clear lowest point (global minimum), it has multiple dips or valleys (local minima).</w:t>
+      </w:r>
+    </w:p>
+    <w:p>
+      <w:r>
+        <w:t>This makes it harder for optimization algorithms (like gradient descent) to find the best solution, because they might get "stuck" in one of the small valleys instead of reaching the lowest one.</w:t>
+      </w:r>
+    </w:p>
+    <w:p>
+      <w:r>
+        <w:rPr>
+          <w:noProof/>
+        </w:rPr>
+        <w:drawing>
+          <wp:inline distT="0" distB="0" distL="0" distR="0" wp14:anchorId="3CB87478" wp14:editId="5DA49E62">
+            <wp:extent cx="5731510" cy="2364740"/>
+            <wp:effectExtent l="0" t="0" r="2540" b="0"/>
+            <wp:docPr id="1781781685" name="Picture 1" descr="Logistic Regression - KeyToDataScience"/>
+            <wp:cNvGraphicFramePr>
+              <a:graphicFrameLocks xmlns:a="http://schemas.openxmlformats.org/drawingml/2006/main" noChangeAspect="1"/>
+            </wp:cNvGraphicFramePr>
+            <a:graphic xmlns:a="http://schemas.openxmlformats.org/drawingml/2006/main">
+              <a:graphicData uri="http://schemas.openxmlformats.org/drawingml/2006/picture">
+                <pic:pic xmlns:pic="http://schemas.openxmlformats.org/drawingml/2006/picture">
+                  <pic:nvPicPr>
+                    <pic:cNvPr id="0" name="Picture 1" descr="Logistic Regression - KeyToDataScience"/>
+                    <pic:cNvPicPr>
+                      <a:picLocks noChangeAspect="1" noChangeArrowheads="1"/>
+                    </pic:cNvPicPr>
+                  </pic:nvPicPr>
+                  <pic:blipFill>
+                    <a:blip r:embed="rId9">
+                      <a:extLst>
+                        <a:ext uri="{28A0092B-C50C-407E-A947-70E740481C1C}">
+                          <a14:useLocalDpi xmlns:a14="http://schemas.microsoft.com/office/drawing/2010/main" val="0"/>
+                        </a:ext>
+                      </a:extLst>
+                    </a:blip>
+                    <a:srcRect/>
+                    <a:stretch>
+                      <a:fillRect/>
+                    </a:stretch>
+                  </pic:blipFill>
+                  <pic:spPr bwMode="auto">
+                    <a:xfrm>
+                      <a:off x="0" y="0"/>
+                      <a:ext cx="5731510" cy="2364740"/>
+                    </a:xfrm>
+                    <a:prstGeom prst="rect">
+                      <a:avLst/>
+                    </a:prstGeom>
+                    <a:noFill/>
+                    <a:ln>
+                      <a:noFill/>
+                    </a:ln>
+                  </pic:spPr>
+                </pic:pic>
+              </a:graphicData>
+            </a:graphic>
+          </wp:inline>
+        </w:drawing>
+      </w:r>
+    </w:p>
+    <w:p/>
     <w:p/>
     <w:p/>
     <w:p>

</xml_diff>

<commit_message>
What is precision and recall
</commit_message>
<xml_diff>
--- a/ML_Interview_questions.docx
+++ b/ML_Interview_questions.docx
@@ -484,22 +484,159 @@
           <w:bCs/>
         </w:rPr>
         <w:lastRenderedPageBreak/>
-        <w:t xml:space="preserve">5. </w:t>
-      </w:r>
-      <w:r>
-        <w:rPr>
-          <w:b/>
-          <w:bCs/>
-        </w:rPr>
-        <w:t>Why do we perform normalization?</w:t>
+        <w:t>5. Why do we perform normalization?</w:t>
       </w:r>
       <w:r>
         <w:t xml:space="preserve"> </w:t>
       </w:r>
     </w:p>
     <w:p>
+      <w:pPr>
+        <w:rPr>
+          <w:b/>
+          <w:bCs/>
+        </w:rPr>
+      </w:pPr>
       <w:r>
         <w:t>To achieve stable and fast training of the model we use normalization techniques to bring all the features to a certain scale or range of values.</w:t>
+      </w:r>
+    </w:p>
+    <w:p>
+      <w:pPr>
+        <w:rPr>
+          <w:b/>
+          <w:bCs/>
+        </w:rPr>
+      </w:pPr>
+      <w:r>
+        <w:rPr>
+          <w:b/>
+          <w:bCs/>
+        </w:rPr>
+        <w:t xml:space="preserve">6. What is the difference between precision and recall? </w:t>
+      </w:r>
+    </w:p>
+    <w:p>
+      <w:r>
+        <w:rPr>
+          <w:b/>
+          <w:bCs/>
+        </w:rPr>
+        <w:t xml:space="preserve">NOTE: </w:t>
+      </w:r>
+      <w:r>
+        <w:t>In machine learning, TP (True Positive) is a correct positive prediction, FP (False Positive) is an incorrect positive prediction, and FN (False Negative) is a missed positive case.</w:t>
+      </w:r>
+    </w:p>
+    <w:p>
+      <w:r>
+        <w:t xml:space="preserve">Precision is the </w:t>
+      </w:r>
+      <w:r>
+        <w:rPr>
+          <w:b/>
+          <w:bCs/>
+        </w:rPr>
+        <w:t xml:space="preserve">ratio between the true </w:t>
+      </w:r>
+      <w:proofErr w:type="gramStart"/>
+      <w:r>
+        <w:rPr>
+          <w:b/>
+          <w:bCs/>
+        </w:rPr>
+        <w:t>positives(</w:t>
+      </w:r>
+      <w:proofErr w:type="gramEnd"/>
+      <w:r>
+        <w:rPr>
+          <w:b/>
+          <w:bCs/>
+        </w:rPr>
+        <w:t xml:space="preserve">TP) and all the positive examples (TP+FP) </w:t>
+      </w:r>
+      <w:r>
+        <w:t xml:space="preserve">predicted by the model. In other words, precision measures how many of the predicted positive examples are actually true positives. It is a measure of the model’s ability </w:t>
+      </w:r>
+      <w:r>
+        <w:rPr>
+          <w:b/>
+          <w:bCs/>
+        </w:rPr>
+        <w:t xml:space="preserve">to avoid false positives </w:t>
+      </w:r>
+      <w:r>
+        <w:rPr>
+          <w:b/>
+          <w:bCs/>
+        </w:rPr>
+        <w:t>and make accurate positive predictions.</w:t>
+      </w:r>
+      <w:r>
+        <w:t xml:space="preserve"> </w:t>
+      </w:r>
+    </w:p>
+    <w:p>
+      <w:r>
+        <w:t>Precision =</w:t>
+      </w:r>
+      <w:r>
+        <w:t xml:space="preserve"> </w:t>
+      </w:r>
+      <w:r>
+        <w:t xml:space="preserve">TP </w:t>
+      </w:r>
+      <w:r>
+        <w:t xml:space="preserve">/ </w:t>
+      </w:r>
+      <w:r>
+        <w:t xml:space="preserve">TP +FP </w:t>
+      </w:r>
+    </w:p>
+    <w:p>
+      <w:r>
+        <w:t xml:space="preserve">In recall, we calculate the </w:t>
+      </w:r>
+      <w:r>
+        <w:rPr>
+          <w:b/>
+          <w:bCs/>
+        </w:rPr>
+        <w:t>ratio of true positives (TP) and the total number of examples</w:t>
+      </w:r>
+      <w:r>
+        <w:rPr>
+          <w:b/>
+          <w:bCs/>
+        </w:rPr>
+        <w:t xml:space="preserve"> (TP+FN)</w:t>
+      </w:r>
+      <w:r>
+        <w:t xml:space="preserve"> that actually fall in the positive class. Recall measures how many of the actual positive examples are correctly identified by the model. It is a measure of the model’s </w:t>
+      </w:r>
+      <w:r>
+        <w:rPr>
+          <w:b/>
+          <w:bCs/>
+        </w:rPr>
+        <w:t>ability to avoid false negatives and identify all positive examples correctly</w:t>
+      </w:r>
+      <w:r>
+        <w:t xml:space="preserve">. </w:t>
+      </w:r>
+    </w:p>
+    <w:p>
+      <w:r>
+        <w:t>Recall =</w:t>
+      </w:r>
+      <w:r>
+        <w:t xml:space="preserve">TP/ </w:t>
+      </w:r>
+      <w:r>
+        <w:t>TP +F</w:t>
+      </w:r>
+      <w:r>
+        <w:t>N</w:t>
       </w:r>
     </w:p>
     <w:p/>

</xml_diff>

<commit_message>
examples for unsampling, downsampling
</commit_message>
<xml_diff>
--- a/ML_Interview_questions.docx
+++ b/ML_Interview_questions.docx
@@ -7,21 +7,18 @@
         <w:rPr>
           <w:b/>
           <w:bCs/>
-        </w:rPr>
-      </w:pPr>
-      <w:r>
-        <w:rPr>
-          <w:b/>
-          <w:bCs/>
-        </w:rPr>
-        <w:t>1</w:t>
-      </w:r>
-      <w:r>
-        <w:rPr>
-          <w:b/>
-          <w:bCs/>
-        </w:rPr>
-        <w:t>. How to choose an optimal number of clusters</w:t>
+          <w:sz w:val="28"/>
+          <w:szCs w:val="28"/>
+        </w:rPr>
+      </w:pPr>
+      <w:r>
+        <w:rPr>
+          <w:b/>
+          <w:bCs/>
+          <w:sz w:val="28"/>
+          <w:szCs w:val="28"/>
+        </w:rPr>
+        <w:t>1. How to choose an optimal number of clusters</w:t>
       </w:r>
     </w:p>
     <w:p>
@@ -201,9 +198,9 @@
           <w:noProof/>
         </w:rPr>
         <w:drawing>
-          <wp:inline distT="0" distB="0" distL="0" distR="0" wp14:anchorId="7DB79FBF" wp14:editId="4D40B39B">
-            <wp:extent cx="5731510" cy="3146425"/>
-            <wp:effectExtent l="0" t="0" r="2540" b="0"/>
+          <wp:inline distT="0" distB="0" distL="0" distR="0" wp14:anchorId="7DB79FBF" wp14:editId="2B825C94">
+            <wp:extent cx="4003964" cy="2198055"/>
+            <wp:effectExtent l="0" t="0" r="0" b="0"/>
             <wp:docPr id="899705069" name="Picture 1"/>
             <wp:cNvGraphicFramePr>
               <a:graphicFrameLocks xmlns:a="http://schemas.openxmlformats.org/drawingml/2006/main" noChangeAspect="1"/>
@@ -224,7 +221,7 @@
                   <pic:spPr>
                     <a:xfrm>
                       <a:off x="0" y="0"/>
-                      <a:ext cx="5731510" cy="3146425"/>
+                      <a:ext cx="4016063" cy="2204697"/>
                     </a:xfrm>
                     <a:prstGeom prst="rect">
                       <a:avLst/>
@@ -239,28 +236,25 @@
     </w:p>
     <w:p/>
     <w:p>
-      <w:r>
-        <w:rPr>
-          <w:b/>
-          <w:bCs/>
-        </w:rPr>
-        <w:t xml:space="preserve">2. </w:t>
-      </w:r>
-      <w:r>
-        <w:rPr>
-          <w:b/>
-          <w:bCs/>
-        </w:rPr>
-        <w:t xml:space="preserve"> What is feature engineering? How does it affect the model’s performance? </w:t>
-      </w:r>
-    </w:p>
-    <w:p>
-      <w:r>
-        <w:t xml:space="preserve"> Feature engineering refers to developing some new features by using existing features. Sometimes there is a very subtle mathematical relation between some features which if explored properly then the new features can be developed using those mathematical operations. Also, there are times when </w:t>
-      </w:r>
-      <w:r>
-        <w:lastRenderedPageBreak/>
-        <w:t xml:space="preserve">multiple pieces of information are clubbed and provided as a single data column. At those times developing new features and using them help us to gain deeper insights into the data as well as if the features derived are significant enough helps to </w:t>
+      <w:pPr>
+        <w:rPr>
+          <w:sz w:val="28"/>
+          <w:szCs w:val="28"/>
+        </w:rPr>
+      </w:pPr>
+      <w:r>
+        <w:rPr>
+          <w:b/>
+          <w:bCs/>
+          <w:sz w:val="28"/>
+          <w:szCs w:val="28"/>
+        </w:rPr>
+        <w:t>2.  What is feature engineering? How does it affect the model’s performance? </w:t>
+      </w:r>
+    </w:p>
+    <w:p>
+      <w:r>
+        <w:t xml:space="preserve"> Feature engineering refers to developing some new features by using existing features. Sometimes there is a very subtle mathematical relation between some features which if explored properly then the new features can be developed using those mathematical operations. Also, there are times when multiple pieces of information are clubbed and provided as a single data column. At those times developing new features and using them help us to gain deeper insights into the data as well as if the features derived are significant enough helps to </w:t>
       </w:r>
       <w:r>
         <w:t>improvement</w:t>
@@ -271,19 +265,20 @@
     </w:p>
     <w:p/>
     <w:p>
-      <w:r>
-        <w:rPr>
-          <w:b/>
-          <w:bCs/>
-        </w:rPr>
-        <w:t xml:space="preserve">3. </w:t>
-      </w:r>
-      <w:r>
-        <w:rPr>
-          <w:b/>
-          <w:bCs/>
-        </w:rPr>
-        <w:t xml:space="preserve">What is overfitting in machine learning and how can it be avoided? </w:t>
+      <w:pPr>
+        <w:rPr>
+          <w:sz w:val="28"/>
+          <w:szCs w:val="28"/>
+        </w:rPr>
+      </w:pPr>
+      <w:r>
+        <w:rPr>
+          <w:b/>
+          <w:bCs/>
+          <w:sz w:val="28"/>
+          <w:szCs w:val="28"/>
+        </w:rPr>
+        <w:t xml:space="preserve">3. What is overfitting in machine learning and how can it be avoided? </w:t>
       </w:r>
     </w:p>
     <w:p>
@@ -386,21 +381,18 @@
         <w:rPr>
           <w:b/>
           <w:bCs/>
-        </w:rPr>
-      </w:pPr>
-      <w:r>
-        <w:rPr>
-          <w:b/>
-          <w:bCs/>
-        </w:rPr>
-        <w:t xml:space="preserve">4. </w:t>
-      </w:r>
-      <w:r>
-        <w:rPr>
-          <w:b/>
-          <w:bCs/>
-        </w:rPr>
-        <w:t>Why we cannot use linear regression for a classification task?</w:t>
+          <w:sz w:val="28"/>
+          <w:szCs w:val="28"/>
+        </w:rPr>
+      </w:pPr>
+      <w:r>
+        <w:rPr>
+          <w:b/>
+          <w:bCs/>
+          <w:sz w:val="28"/>
+          <w:szCs w:val="28"/>
+        </w:rPr>
+        <w:t>4. Why we cannot use linear regression for a classification task?</w:t>
       </w:r>
     </w:p>
     <w:p>
@@ -478,189 +470,726 @@
       </w:r>
     </w:p>
     <w:p>
-      <w:r>
-        <w:rPr>
-          <w:b/>
-          <w:bCs/>
-        </w:rPr>
+      <w:pPr>
+        <w:rPr>
+          <w:sz w:val="28"/>
+          <w:szCs w:val="28"/>
+        </w:rPr>
+      </w:pPr>
+      <w:r>
+        <w:rPr>
+          <w:b/>
+          <w:bCs/>
+          <w:sz w:val="28"/>
+          <w:szCs w:val="28"/>
+        </w:rPr>
+        <w:t>5. Why do we perform normalization?</w:t>
+      </w:r>
+      <w:r>
+        <w:rPr>
+          <w:sz w:val="28"/>
+          <w:szCs w:val="28"/>
+        </w:rPr>
+        <w:t xml:space="preserve"> </w:t>
+      </w:r>
+    </w:p>
+    <w:p>
+      <w:pPr>
+        <w:rPr>
+          <w:b/>
+          <w:bCs/>
+        </w:rPr>
+      </w:pPr>
+      <w:r>
         <w:lastRenderedPageBreak/>
-        <w:t>5. Why do we perform normalization?</w:t>
+        <w:t>To achieve stable and fast training of the model we use normalization techniques to bring all the features to a certain scale or range of values.</w:t>
+      </w:r>
+    </w:p>
+    <w:p>
+      <w:pPr>
+        <w:rPr>
+          <w:b/>
+          <w:bCs/>
+          <w:sz w:val="28"/>
+          <w:szCs w:val="28"/>
+        </w:rPr>
+      </w:pPr>
+      <w:r>
+        <w:rPr>
+          <w:b/>
+          <w:bCs/>
+          <w:sz w:val="28"/>
+          <w:szCs w:val="28"/>
+        </w:rPr>
+        <w:t xml:space="preserve">6. What is the difference between precision and recall? </w:t>
+      </w:r>
+    </w:p>
+    <w:p>
+      <w:r>
+        <w:rPr>
+          <w:b/>
+          <w:bCs/>
+        </w:rPr>
+        <w:t xml:space="preserve">NOTE: </w:t>
+      </w:r>
+      <w:r>
+        <w:t>In machine learning, TP (True Positive) is a correct positive prediction, FP (False Positive) is an incorrect positive prediction, and FN (False Negative) is a missed positive case.</w:t>
+      </w:r>
+    </w:p>
+    <w:p>
+      <w:r>
+        <w:t xml:space="preserve">Precision is the </w:t>
+      </w:r>
+      <w:r>
+        <w:rPr>
+          <w:b/>
+          <w:bCs/>
+        </w:rPr>
+        <w:t xml:space="preserve">ratio between the true </w:t>
+      </w:r>
+      <w:proofErr w:type="gramStart"/>
+      <w:r>
+        <w:rPr>
+          <w:b/>
+          <w:bCs/>
+        </w:rPr>
+        <w:t>positives(</w:t>
+      </w:r>
+      <w:proofErr w:type="gramEnd"/>
+      <w:r>
+        <w:rPr>
+          <w:b/>
+          <w:bCs/>
+        </w:rPr>
+        <w:t xml:space="preserve">TP) and all the positive examples (TP+FP) </w:t>
+      </w:r>
+      <w:r>
+        <w:t xml:space="preserve">predicted by the model. In other words, precision measures how many of the predicted positive examples are actually true positives. It is a measure of the model’s ability </w:t>
+      </w:r>
+      <w:r>
+        <w:rPr>
+          <w:b/>
+          <w:bCs/>
+        </w:rPr>
+        <w:t xml:space="preserve">to avoid false positives </w:t>
+      </w:r>
+      <w:r>
+        <w:rPr>
+          <w:b/>
+          <w:bCs/>
+        </w:rPr>
+        <w:t>and make accurate positive predictions.</w:t>
       </w:r>
       <w:r>
         <w:t xml:space="preserve"> </w:t>
       </w:r>
     </w:p>
     <w:p>
-      <w:pPr>
-        <w:rPr>
-          <w:b/>
-          <w:bCs/>
-        </w:rPr>
-      </w:pPr>
-      <w:r>
-        <w:t>To achieve stable and fast training of the model we use normalization techniques to bring all the features to a certain scale or range of values.</w:t>
-      </w:r>
-    </w:p>
-    <w:p>
-      <w:pPr>
-        <w:rPr>
-          <w:b/>
-          <w:bCs/>
-        </w:rPr>
-      </w:pPr>
-      <w:r>
-        <w:rPr>
-          <w:b/>
-          <w:bCs/>
-        </w:rPr>
-        <w:t xml:space="preserve">6. What is the difference between precision and recall? </w:t>
-      </w:r>
-    </w:p>
-    <w:p>
-      <w:r>
-        <w:rPr>
-          <w:b/>
-          <w:bCs/>
-        </w:rPr>
-        <w:t xml:space="preserve">NOTE: </w:t>
-      </w:r>
-      <w:r>
-        <w:t>In machine learning, TP (True Positive) is a correct positive prediction, FP (False Positive) is an incorrect positive prediction, and FN (False Negative) is a missed positive case.</w:t>
-      </w:r>
-    </w:p>
-    <w:p>
-      <w:r>
-        <w:t xml:space="preserve">Precision is the </w:t>
-      </w:r>
-      <w:r>
-        <w:rPr>
-          <w:b/>
-          <w:bCs/>
-        </w:rPr>
-        <w:t xml:space="preserve">ratio between the true </w:t>
+      <w:r>
+        <w:t>Precision =</w:t>
+      </w:r>
+      <w:r>
+        <w:t xml:space="preserve"> </w:t>
+      </w:r>
+      <w:r>
+        <w:t xml:space="preserve">TP </w:t>
+      </w:r>
+      <w:r>
+        <w:t xml:space="preserve">/ </w:t>
+      </w:r>
+      <w:r>
+        <w:t xml:space="preserve">TP +FP </w:t>
+      </w:r>
+    </w:p>
+    <w:p>
+      <w:r>
+        <w:t xml:space="preserve">In recall, we calculate the </w:t>
+      </w:r>
+      <w:r>
+        <w:rPr>
+          <w:b/>
+          <w:bCs/>
+        </w:rPr>
+        <w:t>ratio of true positives (TP) and the total number of examples</w:t>
+      </w:r>
+      <w:r>
+        <w:rPr>
+          <w:b/>
+          <w:bCs/>
+        </w:rPr>
+        <w:t xml:space="preserve"> (TP+FN)</w:t>
+      </w:r>
+      <w:r>
+        <w:t xml:space="preserve"> that actually fall in the positive class. Recall measures how many of the actual positive examples are correctly identified by the model. It is a measure of the model’s </w:t>
+      </w:r>
+      <w:r>
+        <w:rPr>
+          <w:b/>
+          <w:bCs/>
+        </w:rPr>
+        <w:t>ability to avoid false negatives and identify all positive examples correctly</w:t>
+      </w:r>
+      <w:r>
+        <w:t xml:space="preserve">. </w:t>
+      </w:r>
+    </w:p>
+    <w:p>
+      <w:r>
+        <w:t>Recall =</w:t>
+      </w:r>
+      <w:r>
+        <w:t xml:space="preserve">TP/ </w:t>
+      </w:r>
+      <w:r>
+        <w:t>TP +F</w:t>
+      </w:r>
+      <w:r>
+        <w:t>N</w:t>
+      </w:r>
+    </w:p>
+    <w:p>
+      <w:pPr>
+        <w:rPr>
+          <w:sz w:val="28"/>
+          <w:szCs w:val="28"/>
+        </w:rPr>
+      </w:pPr>
+      <w:r>
+        <w:rPr>
+          <w:b/>
+          <w:bCs/>
+          <w:sz w:val="28"/>
+          <w:szCs w:val="28"/>
+        </w:rPr>
+        <w:t xml:space="preserve">7. What is the difference between </w:t>
+      </w:r>
+      <w:proofErr w:type="spellStart"/>
+      <w:r>
+        <w:rPr>
+          <w:b/>
+          <w:bCs/>
+          <w:sz w:val="28"/>
+          <w:szCs w:val="28"/>
+        </w:rPr>
+        <w:t>upsampling</w:t>
+      </w:r>
+      <w:proofErr w:type="spellEnd"/>
+      <w:r>
+        <w:rPr>
+          <w:b/>
+          <w:bCs/>
+          <w:sz w:val="28"/>
+          <w:szCs w:val="28"/>
+        </w:rPr>
+        <w:t xml:space="preserve"> and </w:t>
+      </w:r>
+      <w:proofErr w:type="spellStart"/>
+      <w:r>
+        <w:rPr>
+          <w:b/>
+          <w:bCs/>
+          <w:sz w:val="28"/>
+          <w:szCs w:val="28"/>
+        </w:rPr>
+        <w:t>downsampling</w:t>
+      </w:r>
+      <w:proofErr w:type="spellEnd"/>
+      <w:r>
+        <w:rPr>
+          <w:b/>
+          <w:bCs/>
+          <w:sz w:val="28"/>
+          <w:szCs w:val="28"/>
+        </w:rPr>
+        <w:t>?</w:t>
+      </w:r>
+    </w:p>
+    <w:p>
+      <w:r>
+        <w:t xml:space="preserve"> In </w:t>
+      </w:r>
+      <w:proofErr w:type="spellStart"/>
+      <w:r>
+        <w:rPr>
+          <w:b/>
+          <w:bCs/>
+        </w:rPr>
+        <w:t>upsampling</w:t>
+      </w:r>
+      <w:proofErr w:type="spellEnd"/>
+      <w:r>
+        <w:t xml:space="preserve"> method, we </w:t>
+      </w:r>
+      <w:r>
+        <w:rPr>
+          <w:b/>
+          <w:bCs/>
+        </w:rPr>
+        <w:t>increase</w:t>
+      </w:r>
+      <w:r>
+        <w:t xml:space="preserve"> the number of samples in the </w:t>
+      </w:r>
+      <w:r>
+        <w:rPr>
+          <w:b/>
+          <w:bCs/>
+        </w:rPr>
+        <w:t>minority class</w:t>
+      </w:r>
+      <w:r>
+        <w:t xml:space="preserve"> by randomly selecting some points from the minority class and adding them to the dataset repeat this process till the </w:t>
+      </w:r>
+      <w:r>
+        <w:rPr>
+          <w:b/>
+          <w:bCs/>
+        </w:rPr>
+        <w:t>dataset gets balanced for each class</w:t>
+      </w:r>
+      <w:r>
+        <w:t xml:space="preserve">. </w:t>
       </w:r>
       <w:proofErr w:type="gramStart"/>
       <w:r>
-        <w:rPr>
-          <w:b/>
-          <w:bCs/>
-        </w:rPr>
-        <w:t>positives(</w:t>
+        <w:t>But,</w:t>
       </w:r>
       <w:proofErr w:type="gramEnd"/>
       <w:r>
-        <w:rPr>
-          <w:b/>
-          <w:bCs/>
-        </w:rPr>
-        <w:t xml:space="preserve">TP) and all the positive examples (TP+FP) </w:t>
-      </w:r>
-      <w:r>
-        <w:t xml:space="preserve">predicted by the model. In other words, precision measures how many of the predicted positive examples are actually true positives. It is a measure of the model’s ability </w:t>
-      </w:r>
-      <w:r>
-        <w:rPr>
-          <w:b/>
-          <w:bCs/>
-        </w:rPr>
-        <w:t xml:space="preserve">to avoid false positives </w:t>
-      </w:r>
-      <w:r>
-        <w:rPr>
-          <w:b/>
-          <w:bCs/>
-        </w:rPr>
-        <w:t>and make accurate positive predictions.</w:t>
-      </w:r>
-      <w:r>
+        <w:t xml:space="preserve"> here is a </w:t>
+      </w:r>
+      <w:r>
+        <w:rPr>
+          <w:b/>
+          <w:bCs/>
+        </w:rPr>
+        <w:t>disadvantage</w:t>
+      </w:r>
+      <w:r>
+        <w:t xml:space="preserve"> the training accuracy becomes high as in each epoch model trained more than once in each epoch but the </w:t>
+      </w:r>
+      <w:r>
+        <w:rPr>
+          <w:b/>
+          <w:bCs/>
+        </w:rPr>
+        <w:t>same high accuracy is not observed in the validation accuracy.</w:t>
+      </w:r>
+      <w:r>
+        <w:t xml:space="preserve">  </w:t>
+      </w:r>
+    </w:p>
+    <w:p>
+      <w:r>
+        <w:t xml:space="preserve">In </w:t>
+      </w:r>
+      <w:proofErr w:type="spellStart"/>
+      <w:r>
+        <w:rPr>
+          <w:b/>
+          <w:bCs/>
+        </w:rPr>
+        <w:t>downsampling</w:t>
+      </w:r>
+      <w:proofErr w:type="spellEnd"/>
+      <w:r>
+        <w:t xml:space="preserve">, we </w:t>
+      </w:r>
+      <w:r>
+        <w:rPr>
+          <w:b/>
+          <w:bCs/>
+        </w:rPr>
+        <w:t>decrease</w:t>
+      </w:r>
+      <w:r>
+        <w:t xml:space="preserve"> the number of samples in the </w:t>
+      </w:r>
+      <w:r>
+        <w:rPr>
+          <w:b/>
+          <w:bCs/>
+        </w:rPr>
+        <w:t>majority class</w:t>
+      </w:r>
+      <w:r>
+        <w:t xml:space="preserve"> by selecting some random number of points that are equal to the number of data points in the minority class so that the </w:t>
+      </w:r>
+      <w:r>
+        <w:rPr>
+          <w:b/>
+          <w:bCs/>
+        </w:rPr>
+        <w:t>distribution becomes balanced.</w:t>
+      </w:r>
+      <w:r>
+        <w:t xml:space="preserve"> In this case, we have to suffer from </w:t>
+      </w:r>
+      <w:r>
+        <w:rPr>
+          <w:b/>
+          <w:bCs/>
+        </w:rPr>
+        <w:t>data loss</w:t>
+      </w:r>
+      <w:r>
+        <w:t xml:space="preserve"> which may lead to the loss of some critical information as well.</w:t>
+      </w:r>
+    </w:p>
+    <w:p>
+      <w:pPr>
+        <w:rPr>
+          <w:b/>
+          <w:bCs/>
+        </w:rPr>
+      </w:pPr>
+      <w:r>
+        <w:rPr>
+          <w:rFonts w:ascii="Segoe UI Emoji" w:hAnsi="Segoe UI Emoji" w:cs="Segoe UI Emoji"/>
+          <w:b/>
+          <w:bCs/>
+        </w:rPr>
+        <w:t>🟣</w:t>
+      </w:r>
+      <w:r>
+        <w:rPr>
+          <w:b/>
+          <w:bCs/>
+        </w:rPr>
+        <w:t xml:space="preserve"> Suppose you have a dataset for classifying emails as Spam or Not Spam:</w:t>
+      </w:r>
+    </w:p>
+    <w:p>
+      <w:pPr>
+        <w:numPr>
+          <w:ilvl w:val="0"/>
+          <w:numId w:val="3"/>
+        </w:numPr>
+      </w:pPr>
+      <w:r>
+        <w:rPr>
+          <w:b/>
+          <w:bCs/>
+        </w:rPr>
+        <w:t>Not Spam (Majority class)</w:t>
+      </w:r>
+      <w:r>
+        <w:t>: 8 emails</w:t>
+      </w:r>
+    </w:p>
+    <w:p>
+      <w:pPr>
+        <w:numPr>
+          <w:ilvl w:val="0"/>
+          <w:numId w:val="3"/>
+        </w:numPr>
+      </w:pPr>
+      <w:r>
+        <w:rPr>
+          <w:b/>
+          <w:bCs/>
+        </w:rPr>
+        <w:t>Spam (Minority class)</w:t>
+      </w:r>
+      <w:r>
+        <w:t>: 2 emails</w:t>
+      </w:r>
+    </w:p>
+    <w:p>
+      <w:r>
+        <w:pict w14:anchorId="21C3AA4F">
+          <v:rect id="_x0000_i1037" style="width:0;height:1.5pt" o:hralign="center" o:hrstd="t" o:hr="t" fillcolor="#a0a0a0" stroked="f"/>
+        </w:pict>
+      </w:r>
+    </w:p>
+    <w:p>
+      <w:pPr>
+        <w:rPr>
+          <w:b/>
+          <w:bCs/>
+        </w:rPr>
+      </w:pPr>
+      <w:r>
+        <w:rPr>
+          <w:rFonts w:ascii="Segoe UI Emoji" w:hAnsi="Segoe UI Emoji" w:cs="Segoe UI Emoji"/>
+          <w:b/>
+          <w:bCs/>
+        </w:rPr>
+        <w:t>🔼</w:t>
+      </w:r>
+      <w:r>
+        <w:rPr>
+          <w:b/>
+          <w:bCs/>
+        </w:rPr>
         <w:t xml:space="preserve"> </w:t>
       </w:r>
-    </w:p>
-    <w:p>
-      <w:r>
-        <w:t>Precision =</w:t>
-      </w:r>
-      <w:r>
+      <w:proofErr w:type="spellStart"/>
+      <w:r>
+        <w:rPr>
+          <w:b/>
+          <w:bCs/>
+        </w:rPr>
+        <w:t>Upsampling</w:t>
+      </w:r>
+      <w:proofErr w:type="spellEnd"/>
+      <w:r>
+        <w:rPr>
+          <w:b/>
+          <w:bCs/>
+        </w:rPr>
+        <w:t xml:space="preserve"> Example:</w:t>
+      </w:r>
+    </w:p>
+    <w:p>
+      <w:r>
+        <w:t xml:space="preserve">We want to balance the dataset by increasing the number of </w:t>
+      </w:r>
+      <w:r>
+        <w:rPr>
+          <w:b/>
+          <w:bCs/>
+        </w:rPr>
+        <w:t>Spam</w:t>
+      </w:r>
+      <w:r>
+        <w:t xml:space="preserve"> emails.</w:t>
+      </w:r>
+    </w:p>
+    <w:p>
+      <w:pPr>
+        <w:numPr>
+          <w:ilvl w:val="0"/>
+          <w:numId w:val="4"/>
+        </w:numPr>
+      </w:pPr>
+      <w:r>
+        <w:t>Original Dataset:</w:t>
+      </w:r>
+    </w:p>
+    <w:p>
+      <w:pPr>
+        <w:numPr>
+          <w:ilvl w:val="1"/>
+          <w:numId w:val="4"/>
+        </w:numPr>
+      </w:pPr>
+      <w:r>
+        <w:t>Not Spam: Email1, Email2, ..., Email8</w:t>
+      </w:r>
+    </w:p>
+    <w:p>
+      <w:pPr>
+        <w:numPr>
+          <w:ilvl w:val="1"/>
+          <w:numId w:val="4"/>
+        </w:numPr>
+      </w:pPr>
+      <w:r>
+        <w:t xml:space="preserve">Spam: </w:t>
+      </w:r>
+      <w:proofErr w:type="spellStart"/>
+      <w:r>
+        <w:t>EmailA</w:t>
+      </w:r>
+      <w:proofErr w:type="spellEnd"/>
+      <w:r>
+        <w:t xml:space="preserve">, </w:t>
+      </w:r>
+      <w:proofErr w:type="spellStart"/>
+      <w:r>
+        <w:t>EmailB</w:t>
+      </w:r>
+      <w:proofErr w:type="spellEnd"/>
+    </w:p>
+    <w:p>
+      <w:pPr>
+        <w:numPr>
+          <w:ilvl w:val="0"/>
+          <w:numId w:val="4"/>
+        </w:numPr>
+      </w:pPr>
+      <w:proofErr w:type="spellStart"/>
+      <w:r>
+        <w:rPr>
+          <w:b/>
+          <w:bCs/>
+        </w:rPr>
+        <w:t>Upsample</w:t>
+      </w:r>
+      <w:proofErr w:type="spellEnd"/>
+      <w:r>
+        <w:rPr>
+          <w:b/>
+          <w:bCs/>
+        </w:rPr>
+        <w:t xml:space="preserve"> Spam</w:t>
+      </w:r>
+      <w:r>
+        <w:t xml:space="preserve"> by randomly duplicating samples:</w:t>
+      </w:r>
+    </w:p>
+    <w:p>
+      <w:pPr>
+        <w:numPr>
+          <w:ilvl w:val="1"/>
+          <w:numId w:val="4"/>
+        </w:numPr>
+      </w:pPr>
+      <w:r>
+        <w:lastRenderedPageBreak/>
+        <w:t xml:space="preserve">Spam after </w:t>
+      </w:r>
+      <w:proofErr w:type="spellStart"/>
+      <w:r>
+        <w:t>upsampling</w:t>
+      </w:r>
+      <w:proofErr w:type="spellEnd"/>
+      <w:r>
+        <w:t xml:space="preserve">: </w:t>
+      </w:r>
+      <w:proofErr w:type="spellStart"/>
+      <w:r>
+        <w:t>EmailA</w:t>
+      </w:r>
+      <w:proofErr w:type="spellEnd"/>
+      <w:r>
+        <w:t xml:space="preserve">, </w:t>
+      </w:r>
+      <w:proofErr w:type="spellStart"/>
+      <w:r>
+        <w:t>EmailB</w:t>
+      </w:r>
+      <w:proofErr w:type="spellEnd"/>
+      <w:r>
+        <w:t xml:space="preserve">, </w:t>
+      </w:r>
+      <w:proofErr w:type="spellStart"/>
+      <w:r>
+        <w:t>EmailA</w:t>
+      </w:r>
+      <w:proofErr w:type="spellEnd"/>
+      <w:r>
+        <w:t xml:space="preserve">, </w:t>
+      </w:r>
+      <w:proofErr w:type="spellStart"/>
+      <w:r>
+        <w:t>EmailB</w:t>
+      </w:r>
+      <w:proofErr w:type="spellEnd"/>
+      <w:r>
+        <w:t xml:space="preserve">, </w:t>
+      </w:r>
+      <w:proofErr w:type="spellStart"/>
+      <w:r>
+        <w:t>EmailA</w:t>
+      </w:r>
+      <w:proofErr w:type="spellEnd"/>
+      <w:r>
+        <w:t xml:space="preserve">, </w:t>
+      </w:r>
+      <w:proofErr w:type="spellStart"/>
+      <w:r>
+        <w:t>EmailB</w:t>
+      </w:r>
+      <w:proofErr w:type="spellEnd"/>
+      <w:r>
+        <w:t xml:space="preserve">, </w:t>
+      </w:r>
+      <w:proofErr w:type="spellStart"/>
+      <w:r>
+        <w:t>EmailA</w:t>
+      </w:r>
+      <w:proofErr w:type="spellEnd"/>
+      <w:r>
+        <w:t xml:space="preserve">, </w:t>
+      </w:r>
+      <w:proofErr w:type="spellStart"/>
+      <w:r>
+        <w:t>EmailB</w:t>
+      </w:r>
+      <w:proofErr w:type="spellEnd"/>
+    </w:p>
+    <w:p>
+      <w:pPr>
+        <w:numPr>
+          <w:ilvl w:val="0"/>
+          <w:numId w:val="4"/>
+        </w:numPr>
+      </w:pPr>
+      <w:r>
+        <w:t>Final Balanced Dataset (8 of each):</w:t>
+      </w:r>
+    </w:p>
+    <w:p>
+      <w:pPr>
+        <w:numPr>
+          <w:ilvl w:val="1"/>
+          <w:numId w:val="4"/>
+        </w:numPr>
+      </w:pPr>
+      <w:r>
+        <w:t>Not Spam: 8 emails</w:t>
+      </w:r>
+    </w:p>
+    <w:p>
+      <w:pPr>
+        <w:numPr>
+          <w:ilvl w:val="1"/>
+          <w:numId w:val="4"/>
+        </w:numPr>
+      </w:pPr>
+      <w:r>
+        <w:t>Spam: 8 emails (duplicated)</w:t>
+      </w:r>
+    </w:p>
+    <w:p>
+      <w:r>
+        <w:rPr>
+          <w:rFonts w:ascii="Segoe UI Emoji" w:hAnsi="Segoe UI Emoji" w:cs="Segoe UI Emoji"/>
+        </w:rPr>
+        <w:t>✅</w:t>
+      </w:r>
+      <w:r>
+        <w:t xml:space="preserve"> Balanced, but since we're repeating data, the model might memorize (overfit) it.</w:t>
+      </w:r>
+    </w:p>
+    <w:p>
+      <w:r>
+        <w:pict w14:anchorId="6A696A38">
+          <v:rect id="_x0000_i1038" style="width:0;height:1.5pt" o:hralign="center" o:hrstd="t" o:hr="t" fillcolor="#a0a0a0" stroked="f"/>
+        </w:pict>
+      </w:r>
+    </w:p>
+    <w:p>
+      <w:pPr>
+        <w:rPr>
+          <w:b/>
+          <w:bCs/>
+        </w:rPr>
+      </w:pPr>
+      <w:r>
+        <w:rPr>
+          <w:rFonts w:ascii="Segoe UI Emoji" w:hAnsi="Segoe UI Emoji" w:cs="Segoe UI Emoji"/>
+          <w:b/>
+          <w:bCs/>
+        </w:rPr>
+        <w:t>🔽</w:t>
+      </w:r>
+      <w:r>
+        <w:rPr>
+          <w:b/>
+          <w:bCs/>
+        </w:rPr>
         <w:t xml:space="preserve"> </w:t>
       </w:r>
-      <w:r>
-        <w:t xml:space="preserve">TP </w:t>
-      </w:r>
-      <w:r>
-        <w:t xml:space="preserve">/ </w:t>
-      </w:r>
-      <w:r>
-        <w:t xml:space="preserve">TP +FP </w:t>
-      </w:r>
-    </w:p>
-    <w:p>
-      <w:r>
-        <w:t xml:space="preserve">In recall, we calculate the </w:t>
-      </w:r>
-      <w:r>
-        <w:rPr>
-          <w:b/>
-          <w:bCs/>
-        </w:rPr>
-        <w:t>ratio of true positives (TP) and the total number of examples</w:t>
-      </w:r>
-      <w:r>
-        <w:rPr>
-          <w:b/>
-          <w:bCs/>
-        </w:rPr>
-        <w:t xml:space="preserve"> (TP+FN)</w:t>
-      </w:r>
-      <w:r>
-        <w:t xml:space="preserve"> that actually fall in the positive class. Recall measures how many of the actual positive examples are correctly identified by the model. It is a measure of the model’s </w:t>
-      </w:r>
-      <w:r>
-        <w:rPr>
-          <w:b/>
-          <w:bCs/>
-        </w:rPr>
-        <w:t>ability to avoid false negatives and identify all positive examples correctly</w:t>
-      </w:r>
-      <w:r>
-        <w:t xml:space="preserve">. </w:t>
-      </w:r>
-    </w:p>
-    <w:p>
-      <w:r>
-        <w:t>Recall =</w:t>
-      </w:r>
-      <w:r>
-        <w:t xml:space="preserve">TP/ </w:t>
-      </w:r>
-      <w:r>
-        <w:t>TP +F</w:t>
-      </w:r>
-      <w:r>
-        <w:t>N</w:t>
-      </w:r>
-    </w:p>
-    <w:p>
-      <w:r>
-        <w:rPr>
-          <w:b/>
-          <w:bCs/>
-        </w:rPr>
-        <w:t>7</w:t>
-      </w:r>
-      <w:r>
-        <w:rPr>
-          <w:b/>
-          <w:bCs/>
-        </w:rPr>
-        <w:t xml:space="preserve">. What is the difference between </w:t>
-      </w:r>
       <w:proofErr w:type="spellStart"/>
       <w:r>
         <w:rPr>
           <w:b/>
           <w:bCs/>
         </w:rPr>
-        <w:t>upsampling</w:t>
+        <w:t>Downsampling</w:t>
       </w:r>
       <w:proofErr w:type="spellEnd"/>
       <w:r>
@@ -668,157 +1197,171 @@
           <w:b/>
           <w:bCs/>
         </w:rPr>
-        <w:t xml:space="preserve"> and </w:t>
+        <w:t xml:space="preserve"> Example:</w:t>
+      </w:r>
+    </w:p>
+    <w:p>
+      <w:r>
+        <w:t xml:space="preserve">We balance the dataset by </w:t>
+      </w:r>
+      <w:r>
+        <w:rPr>
+          <w:b/>
+          <w:bCs/>
+        </w:rPr>
+        <w:t>reducing</w:t>
+      </w:r>
+      <w:r>
+        <w:t xml:space="preserve"> the number of </w:t>
+      </w:r>
+      <w:r>
+        <w:rPr>
+          <w:b/>
+          <w:bCs/>
+        </w:rPr>
+        <w:t>Not Spam</w:t>
+      </w:r>
+      <w:r>
+        <w:t xml:space="preserve"> emails.</w:t>
+      </w:r>
+    </w:p>
+    <w:p>
+      <w:pPr>
+        <w:numPr>
+          <w:ilvl w:val="0"/>
+          <w:numId w:val="5"/>
+        </w:numPr>
+      </w:pPr>
+      <w:r>
+        <w:t>Original Dataset:</w:t>
+      </w:r>
+    </w:p>
+    <w:p>
+      <w:pPr>
+        <w:numPr>
+          <w:ilvl w:val="1"/>
+          <w:numId w:val="5"/>
+        </w:numPr>
+      </w:pPr>
+      <w:r>
+        <w:t>Not Spam: Email1, Email2, ..., Email8</w:t>
+      </w:r>
+    </w:p>
+    <w:p>
+      <w:pPr>
+        <w:numPr>
+          <w:ilvl w:val="1"/>
+          <w:numId w:val="5"/>
+        </w:numPr>
+      </w:pPr>
+      <w:r>
+        <w:t xml:space="preserve">Spam: </w:t>
       </w:r>
       <w:proofErr w:type="spellStart"/>
       <w:r>
-        <w:rPr>
-          <w:b/>
-          <w:bCs/>
-        </w:rPr>
+        <w:t>EmailA</w:t>
+      </w:r>
+      <w:proofErr w:type="spellEnd"/>
+      <w:r>
+        <w:t xml:space="preserve">, </w:t>
+      </w:r>
+      <w:proofErr w:type="spellStart"/>
+      <w:r>
+        <w:t>EmailB</w:t>
+      </w:r>
+      <w:proofErr w:type="spellEnd"/>
+    </w:p>
+    <w:p>
+      <w:pPr>
+        <w:numPr>
+          <w:ilvl w:val="0"/>
+          <w:numId w:val="5"/>
+        </w:numPr>
+      </w:pPr>
+      <w:proofErr w:type="spellStart"/>
+      <w:r>
+        <w:rPr>
+          <w:b/>
+          <w:bCs/>
+        </w:rPr>
+        <w:t>Downsample</w:t>
+      </w:r>
+      <w:proofErr w:type="spellEnd"/>
+      <w:r>
+        <w:rPr>
+          <w:b/>
+          <w:bCs/>
+        </w:rPr>
+        <w:t xml:space="preserve"> Not Spam</w:t>
+      </w:r>
+      <w:r>
+        <w:t xml:space="preserve"> by randomly selecting 2 emails:</w:t>
+      </w:r>
+    </w:p>
+    <w:p>
+      <w:pPr>
+        <w:numPr>
+          <w:ilvl w:val="1"/>
+          <w:numId w:val="5"/>
+        </w:numPr>
+      </w:pPr>
+      <w:r>
+        <w:t xml:space="preserve">Not Spam after </w:t>
+      </w:r>
+      <w:proofErr w:type="spellStart"/>
+      <w:r>
         <w:t>downsampling</w:t>
       </w:r>
       <w:proofErr w:type="spellEnd"/>
       <w:r>
-        <w:rPr>
-          <w:b/>
-          <w:bCs/>
-        </w:rPr>
-        <w:t>?</w:t>
-      </w:r>
-    </w:p>
-    <w:p>
-      <w:r>
-        <w:t xml:space="preserve"> In </w:t>
-      </w:r>
-      <w:proofErr w:type="spellStart"/>
-      <w:r>
-        <w:rPr>
-          <w:b/>
-          <w:bCs/>
-        </w:rPr>
-        <w:t>upsampling</w:t>
-      </w:r>
-      <w:proofErr w:type="spellEnd"/>
-      <w:r>
-        <w:t xml:space="preserve"> method, we </w:t>
-      </w:r>
-      <w:r>
-        <w:rPr>
-          <w:b/>
-          <w:bCs/>
-        </w:rPr>
-        <w:t>increase</w:t>
-      </w:r>
-      <w:r>
-        <w:t xml:space="preserve"> the number of samples in the </w:t>
-      </w:r>
-      <w:r>
-        <w:rPr>
-          <w:b/>
-          <w:bCs/>
-        </w:rPr>
-        <w:t>minority class</w:t>
-      </w:r>
-      <w:r>
-        <w:t xml:space="preserve"> by randomly selecting some points from the minority class and adding them to the dataset repeat this process till the </w:t>
-      </w:r>
-      <w:r>
-        <w:rPr>
-          <w:b/>
-          <w:bCs/>
-        </w:rPr>
-        <w:t>dataset gets balanced for each class</w:t>
-      </w:r>
-      <w:r>
-        <w:t xml:space="preserve">. </w:t>
-      </w:r>
-      <w:proofErr w:type="gramStart"/>
-      <w:r>
-        <w:t>But,</w:t>
-      </w:r>
-      <w:proofErr w:type="gramEnd"/>
-      <w:r>
-        <w:t xml:space="preserve"> here is a </w:t>
-      </w:r>
-      <w:r>
-        <w:rPr>
-          <w:b/>
-          <w:bCs/>
-        </w:rPr>
-        <w:t>disadvantage</w:t>
-      </w:r>
-      <w:r>
-        <w:t xml:space="preserve"> the training accuracy becomes high as in each epoch model trained more than once in each epoch but the </w:t>
-      </w:r>
-      <w:r>
-        <w:rPr>
-          <w:b/>
-          <w:bCs/>
-        </w:rPr>
-        <w:t>same high accuracy is not observed in the validation accuracy.</w:t>
-      </w:r>
-      <w:r>
-        <w:t xml:space="preserve">  </w:t>
-      </w:r>
-    </w:p>
-    <w:p>
-      <w:r>
-        <w:t xml:space="preserve">In </w:t>
-      </w:r>
-      <w:proofErr w:type="spellStart"/>
-      <w:r>
-        <w:rPr>
-          <w:b/>
-          <w:bCs/>
-        </w:rPr>
-        <w:t>downsampling</w:t>
-      </w:r>
-      <w:proofErr w:type="spellEnd"/>
-      <w:r>
-        <w:t xml:space="preserve">, we </w:t>
-      </w:r>
-      <w:r>
-        <w:rPr>
-          <w:b/>
-          <w:bCs/>
-        </w:rPr>
-        <w:t>decrease</w:t>
-      </w:r>
-      <w:r>
-        <w:t xml:space="preserve"> the number of samples in the </w:t>
-      </w:r>
-      <w:r>
-        <w:rPr>
-          <w:b/>
-          <w:bCs/>
-        </w:rPr>
-        <w:t>majority class</w:t>
-      </w:r>
-      <w:r>
-        <w:t xml:space="preserve"> by selecting some random number of points that are equal to the number of data points in the minority class so that the </w:t>
-      </w:r>
-      <w:r>
-        <w:rPr>
-          <w:b/>
-          <w:bCs/>
-        </w:rPr>
-        <w:t>distribution becomes balanced.</w:t>
-      </w:r>
-      <w:r>
-        <w:t xml:space="preserve"> In this case, we have to suffer from </w:t>
-      </w:r>
-      <w:r>
-        <w:rPr>
-          <w:b/>
-          <w:bCs/>
-        </w:rPr>
-        <w:t>data loss</w:t>
-      </w:r>
-      <w:r>
-        <w:t xml:space="preserve"> which may lead to the loss of some critical information as well.</w:t>
-      </w:r>
-    </w:p>
+        <w:t>: Email3, Email7</w:t>
+      </w:r>
+    </w:p>
+    <w:p>
+      <w:pPr>
+        <w:numPr>
+          <w:ilvl w:val="0"/>
+          <w:numId w:val="5"/>
+        </w:numPr>
+      </w:pPr>
+      <w:r>
+        <w:t>Final Balanced Dataset:</w:t>
+      </w:r>
+    </w:p>
+    <w:p>
+      <w:pPr>
+        <w:numPr>
+          <w:ilvl w:val="1"/>
+          <w:numId w:val="5"/>
+        </w:numPr>
+      </w:pPr>
+      <w:r>
+        <w:t>Not Spam: 2 emails</w:t>
+      </w:r>
+    </w:p>
+    <w:p>
+      <w:pPr>
+        <w:numPr>
+          <w:ilvl w:val="1"/>
+          <w:numId w:val="5"/>
+        </w:numPr>
+      </w:pPr>
+      <w:r>
+        <w:t>Spam: 2 emails</w:t>
+      </w:r>
+    </w:p>
+    <w:p>
+      <w:r>
+        <w:rPr>
+          <w:rFonts w:ascii="Segoe UI Emoji" w:hAnsi="Segoe UI Emoji" w:cs="Segoe UI Emoji"/>
+        </w:rPr>
+        <w:t>✅</w:t>
+      </w:r>
+      <w:r>
+        <w:t xml:space="preserve"> Balanced, but we lost 6 Not Spam emails, which might contain useful info.</w:t>
+      </w:r>
+    </w:p>
+    <w:p/>
     <w:p/>
     <w:p/>
     <w:p>
@@ -1078,11 +1621,403 @@
       </w:pPr>
     </w:lvl>
   </w:abstractNum>
+  <w:abstractNum w:abstractNumId="2" w15:restartNumberingAfterBreak="0">
+    <w:nsid w:val="63015D29"/>
+    <w:multiLevelType w:val="multilevel"/>
+    <w:tmpl w:val="908CB6B6"/>
+    <w:lvl w:ilvl="0">
+      <w:start w:val="1"/>
+      <w:numFmt w:val="decimal"/>
+      <w:lvlText w:val="%1."/>
+      <w:lvlJc w:val="left"/>
+      <w:pPr>
+        <w:tabs>
+          <w:tab w:val="num" w:pos="720"/>
+        </w:tabs>
+        <w:ind w:left="720" w:hanging="360"/>
+      </w:pPr>
+    </w:lvl>
+    <w:lvl w:ilvl="1">
+      <w:start w:val="1"/>
+      <w:numFmt w:val="bullet"/>
+      <w:lvlText w:val="o"/>
+      <w:lvlJc w:val="left"/>
+      <w:pPr>
+        <w:tabs>
+          <w:tab w:val="num" w:pos="1440"/>
+        </w:tabs>
+        <w:ind w:left="1440" w:hanging="360"/>
+      </w:pPr>
+      <w:rPr>
+        <w:rFonts w:ascii="Courier New" w:hAnsi="Courier New" w:hint="default"/>
+        <w:sz w:val="20"/>
+      </w:rPr>
+    </w:lvl>
+    <w:lvl w:ilvl="2" w:tentative="1">
+      <w:start w:val="1"/>
+      <w:numFmt w:val="decimal"/>
+      <w:lvlText w:val="%3."/>
+      <w:lvlJc w:val="left"/>
+      <w:pPr>
+        <w:tabs>
+          <w:tab w:val="num" w:pos="2160"/>
+        </w:tabs>
+        <w:ind w:left="2160" w:hanging="360"/>
+      </w:pPr>
+    </w:lvl>
+    <w:lvl w:ilvl="3" w:tentative="1">
+      <w:start w:val="1"/>
+      <w:numFmt w:val="decimal"/>
+      <w:lvlText w:val="%4."/>
+      <w:lvlJc w:val="left"/>
+      <w:pPr>
+        <w:tabs>
+          <w:tab w:val="num" w:pos="2880"/>
+        </w:tabs>
+        <w:ind w:left="2880" w:hanging="360"/>
+      </w:pPr>
+    </w:lvl>
+    <w:lvl w:ilvl="4" w:tentative="1">
+      <w:start w:val="1"/>
+      <w:numFmt w:val="decimal"/>
+      <w:lvlText w:val="%5."/>
+      <w:lvlJc w:val="left"/>
+      <w:pPr>
+        <w:tabs>
+          <w:tab w:val="num" w:pos="3600"/>
+        </w:tabs>
+        <w:ind w:left="3600" w:hanging="360"/>
+      </w:pPr>
+    </w:lvl>
+    <w:lvl w:ilvl="5" w:tentative="1">
+      <w:start w:val="1"/>
+      <w:numFmt w:val="decimal"/>
+      <w:lvlText w:val="%6."/>
+      <w:lvlJc w:val="left"/>
+      <w:pPr>
+        <w:tabs>
+          <w:tab w:val="num" w:pos="4320"/>
+        </w:tabs>
+        <w:ind w:left="4320" w:hanging="360"/>
+      </w:pPr>
+    </w:lvl>
+    <w:lvl w:ilvl="6" w:tentative="1">
+      <w:start w:val="1"/>
+      <w:numFmt w:val="decimal"/>
+      <w:lvlText w:val="%7."/>
+      <w:lvlJc w:val="left"/>
+      <w:pPr>
+        <w:tabs>
+          <w:tab w:val="num" w:pos="5040"/>
+        </w:tabs>
+        <w:ind w:left="5040" w:hanging="360"/>
+      </w:pPr>
+    </w:lvl>
+    <w:lvl w:ilvl="7" w:tentative="1">
+      <w:start w:val="1"/>
+      <w:numFmt w:val="decimal"/>
+      <w:lvlText w:val="%8."/>
+      <w:lvlJc w:val="left"/>
+      <w:pPr>
+        <w:tabs>
+          <w:tab w:val="num" w:pos="5760"/>
+        </w:tabs>
+        <w:ind w:left="5760" w:hanging="360"/>
+      </w:pPr>
+    </w:lvl>
+    <w:lvl w:ilvl="8" w:tentative="1">
+      <w:start w:val="1"/>
+      <w:numFmt w:val="decimal"/>
+      <w:lvlText w:val="%9."/>
+      <w:lvlJc w:val="left"/>
+      <w:pPr>
+        <w:tabs>
+          <w:tab w:val="num" w:pos="6480"/>
+        </w:tabs>
+        <w:ind w:left="6480" w:hanging="360"/>
+      </w:pPr>
+    </w:lvl>
+  </w:abstractNum>
+  <w:abstractNum w:abstractNumId="3" w15:restartNumberingAfterBreak="0">
+    <w:nsid w:val="6B530D3C"/>
+    <w:multiLevelType w:val="multilevel"/>
+    <w:tmpl w:val="E8047F22"/>
+    <w:lvl w:ilvl="0">
+      <w:start w:val="1"/>
+      <w:numFmt w:val="bullet"/>
+      <w:lvlText w:val=""/>
+      <w:lvlJc w:val="left"/>
+      <w:pPr>
+        <w:tabs>
+          <w:tab w:val="num" w:pos="720"/>
+        </w:tabs>
+        <w:ind w:left="720" w:hanging="360"/>
+      </w:pPr>
+      <w:rPr>
+        <w:rFonts w:ascii="Symbol" w:hAnsi="Symbol" w:hint="default"/>
+        <w:sz w:val="20"/>
+      </w:rPr>
+    </w:lvl>
+    <w:lvl w:ilvl="1" w:tentative="1">
+      <w:start w:val="1"/>
+      <w:numFmt w:val="bullet"/>
+      <w:lvlText w:val="o"/>
+      <w:lvlJc w:val="left"/>
+      <w:pPr>
+        <w:tabs>
+          <w:tab w:val="num" w:pos="1440"/>
+        </w:tabs>
+        <w:ind w:left="1440" w:hanging="360"/>
+      </w:pPr>
+      <w:rPr>
+        <w:rFonts w:ascii="Courier New" w:hAnsi="Courier New" w:hint="default"/>
+        <w:sz w:val="20"/>
+      </w:rPr>
+    </w:lvl>
+    <w:lvl w:ilvl="2" w:tentative="1">
+      <w:start w:val="1"/>
+      <w:numFmt w:val="bullet"/>
+      <w:lvlText w:val=""/>
+      <w:lvlJc w:val="left"/>
+      <w:pPr>
+        <w:tabs>
+          <w:tab w:val="num" w:pos="2160"/>
+        </w:tabs>
+        <w:ind w:left="2160" w:hanging="360"/>
+      </w:pPr>
+      <w:rPr>
+        <w:rFonts w:ascii="Wingdings" w:hAnsi="Wingdings" w:hint="default"/>
+        <w:sz w:val="20"/>
+      </w:rPr>
+    </w:lvl>
+    <w:lvl w:ilvl="3" w:tentative="1">
+      <w:start w:val="1"/>
+      <w:numFmt w:val="bullet"/>
+      <w:lvlText w:val=""/>
+      <w:lvlJc w:val="left"/>
+      <w:pPr>
+        <w:tabs>
+          <w:tab w:val="num" w:pos="2880"/>
+        </w:tabs>
+        <w:ind w:left="2880" w:hanging="360"/>
+      </w:pPr>
+      <w:rPr>
+        <w:rFonts w:ascii="Wingdings" w:hAnsi="Wingdings" w:hint="default"/>
+        <w:sz w:val="20"/>
+      </w:rPr>
+    </w:lvl>
+    <w:lvl w:ilvl="4" w:tentative="1">
+      <w:start w:val="1"/>
+      <w:numFmt w:val="bullet"/>
+      <w:lvlText w:val=""/>
+      <w:lvlJc w:val="left"/>
+      <w:pPr>
+        <w:tabs>
+          <w:tab w:val="num" w:pos="3600"/>
+        </w:tabs>
+        <w:ind w:left="3600" w:hanging="360"/>
+      </w:pPr>
+      <w:rPr>
+        <w:rFonts w:ascii="Wingdings" w:hAnsi="Wingdings" w:hint="default"/>
+        <w:sz w:val="20"/>
+      </w:rPr>
+    </w:lvl>
+    <w:lvl w:ilvl="5" w:tentative="1">
+      <w:start w:val="1"/>
+      <w:numFmt w:val="bullet"/>
+      <w:lvlText w:val=""/>
+      <w:lvlJc w:val="left"/>
+      <w:pPr>
+        <w:tabs>
+          <w:tab w:val="num" w:pos="4320"/>
+        </w:tabs>
+        <w:ind w:left="4320" w:hanging="360"/>
+      </w:pPr>
+      <w:rPr>
+        <w:rFonts w:ascii="Wingdings" w:hAnsi="Wingdings" w:hint="default"/>
+        <w:sz w:val="20"/>
+      </w:rPr>
+    </w:lvl>
+    <w:lvl w:ilvl="6" w:tentative="1">
+      <w:start w:val="1"/>
+      <w:numFmt w:val="bullet"/>
+      <w:lvlText w:val=""/>
+      <w:lvlJc w:val="left"/>
+      <w:pPr>
+        <w:tabs>
+          <w:tab w:val="num" w:pos="5040"/>
+        </w:tabs>
+        <w:ind w:left="5040" w:hanging="360"/>
+      </w:pPr>
+      <w:rPr>
+        <w:rFonts w:ascii="Wingdings" w:hAnsi="Wingdings" w:hint="default"/>
+        <w:sz w:val="20"/>
+      </w:rPr>
+    </w:lvl>
+    <w:lvl w:ilvl="7" w:tentative="1">
+      <w:start w:val="1"/>
+      <w:numFmt w:val="bullet"/>
+      <w:lvlText w:val=""/>
+      <w:lvlJc w:val="left"/>
+      <w:pPr>
+        <w:tabs>
+          <w:tab w:val="num" w:pos="5760"/>
+        </w:tabs>
+        <w:ind w:left="5760" w:hanging="360"/>
+      </w:pPr>
+      <w:rPr>
+        <w:rFonts w:ascii="Wingdings" w:hAnsi="Wingdings" w:hint="default"/>
+        <w:sz w:val="20"/>
+      </w:rPr>
+    </w:lvl>
+    <w:lvl w:ilvl="8" w:tentative="1">
+      <w:start w:val="1"/>
+      <w:numFmt w:val="bullet"/>
+      <w:lvlText w:val=""/>
+      <w:lvlJc w:val="left"/>
+      <w:pPr>
+        <w:tabs>
+          <w:tab w:val="num" w:pos="6480"/>
+        </w:tabs>
+        <w:ind w:left="6480" w:hanging="360"/>
+      </w:pPr>
+      <w:rPr>
+        <w:rFonts w:ascii="Wingdings" w:hAnsi="Wingdings" w:hint="default"/>
+        <w:sz w:val="20"/>
+      </w:rPr>
+    </w:lvl>
+  </w:abstractNum>
+  <w:abstractNum w:abstractNumId="4" w15:restartNumberingAfterBreak="0">
+    <w:nsid w:val="6C16636F"/>
+    <w:multiLevelType w:val="multilevel"/>
+    <w:tmpl w:val="B818FEC8"/>
+    <w:lvl w:ilvl="0">
+      <w:start w:val="1"/>
+      <w:numFmt w:val="decimal"/>
+      <w:lvlText w:val="%1."/>
+      <w:lvlJc w:val="left"/>
+      <w:pPr>
+        <w:tabs>
+          <w:tab w:val="num" w:pos="720"/>
+        </w:tabs>
+        <w:ind w:left="720" w:hanging="360"/>
+      </w:pPr>
+    </w:lvl>
+    <w:lvl w:ilvl="1">
+      <w:start w:val="1"/>
+      <w:numFmt w:val="bullet"/>
+      <w:lvlText w:val="o"/>
+      <w:lvlJc w:val="left"/>
+      <w:pPr>
+        <w:tabs>
+          <w:tab w:val="num" w:pos="1440"/>
+        </w:tabs>
+        <w:ind w:left="1440" w:hanging="360"/>
+      </w:pPr>
+      <w:rPr>
+        <w:rFonts w:ascii="Courier New" w:hAnsi="Courier New" w:hint="default"/>
+        <w:sz w:val="20"/>
+      </w:rPr>
+    </w:lvl>
+    <w:lvl w:ilvl="2" w:tentative="1">
+      <w:start w:val="1"/>
+      <w:numFmt w:val="decimal"/>
+      <w:lvlText w:val="%3."/>
+      <w:lvlJc w:val="left"/>
+      <w:pPr>
+        <w:tabs>
+          <w:tab w:val="num" w:pos="2160"/>
+        </w:tabs>
+        <w:ind w:left="2160" w:hanging="360"/>
+      </w:pPr>
+    </w:lvl>
+    <w:lvl w:ilvl="3" w:tentative="1">
+      <w:start w:val="1"/>
+      <w:numFmt w:val="decimal"/>
+      <w:lvlText w:val="%4."/>
+      <w:lvlJc w:val="left"/>
+      <w:pPr>
+        <w:tabs>
+          <w:tab w:val="num" w:pos="2880"/>
+        </w:tabs>
+        <w:ind w:left="2880" w:hanging="360"/>
+      </w:pPr>
+    </w:lvl>
+    <w:lvl w:ilvl="4" w:tentative="1">
+      <w:start w:val="1"/>
+      <w:numFmt w:val="decimal"/>
+      <w:lvlText w:val="%5."/>
+      <w:lvlJc w:val="left"/>
+      <w:pPr>
+        <w:tabs>
+          <w:tab w:val="num" w:pos="3600"/>
+        </w:tabs>
+        <w:ind w:left="3600" w:hanging="360"/>
+      </w:pPr>
+    </w:lvl>
+    <w:lvl w:ilvl="5" w:tentative="1">
+      <w:start w:val="1"/>
+      <w:numFmt w:val="decimal"/>
+      <w:lvlText w:val="%6."/>
+      <w:lvlJc w:val="left"/>
+      <w:pPr>
+        <w:tabs>
+          <w:tab w:val="num" w:pos="4320"/>
+        </w:tabs>
+        <w:ind w:left="4320" w:hanging="360"/>
+      </w:pPr>
+    </w:lvl>
+    <w:lvl w:ilvl="6" w:tentative="1">
+      <w:start w:val="1"/>
+      <w:numFmt w:val="decimal"/>
+      <w:lvlText w:val="%7."/>
+      <w:lvlJc w:val="left"/>
+      <w:pPr>
+        <w:tabs>
+          <w:tab w:val="num" w:pos="5040"/>
+        </w:tabs>
+        <w:ind w:left="5040" w:hanging="360"/>
+      </w:pPr>
+    </w:lvl>
+    <w:lvl w:ilvl="7" w:tentative="1">
+      <w:start w:val="1"/>
+      <w:numFmt w:val="decimal"/>
+      <w:lvlText w:val="%8."/>
+      <w:lvlJc w:val="left"/>
+      <w:pPr>
+        <w:tabs>
+          <w:tab w:val="num" w:pos="5760"/>
+        </w:tabs>
+        <w:ind w:left="5760" w:hanging="360"/>
+      </w:pPr>
+    </w:lvl>
+    <w:lvl w:ilvl="8" w:tentative="1">
+      <w:start w:val="1"/>
+      <w:numFmt w:val="decimal"/>
+      <w:lvlText w:val="%9."/>
+      <w:lvlJc w:val="left"/>
+      <w:pPr>
+        <w:tabs>
+          <w:tab w:val="num" w:pos="6480"/>
+        </w:tabs>
+        <w:ind w:left="6480" w:hanging="360"/>
+      </w:pPr>
+    </w:lvl>
+  </w:abstractNum>
   <w:num w:numId="1" w16cid:durableId="464086617">
     <w:abstractNumId w:val="1"/>
   </w:num>
   <w:num w:numId="2" w16cid:durableId="1538541439">
     <w:abstractNumId w:val="0"/>
+  </w:num>
+  <w:num w:numId="3" w16cid:durableId="1565481785">
+    <w:abstractNumId w:val="3"/>
+  </w:num>
+  <w:num w:numId="4" w16cid:durableId="1980719279">
+    <w:abstractNumId w:val="2"/>
+  </w:num>
+  <w:num w:numId="5" w16cid:durableId="71199282">
+    <w:abstractNumId w:val="4"/>
   </w:num>
 </w:numbering>
 </file>

</xml_diff>

<commit_message>
code for classification prediction
</commit_message>
<xml_diff>
--- a/ML_Interview_questions.docx
+++ b/ML_Interview_questions.docx
@@ -364,15 +364,7 @@
         <w:t>Example</w:t>
       </w:r>
       <w:r>
-        <w:t>: If a model learns weights [2, -3, 0.5], L1 would penalize |2| + |-3| + |0.5| = 5.5, while L2 would penalize 2² + (-</w:t>
-      </w:r>
-      <w:proofErr w:type="gramStart"/>
-      <w:r>
-        <w:t>3)²</w:t>
-      </w:r>
-      <w:proofErr w:type="gramEnd"/>
-      <w:r>
-        <w:t xml:space="preserve"> + 0.5² = 13.25.</w:t>
+        <w:t>: If a model learns weights [2, -3, 0.5], L1 would penalize |2| + |-3| + |0.5| = 5.5, while L2 would penalize 2² + (-3)² + 0.5² = 13.25.</w:t>
       </w:r>
     </w:p>
     <w:p/>
@@ -470,6 +462,192 @@
       </w:r>
     </w:p>
     <w:p>
+      <w:r>
+        <w:t xml:space="preserve">A </w:t>
+      </w:r>
+      <w:r>
+        <w:rPr>
+          <w:b/>
+          <w:bCs/>
+        </w:rPr>
+        <w:t>local minima</w:t>
+      </w:r>
+      <w:r>
+        <w:t xml:space="preserve"> is a point where a function’s value is lower than nearby points, while a </w:t>
+      </w:r>
+      <w:r>
+        <w:rPr>
+          <w:b/>
+          <w:bCs/>
+        </w:rPr>
+        <w:t>global minima</w:t>
+      </w:r>
+      <w:r>
+        <w:t xml:space="preserve"> is the absolute lowest point across the entire function.</w:t>
+      </w:r>
+    </w:p>
+    <w:p>
+      <w:r>
+        <w:lastRenderedPageBreak/>
+        <w:t>We can’t fit a linear line to classification data.</w:t>
+      </w:r>
+    </w:p>
+    <w:p>
+      <w:r>
+        <w:drawing>
+          <wp:inline distT="0" distB="0" distL="0" distR="0" wp14:anchorId="7B25C478" wp14:editId="72EF236E">
+            <wp:extent cx="1920406" cy="1493649"/>
+            <wp:effectExtent l="0" t="0" r="3810" b="0"/>
+            <wp:docPr id="1165972440" name="Picture 1"/>
+            <wp:cNvGraphicFramePr>
+              <a:graphicFrameLocks xmlns:a="http://schemas.openxmlformats.org/drawingml/2006/main" noChangeAspect="1"/>
+            </wp:cNvGraphicFramePr>
+            <a:graphic xmlns:a="http://schemas.openxmlformats.org/drawingml/2006/main">
+              <a:graphicData uri="http://schemas.openxmlformats.org/drawingml/2006/picture">
+                <pic:pic xmlns:pic="http://schemas.openxmlformats.org/drawingml/2006/picture">
+                  <pic:nvPicPr>
+                    <pic:cNvPr id="1165972440" name=""/>
+                    <pic:cNvPicPr/>
+                  </pic:nvPicPr>
+                  <pic:blipFill>
+                    <a:blip r:embed="rId10"/>
+                    <a:stretch>
+                      <a:fillRect/>
+                    </a:stretch>
+                  </pic:blipFill>
+                  <pic:spPr>
+                    <a:xfrm>
+                      <a:off x="0" y="0"/>
+                      <a:ext cx="1920406" cy="1493649"/>
+                    </a:xfrm>
+                    <a:prstGeom prst="rect">
+                      <a:avLst/>
+                    </a:prstGeom>
+                  </pic:spPr>
+                </pic:pic>
+              </a:graphicData>
+            </a:graphic>
+          </wp:inline>
+        </w:drawing>
+      </w:r>
+    </w:p>
+    <w:p>
+      <w:r>
+        <w:t>To fit the classification like data we can use curve like line in sigmoid</w:t>
+      </w:r>
+    </w:p>
+    <w:p>
+      <w:r>
+        <w:drawing>
+          <wp:inline distT="0" distB="0" distL="0" distR="0" wp14:anchorId="5234B6AB" wp14:editId="373B713D">
+            <wp:extent cx="5731510" cy="2237740"/>
+            <wp:effectExtent l="0" t="0" r="2540" b="0"/>
+            <wp:docPr id="1488694981" name="Picture 1"/>
+            <wp:cNvGraphicFramePr>
+              <a:graphicFrameLocks xmlns:a="http://schemas.openxmlformats.org/drawingml/2006/main" noChangeAspect="1"/>
+            </wp:cNvGraphicFramePr>
+            <a:graphic xmlns:a="http://schemas.openxmlformats.org/drawingml/2006/main">
+              <a:graphicData uri="http://schemas.openxmlformats.org/drawingml/2006/picture">
+                <pic:pic xmlns:pic="http://schemas.openxmlformats.org/drawingml/2006/picture">
+                  <pic:nvPicPr>
+                    <pic:cNvPr id="1488694981" name=""/>
+                    <pic:cNvPicPr/>
+                  </pic:nvPicPr>
+                  <pic:blipFill>
+                    <a:blip r:embed="rId11"/>
+                    <a:stretch>
+                      <a:fillRect/>
+                    </a:stretch>
+                  </pic:blipFill>
+                  <pic:spPr>
+                    <a:xfrm>
+                      <a:off x="0" y="0"/>
+                      <a:ext cx="5731510" cy="2237740"/>
+                    </a:xfrm>
+                    <a:prstGeom prst="rect">
+                      <a:avLst/>
+                    </a:prstGeom>
+                  </pic:spPr>
+                </pic:pic>
+              </a:graphicData>
+            </a:graphic>
+          </wp:inline>
+        </w:drawing>
+      </w:r>
+    </w:p>
+    <w:p>
+      <w:r>
+        <w:t xml:space="preserve">And also we can’t use linear regression loss function on classification, </w:t>
+      </w:r>
+      <w:r>
+        <w:t>because means square error only finds the distance between predicted data points and correct data points in continuous value manner(</w:t>
+      </w:r>
+      <w:r>
+        <w:t>2.5, 3.7, etc.)</w:t>
+      </w:r>
+      <w:r>
+        <w:t xml:space="preserve"> not always 0 and 1</w:t>
+      </w:r>
+      <w:r>
+        <w:t>.</w:t>
+      </w:r>
+    </w:p>
+    <w:p>
+      <w:r>
+        <w:t>Linear regression loss can't force outputs to be 0 or 1 or handle classification confidence properly — that's why it fails for classification.</w:t>
+      </w:r>
+    </w:p>
+    <w:p>
+      <w:r>
+        <w:t>For classification loss function we will use cross entropy</w:t>
+      </w:r>
+      <w:r>
+        <w:t>, following is the formula for cross entropy which will gives values from 0 or 1</w:t>
+      </w:r>
+      <w:r>
+        <w:t xml:space="preserve"> when we put 0 or 1 values to yi.</w:t>
+      </w:r>
+    </w:p>
+    <w:p>
+      <w:r>
+        <w:drawing>
+          <wp:inline distT="0" distB="0" distL="0" distR="0" wp14:anchorId="69F04257" wp14:editId="412DE670">
+            <wp:extent cx="3779848" cy="624894"/>
+            <wp:effectExtent l="0" t="0" r="0" b="3810"/>
+            <wp:docPr id="1947882814" name="Picture 1"/>
+            <wp:cNvGraphicFramePr>
+              <a:graphicFrameLocks xmlns:a="http://schemas.openxmlformats.org/drawingml/2006/main" noChangeAspect="1"/>
+            </wp:cNvGraphicFramePr>
+            <a:graphic xmlns:a="http://schemas.openxmlformats.org/drawingml/2006/main">
+              <a:graphicData uri="http://schemas.openxmlformats.org/drawingml/2006/picture">
+                <pic:pic xmlns:pic="http://schemas.openxmlformats.org/drawingml/2006/picture">
+                  <pic:nvPicPr>
+                    <pic:cNvPr id="1947882814" name=""/>
+                    <pic:cNvPicPr/>
+                  </pic:nvPicPr>
+                  <pic:blipFill>
+                    <a:blip r:embed="rId12"/>
+                    <a:stretch>
+                      <a:fillRect/>
+                    </a:stretch>
+                  </pic:blipFill>
+                  <pic:spPr>
+                    <a:xfrm>
+                      <a:off x="0" y="0"/>
+                      <a:ext cx="3779848" cy="624894"/>
+                    </a:xfrm>
+                    <a:prstGeom prst="rect">
+                      <a:avLst/>
+                    </a:prstGeom>
+                  </pic:spPr>
+                </pic:pic>
+              </a:graphicData>
+            </a:graphic>
+          </wp:inline>
+        </w:drawing>
+      </w:r>
+    </w:p>
+    <w:p>
       <w:pPr>
         <w:rPr>
           <w:sz w:val="28"/>
@@ -501,7 +679,6 @@
         </w:rPr>
       </w:pPr>
       <w:r>
-        <w:lastRenderedPageBreak/>
         <w:t>To achieve stable and fast training of the model we use normalization techniques to bring all the features to a certain scale or range of values.</w:t>
       </w:r>
     </w:p>
@@ -545,26 +722,14 @@
           <w:b/>
           <w:bCs/>
         </w:rPr>
-        <w:t xml:space="preserve">ratio between the true </w:t>
-      </w:r>
-      <w:proofErr w:type="gramStart"/>
-      <w:r>
-        <w:rPr>
-          <w:b/>
-          <w:bCs/>
-        </w:rPr>
-        <w:t>positives(</w:t>
-      </w:r>
-      <w:proofErr w:type="gramEnd"/>
-      <w:r>
-        <w:rPr>
-          <w:b/>
-          <w:bCs/>
-        </w:rPr>
-        <w:t xml:space="preserve">TP) and all the positive examples (TP+FP) </w:t>
-      </w:r>
-      <w:r>
-        <w:t xml:space="preserve">predicted by the model. In other words, precision measures how many of the predicted positive examples are actually true positives. It is a measure of the model’s ability </w:t>
+        <w:t xml:space="preserve">ratio between the true positives(TP) and all the positive examples (TP+FP) </w:t>
+      </w:r>
+      <w:r>
+        <w:t xml:space="preserve">predicted by the model. In other words, precision measures how many of the predicted positive examples are </w:t>
+      </w:r>
+      <w:r>
+        <w:lastRenderedPageBreak/>
+        <w:t xml:space="preserve">actually true positives. It is a measure of the model’s ability </w:t>
       </w:r>
       <w:r>
         <w:rPr>
@@ -661,137 +826,85 @@
           <w:sz w:val="28"/>
           <w:szCs w:val="28"/>
         </w:rPr>
-        <w:t xml:space="preserve">7. What is the difference between </w:t>
-      </w:r>
-      <w:proofErr w:type="spellStart"/>
-      <w:r>
-        <w:rPr>
-          <w:b/>
-          <w:bCs/>
-          <w:sz w:val="28"/>
-          <w:szCs w:val="28"/>
+        <w:t>7. What is the difference between upsampling and downsampling?</w:t>
+      </w:r>
+    </w:p>
+    <w:p>
+      <w:r>
+        <w:t xml:space="preserve"> In </w:t>
+      </w:r>
+      <w:r>
+        <w:rPr>
+          <w:b/>
+          <w:bCs/>
         </w:rPr>
         <w:t>upsampling</w:t>
       </w:r>
-      <w:proofErr w:type="spellEnd"/>
-      <w:r>
-        <w:rPr>
-          <w:b/>
-          <w:bCs/>
-          <w:sz w:val="28"/>
-          <w:szCs w:val="28"/>
-        </w:rPr>
-        <w:t xml:space="preserve"> and </w:t>
-      </w:r>
-      <w:proofErr w:type="spellStart"/>
-      <w:r>
-        <w:rPr>
-          <w:b/>
-          <w:bCs/>
-          <w:sz w:val="28"/>
-          <w:szCs w:val="28"/>
+      <w:r>
+        <w:t xml:space="preserve"> method, we </w:t>
+      </w:r>
+      <w:r>
+        <w:rPr>
+          <w:b/>
+          <w:bCs/>
+        </w:rPr>
+        <w:t>increase</w:t>
+      </w:r>
+      <w:r>
+        <w:t xml:space="preserve"> the number of samples in the </w:t>
+      </w:r>
+      <w:r>
+        <w:rPr>
+          <w:b/>
+          <w:bCs/>
+        </w:rPr>
+        <w:t>minority class</w:t>
+      </w:r>
+      <w:r>
+        <w:t xml:space="preserve"> by randomly selecting some points from the minority class and adding them to the dataset repeat this process till the </w:t>
+      </w:r>
+      <w:r>
+        <w:rPr>
+          <w:b/>
+          <w:bCs/>
+        </w:rPr>
+        <w:t>dataset gets balanced for each class</w:t>
+      </w:r>
+      <w:r>
+        <w:t xml:space="preserve">. But, here is a </w:t>
+      </w:r>
+      <w:r>
+        <w:rPr>
+          <w:b/>
+          <w:bCs/>
+        </w:rPr>
+        <w:t>disadvantage</w:t>
+      </w:r>
+      <w:r>
+        <w:t xml:space="preserve"> the training accuracy becomes high as in each epoch model trained more than once in each epoch but the </w:t>
+      </w:r>
+      <w:r>
+        <w:rPr>
+          <w:b/>
+          <w:bCs/>
+        </w:rPr>
+        <w:t>same high accuracy is not observed in the validation accuracy.</w:t>
+      </w:r>
+      <w:r>
+        <w:t xml:space="preserve">  </w:t>
+      </w:r>
+    </w:p>
+    <w:p>
+      <w:r>
+        <w:t xml:space="preserve">In </w:t>
+      </w:r>
+      <w:r>
+        <w:rPr>
+          <w:b/>
+          <w:bCs/>
         </w:rPr>
         <w:t>downsampling</w:t>
       </w:r>
-      <w:proofErr w:type="spellEnd"/>
-      <w:r>
-        <w:rPr>
-          <w:b/>
-          <w:bCs/>
-          <w:sz w:val="28"/>
-          <w:szCs w:val="28"/>
-        </w:rPr>
-        <w:t>?</w:t>
-      </w:r>
-    </w:p>
-    <w:p>
-      <w:r>
-        <w:t xml:space="preserve"> In </w:t>
-      </w:r>
-      <w:proofErr w:type="spellStart"/>
-      <w:r>
-        <w:rPr>
-          <w:b/>
-          <w:bCs/>
-        </w:rPr>
-        <w:t>upsampling</w:t>
-      </w:r>
-      <w:proofErr w:type="spellEnd"/>
-      <w:r>
-        <w:t xml:space="preserve"> method, we </w:t>
-      </w:r>
-      <w:r>
-        <w:rPr>
-          <w:b/>
-          <w:bCs/>
-        </w:rPr>
-        <w:t>increase</w:t>
-      </w:r>
-      <w:r>
-        <w:t xml:space="preserve"> the number of samples in the </w:t>
-      </w:r>
-      <w:r>
-        <w:rPr>
-          <w:b/>
-          <w:bCs/>
-        </w:rPr>
-        <w:t>minority class</w:t>
-      </w:r>
-      <w:r>
-        <w:t xml:space="preserve"> by randomly selecting some points from the minority class and adding them to the dataset repeat this process till the </w:t>
-      </w:r>
-      <w:r>
-        <w:rPr>
-          <w:b/>
-          <w:bCs/>
-        </w:rPr>
-        <w:t>dataset gets balanced for each class</w:t>
-      </w:r>
-      <w:r>
-        <w:t xml:space="preserve">. </w:t>
-      </w:r>
-      <w:proofErr w:type="gramStart"/>
-      <w:r>
-        <w:t>But,</w:t>
-      </w:r>
-      <w:proofErr w:type="gramEnd"/>
-      <w:r>
-        <w:t xml:space="preserve"> here is a </w:t>
-      </w:r>
-      <w:r>
-        <w:rPr>
-          <w:b/>
-          <w:bCs/>
-        </w:rPr>
-        <w:t>disadvantage</w:t>
-      </w:r>
-      <w:r>
-        <w:t xml:space="preserve"> the training accuracy becomes high as in each epoch model trained more than once in each epoch but the </w:t>
-      </w:r>
-      <w:r>
-        <w:rPr>
-          <w:b/>
-          <w:bCs/>
-        </w:rPr>
-        <w:t>same high accuracy is not observed in the validation accuracy.</w:t>
-      </w:r>
-      <w:r>
-        <w:t xml:space="preserve">  </w:t>
-      </w:r>
-    </w:p>
-    <w:p>
-      <w:r>
-        <w:t xml:space="preserve">In </w:t>
-      </w:r>
-      <w:proofErr w:type="spellStart"/>
-      <w:r>
-        <w:rPr>
-          <w:b/>
-          <w:bCs/>
-        </w:rPr>
-        <w:t>downsampling</w:t>
-      </w:r>
-      <w:proofErr w:type="spellEnd"/>
       <w:r>
         <w:t xml:space="preserve">, we </w:t>
       </w:r>
@@ -898,7 +1011,7 @@
     <w:p>
       <w:r>
         <w:pict w14:anchorId="21C3AA4F">
-          <v:rect id="_x0000_i1037" style="width:0;height:1.5pt" o:hralign="center" o:hrstd="t" o:hr="t" fillcolor="#a0a0a0" stroked="f"/>
+          <v:rect id="_x0000_i1025" style="width:0;height:1.5pt" o:hralign="center" o:hrstd="t" o:hr="t" fillcolor="#a0a0a0" stroked="f"/>
         </w:pict>
       </w:r>
     </w:p>
@@ -922,23 +1035,7 @@
           <w:b/>
           <w:bCs/>
         </w:rPr>
-        <w:t xml:space="preserve"> </w:t>
-      </w:r>
-      <w:proofErr w:type="spellStart"/>
-      <w:r>
-        <w:rPr>
-          <w:b/>
-          <w:bCs/>
-        </w:rPr>
-        <w:t>Upsampling</w:t>
-      </w:r>
-      <w:proofErr w:type="spellEnd"/>
-      <w:r>
-        <w:rPr>
-          <w:b/>
-          <w:bCs/>
-        </w:rPr>
-        <w:t xml:space="preserve"> Example:</w:t>
+        <w:t xml:space="preserve"> Upsampling Example:</w:t>
       </w:r>
     </w:p>
     <w:p>
@@ -986,21 +1083,8 @@
         </w:numPr>
       </w:pPr>
       <w:r>
-        <w:t xml:space="preserve">Spam: </w:t>
-      </w:r>
-      <w:proofErr w:type="spellStart"/>
-      <w:r>
-        <w:t>EmailA</w:t>
-      </w:r>
-      <w:proofErr w:type="spellEnd"/>
-      <w:r>
-        <w:t xml:space="preserve">, </w:t>
-      </w:r>
-      <w:proofErr w:type="spellStart"/>
-      <w:r>
-        <w:t>EmailB</w:t>
-      </w:r>
-      <w:proofErr w:type="spellEnd"/>
+        <w:t>Spam: EmailA, EmailB</w:t>
+      </w:r>
     </w:p>
     <w:p>
       <w:pPr>
@@ -1009,21 +1093,12 @@
           <w:numId w:val="4"/>
         </w:numPr>
       </w:pPr>
-      <w:proofErr w:type="spellStart"/>
-      <w:r>
-        <w:rPr>
-          <w:b/>
-          <w:bCs/>
-        </w:rPr>
-        <w:t>Upsample</w:t>
-      </w:r>
-      <w:proofErr w:type="spellEnd"/>
-      <w:r>
-        <w:rPr>
-          <w:b/>
-          <w:bCs/>
-        </w:rPr>
-        <w:t xml:space="preserve"> Spam</w:t>
+      <w:r>
+        <w:rPr>
+          <w:b/>
+          <w:bCs/>
+        </w:rPr>
+        <w:t>Upsample Spam</w:t>
       </w:r>
       <w:r>
         <w:t xml:space="preserve"> by randomly duplicating samples:</w:t>
@@ -1037,78 +1112,8 @@
         </w:numPr>
       </w:pPr>
       <w:r>
-        <w:lastRenderedPageBreak/>
-        <w:t xml:space="preserve">Spam after </w:t>
-      </w:r>
-      <w:proofErr w:type="spellStart"/>
-      <w:r>
-        <w:t>upsampling</w:t>
-      </w:r>
-      <w:proofErr w:type="spellEnd"/>
-      <w:r>
-        <w:t xml:space="preserve">: </w:t>
-      </w:r>
-      <w:proofErr w:type="spellStart"/>
-      <w:r>
-        <w:t>EmailA</w:t>
-      </w:r>
-      <w:proofErr w:type="spellEnd"/>
-      <w:r>
-        <w:t xml:space="preserve">, </w:t>
-      </w:r>
-      <w:proofErr w:type="spellStart"/>
-      <w:r>
-        <w:t>EmailB</w:t>
-      </w:r>
-      <w:proofErr w:type="spellEnd"/>
-      <w:r>
-        <w:t xml:space="preserve">, </w:t>
-      </w:r>
-      <w:proofErr w:type="spellStart"/>
-      <w:r>
-        <w:t>EmailA</w:t>
-      </w:r>
-      <w:proofErr w:type="spellEnd"/>
-      <w:r>
-        <w:t xml:space="preserve">, </w:t>
-      </w:r>
-      <w:proofErr w:type="spellStart"/>
-      <w:r>
-        <w:t>EmailB</w:t>
-      </w:r>
-      <w:proofErr w:type="spellEnd"/>
-      <w:r>
-        <w:t xml:space="preserve">, </w:t>
-      </w:r>
-      <w:proofErr w:type="spellStart"/>
-      <w:r>
-        <w:t>EmailA</w:t>
-      </w:r>
-      <w:proofErr w:type="spellEnd"/>
-      <w:r>
-        <w:t xml:space="preserve">, </w:t>
-      </w:r>
-      <w:proofErr w:type="spellStart"/>
-      <w:r>
-        <w:t>EmailB</w:t>
-      </w:r>
-      <w:proofErr w:type="spellEnd"/>
-      <w:r>
-        <w:t xml:space="preserve">, </w:t>
-      </w:r>
-      <w:proofErr w:type="spellStart"/>
-      <w:r>
-        <w:t>EmailA</w:t>
-      </w:r>
-      <w:proofErr w:type="spellEnd"/>
-      <w:r>
-        <w:t xml:space="preserve">, </w:t>
-      </w:r>
-      <w:proofErr w:type="spellStart"/>
-      <w:r>
-        <w:t>EmailB</w:t>
-      </w:r>
-      <w:proofErr w:type="spellEnd"/>
+        <w:t>Spam after upsampling: EmailA, EmailB, EmailA, EmailB, EmailA, EmailB, EmailA, EmailB</w:t>
+      </w:r>
     </w:p>
     <w:p>
       <w:pPr>
@@ -1157,7 +1162,7 @@
     <w:p>
       <w:r>
         <w:pict w14:anchorId="6A696A38">
-          <v:rect id="_x0000_i1038" style="width:0;height:1.5pt" o:hralign="center" o:hrstd="t" o:hr="t" fillcolor="#a0a0a0" stroked="f"/>
+          <v:rect id="_x0000_i1026" style="width:0;height:1.5pt" o:hralign="center" o:hrstd="t" o:hr="t" fillcolor="#a0a0a0" stroked="f"/>
         </w:pict>
       </w:r>
     </w:p>
@@ -1174,6 +1179,7 @@
           <w:b/>
           <w:bCs/>
         </w:rPr>
+        <w:lastRenderedPageBreak/>
         <w:t>🔽</w:t>
       </w:r>
       <w:r>
@@ -1181,23 +1187,7 @@
           <w:b/>
           <w:bCs/>
         </w:rPr>
-        <w:t xml:space="preserve"> </w:t>
-      </w:r>
-      <w:proofErr w:type="spellStart"/>
-      <w:r>
-        <w:rPr>
-          <w:b/>
-          <w:bCs/>
-        </w:rPr>
-        <w:t>Downsampling</w:t>
-      </w:r>
-      <w:proofErr w:type="spellEnd"/>
-      <w:r>
-        <w:rPr>
-          <w:b/>
-          <w:bCs/>
-        </w:rPr>
-        <w:t xml:space="preserve"> Example:</w:t>
+        <w:t xml:space="preserve"> Downsampling Example:</w:t>
       </w:r>
     </w:p>
     <w:p>
@@ -1255,21 +1245,8 @@
         </w:numPr>
       </w:pPr>
       <w:r>
-        <w:t xml:space="preserve">Spam: </w:t>
-      </w:r>
-      <w:proofErr w:type="spellStart"/>
-      <w:r>
-        <w:t>EmailA</w:t>
-      </w:r>
-      <w:proofErr w:type="spellEnd"/>
-      <w:r>
-        <w:t xml:space="preserve">, </w:t>
-      </w:r>
-      <w:proofErr w:type="spellStart"/>
-      <w:r>
-        <w:t>EmailB</w:t>
-      </w:r>
-      <w:proofErr w:type="spellEnd"/>
+        <w:t>Spam: EmailA, EmailB</w:t>
+      </w:r>
     </w:p>
     <w:p>
       <w:pPr>
@@ -1278,21 +1255,12 @@
           <w:numId w:val="5"/>
         </w:numPr>
       </w:pPr>
-      <w:proofErr w:type="spellStart"/>
-      <w:r>
-        <w:rPr>
-          <w:b/>
-          <w:bCs/>
-        </w:rPr>
-        <w:t>Downsample</w:t>
-      </w:r>
-      <w:proofErr w:type="spellEnd"/>
-      <w:r>
-        <w:rPr>
-          <w:b/>
-          <w:bCs/>
-        </w:rPr>
-        <w:t xml:space="preserve"> Not Spam</w:t>
+      <w:r>
+        <w:rPr>
+          <w:b/>
+          <w:bCs/>
+        </w:rPr>
+        <w:t>Downsample Not Spam</w:t>
       </w:r>
       <w:r>
         <w:t xml:space="preserve"> by randomly selecting 2 emails:</w:t>
@@ -1306,15 +1274,7 @@
         </w:numPr>
       </w:pPr>
       <w:r>
-        <w:t xml:space="preserve">Not Spam after </w:t>
-      </w:r>
-      <w:proofErr w:type="spellStart"/>
-      <w:r>
-        <w:t>downsampling</w:t>
-      </w:r>
-      <w:proofErr w:type="spellEnd"/>
-      <w:r>
-        <w:t>: Email3, Email7</w:t>
+        <w:t>Not Spam after downsampling: Email3, Email7</w:t>
       </w:r>
     </w:p>
     <w:p>

</xml_diff>

<commit_message>
What is data leakage and how we can find it
</commit_message>
<xml_diff>
--- a/ML_Interview_questions.docx
+++ b/ML_Interview_questions.docx
@@ -364,7 +364,15 @@
         <w:t>Example</w:t>
       </w:r>
       <w:r>
-        <w:t>: If a model learns weights [2, -3, 0.5], L1 would penalize |2| + |-3| + |0.5| = 5.5, while L2 would penalize 2² + (-3)² + 0.5² = 13.25.</w:t>
+        <w:t>: If a model learns weights [2, -3, 0.5], L1 would penalize |2| + |-3| + |0.5| = 5.5, while L2 would penalize 2² + (-</w:t>
+      </w:r>
+      <w:proofErr w:type="gramStart"/>
+      <w:r>
+        <w:t>3)²</w:t>
+      </w:r>
+      <w:proofErr w:type="gramEnd"/>
+      <w:r>
+        <w:t xml:space="preserve"> + 0.5² = 13.25.</w:t>
       </w:r>
     </w:p>
     <w:p/>
@@ -465,6 +473,7 @@
       <w:r>
         <w:t xml:space="preserve">A </w:t>
       </w:r>
+      <w:proofErr w:type="gramStart"/>
       <w:r>
         <w:rPr>
           <w:b/>
@@ -472,9 +481,11 @@
         </w:rPr>
         <w:t>local minima</w:t>
       </w:r>
+      <w:proofErr w:type="gramEnd"/>
       <w:r>
         <w:t xml:space="preserve"> is a point where a function’s value is lower than nearby points, while a </w:t>
       </w:r>
+      <w:proofErr w:type="gramStart"/>
       <w:r>
         <w:rPr>
           <w:b/>
@@ -482,6 +493,7 @@
         </w:rPr>
         <w:t>global minima</w:t>
       </w:r>
+      <w:proofErr w:type="gramEnd"/>
       <w:r>
         <w:t xml:space="preserve"> is the absolute lowest point across the entire function.</w:t>
       </w:r>
@@ -494,6 +506,9 @@
     </w:p>
     <w:p>
       <w:r>
+        <w:rPr>
+          <w:noProof/>
+        </w:rPr>
         <w:drawing>
           <wp:inline distT="0" distB="0" distL="0" distR="0" wp14:anchorId="7B25C478" wp14:editId="72EF236E">
             <wp:extent cx="1920406" cy="1493649"/>
@@ -538,6 +553,9 @@
     </w:p>
     <w:p>
       <w:r>
+        <w:rPr>
+          <w:noProof/>
+        </w:rPr>
         <w:drawing>
           <wp:inline distT="0" distB="0" distL="0" distR="0" wp14:anchorId="5234B6AB" wp14:editId="373B713D">
             <wp:extent cx="5731510" cy="2237740"/>
@@ -577,11 +595,24 @@
     </w:p>
     <w:p>
       <w:r>
-        <w:t xml:space="preserve">And also we can’t use linear regression loss function on classification, </w:t>
-      </w:r>
-      <w:r>
-        <w:t>because means square error only finds the distance between predicted data points and correct data points in continuous value manner(</w:t>
-      </w:r>
+        <w:t xml:space="preserve">And </w:t>
+      </w:r>
+      <w:proofErr w:type="gramStart"/>
+      <w:r>
+        <w:t>also</w:t>
+      </w:r>
+      <w:proofErr w:type="gramEnd"/>
+      <w:r>
+        <w:t xml:space="preserve"> we can’t use linear regression loss function on classification, </w:t>
+      </w:r>
+      <w:r>
+        <w:t xml:space="preserve">because means square error only finds the distance between predicted data points and correct data points in continuous value </w:t>
+      </w:r>
+      <w:proofErr w:type="gramStart"/>
+      <w:r>
+        <w:t>manner(</w:t>
+      </w:r>
+      <w:proofErr w:type="gramEnd"/>
       <w:r>
         <w:t>2.5, 3.7, etc.)</w:t>
       </w:r>
@@ -605,11 +636,22 @@
         <w:t>, following is the formula for cross entropy which will gives values from 0 or 1</w:t>
       </w:r>
       <w:r>
-        <w:t xml:space="preserve"> when we put 0 or 1 values to yi.</w:t>
-      </w:r>
-    </w:p>
-    <w:p>
-      <w:r>
+        <w:t xml:space="preserve"> when we put 0 or 1 values to </w:t>
+      </w:r>
+      <w:proofErr w:type="spellStart"/>
+      <w:r>
+        <w:t>yi</w:t>
+      </w:r>
+      <w:proofErr w:type="spellEnd"/>
+      <w:r>
+        <w:t>.</w:t>
+      </w:r>
+    </w:p>
+    <w:p>
+      <w:r>
+        <w:rPr>
+          <w:noProof/>
+        </w:rPr>
         <w:drawing>
           <wp:inline distT="0" distB="0" distL="0" distR="0" wp14:anchorId="69F04257" wp14:editId="412DE670">
             <wp:extent cx="3779848" cy="624894"/>
@@ -722,7 +764,23 @@
           <w:b/>
           <w:bCs/>
         </w:rPr>
-        <w:t xml:space="preserve">ratio between the true positives(TP) and all the positive examples (TP+FP) </w:t>
+        <w:t xml:space="preserve">ratio between the true </w:t>
+      </w:r>
+      <w:proofErr w:type="gramStart"/>
+      <w:r>
+        <w:rPr>
+          <w:b/>
+          <w:bCs/>
+        </w:rPr>
+        <w:t>positives(</w:t>
+      </w:r>
+      <w:proofErr w:type="gramEnd"/>
+      <w:r>
+        <w:rPr>
+          <w:b/>
+          <w:bCs/>
+        </w:rPr>
+        <w:t xml:space="preserve">TP) and all the positive examples (TP+FP) </w:t>
       </w:r>
       <w:r>
         <w:t xml:space="preserve">predicted by the model. In other words, precision measures how many of the predicted positive examples are </w:t>
@@ -826,13 +884,54 @@
           <w:sz w:val="28"/>
           <w:szCs w:val="28"/>
         </w:rPr>
-        <w:t>7. What is the difference between upsampling and downsampling?</w:t>
+        <w:t xml:space="preserve">7. What is the difference between </w:t>
+      </w:r>
+      <w:proofErr w:type="spellStart"/>
+      <w:r>
+        <w:rPr>
+          <w:b/>
+          <w:bCs/>
+          <w:sz w:val="28"/>
+          <w:szCs w:val="28"/>
+        </w:rPr>
+        <w:t>upsampling</w:t>
+      </w:r>
+      <w:proofErr w:type="spellEnd"/>
+      <w:r>
+        <w:rPr>
+          <w:b/>
+          <w:bCs/>
+          <w:sz w:val="28"/>
+          <w:szCs w:val="28"/>
+        </w:rPr>
+        <w:t xml:space="preserve"> and </w:t>
+      </w:r>
+      <w:proofErr w:type="spellStart"/>
+      <w:r>
+        <w:rPr>
+          <w:b/>
+          <w:bCs/>
+          <w:sz w:val="28"/>
+          <w:szCs w:val="28"/>
+        </w:rPr>
+        <w:t>downsampling</w:t>
+      </w:r>
+      <w:proofErr w:type="spellEnd"/>
+      <w:r>
+        <w:rPr>
+          <w:b/>
+          <w:bCs/>
+          <w:sz w:val="28"/>
+          <w:szCs w:val="28"/>
+        </w:rPr>
+        <w:t>?</w:t>
       </w:r>
     </w:p>
     <w:p>
       <w:r>
         <w:t xml:space="preserve"> In </w:t>
       </w:r>
+      <w:proofErr w:type="spellStart"/>
       <w:r>
         <w:rPr>
           <w:b/>
@@ -840,6 +939,7 @@
         </w:rPr>
         <w:t>upsampling</w:t>
       </w:r>
+      <w:proofErr w:type="spellEnd"/>
       <w:r>
         <w:t xml:space="preserve"> method, we </w:t>
       </w:r>
@@ -871,7 +971,15 @@
         <w:t>dataset gets balanced for each class</w:t>
       </w:r>
       <w:r>
-        <w:t xml:space="preserve">. But, here is a </w:t>
+        <w:t xml:space="preserve">. </w:t>
+      </w:r>
+      <w:proofErr w:type="gramStart"/>
+      <w:r>
+        <w:t>But,</w:t>
+      </w:r>
+      <w:proofErr w:type="gramEnd"/>
+      <w:r>
+        <w:t xml:space="preserve"> here is a </w:t>
       </w:r>
       <w:r>
         <w:rPr>
@@ -898,6 +1006,7 @@
       <w:r>
         <w:t xml:space="preserve">In </w:t>
       </w:r>
+      <w:proofErr w:type="spellStart"/>
       <w:r>
         <w:rPr>
           <w:b/>
@@ -905,6 +1014,7 @@
         </w:rPr>
         <w:t>downsampling</w:t>
       </w:r>
+      <w:proofErr w:type="spellEnd"/>
       <w:r>
         <w:t xml:space="preserve">, we </w:t>
       </w:r>
@@ -1035,7 +1145,23 @@
           <w:b/>
           <w:bCs/>
         </w:rPr>
-        <w:t xml:space="preserve"> Upsampling Example:</w:t>
+        <w:t xml:space="preserve"> </w:t>
+      </w:r>
+      <w:proofErr w:type="spellStart"/>
+      <w:r>
+        <w:rPr>
+          <w:b/>
+          <w:bCs/>
+        </w:rPr>
+        <w:t>Upsampling</w:t>
+      </w:r>
+      <w:proofErr w:type="spellEnd"/>
+      <w:r>
+        <w:rPr>
+          <w:b/>
+          <w:bCs/>
+        </w:rPr>
+        <w:t xml:space="preserve"> Example:</w:t>
       </w:r>
     </w:p>
     <w:p>
@@ -1083,8 +1209,21 @@
         </w:numPr>
       </w:pPr>
       <w:r>
-        <w:t>Spam: EmailA, EmailB</w:t>
-      </w:r>
+        <w:t xml:space="preserve">Spam: </w:t>
+      </w:r>
+      <w:proofErr w:type="spellStart"/>
+      <w:r>
+        <w:t>EmailA</w:t>
+      </w:r>
+      <w:proofErr w:type="spellEnd"/>
+      <w:r>
+        <w:t xml:space="preserve">, </w:t>
+      </w:r>
+      <w:proofErr w:type="spellStart"/>
+      <w:r>
+        <w:t>EmailB</w:t>
+      </w:r>
+      <w:proofErr w:type="spellEnd"/>
     </w:p>
     <w:p>
       <w:pPr>
@@ -1093,12 +1232,21 @@
           <w:numId w:val="4"/>
         </w:numPr>
       </w:pPr>
-      <w:r>
-        <w:rPr>
-          <w:b/>
-          <w:bCs/>
-        </w:rPr>
-        <w:t>Upsample Spam</w:t>
+      <w:proofErr w:type="spellStart"/>
+      <w:r>
+        <w:rPr>
+          <w:b/>
+          <w:bCs/>
+        </w:rPr>
+        <w:t>Upsample</w:t>
+      </w:r>
+      <w:proofErr w:type="spellEnd"/>
+      <w:r>
+        <w:rPr>
+          <w:b/>
+          <w:bCs/>
+        </w:rPr>
+        <w:t xml:space="preserve"> Spam</w:t>
       </w:r>
       <w:r>
         <w:t xml:space="preserve"> by randomly duplicating samples:</w:t>
@@ -1112,8 +1260,77 @@
         </w:numPr>
       </w:pPr>
       <w:r>
-        <w:t>Spam after upsampling: EmailA, EmailB, EmailA, EmailB, EmailA, EmailB, EmailA, EmailB</w:t>
-      </w:r>
+        <w:t xml:space="preserve">Spam after </w:t>
+      </w:r>
+      <w:proofErr w:type="spellStart"/>
+      <w:r>
+        <w:t>upsampling</w:t>
+      </w:r>
+      <w:proofErr w:type="spellEnd"/>
+      <w:r>
+        <w:t xml:space="preserve">: </w:t>
+      </w:r>
+      <w:proofErr w:type="spellStart"/>
+      <w:r>
+        <w:t>EmailA</w:t>
+      </w:r>
+      <w:proofErr w:type="spellEnd"/>
+      <w:r>
+        <w:t xml:space="preserve">, </w:t>
+      </w:r>
+      <w:proofErr w:type="spellStart"/>
+      <w:r>
+        <w:t>EmailB</w:t>
+      </w:r>
+      <w:proofErr w:type="spellEnd"/>
+      <w:r>
+        <w:t xml:space="preserve">, </w:t>
+      </w:r>
+      <w:proofErr w:type="spellStart"/>
+      <w:r>
+        <w:t>EmailA</w:t>
+      </w:r>
+      <w:proofErr w:type="spellEnd"/>
+      <w:r>
+        <w:t xml:space="preserve">, </w:t>
+      </w:r>
+      <w:proofErr w:type="spellStart"/>
+      <w:r>
+        <w:t>EmailB</w:t>
+      </w:r>
+      <w:proofErr w:type="spellEnd"/>
+      <w:r>
+        <w:t xml:space="preserve">, </w:t>
+      </w:r>
+      <w:proofErr w:type="spellStart"/>
+      <w:r>
+        <w:t>EmailA</w:t>
+      </w:r>
+      <w:proofErr w:type="spellEnd"/>
+      <w:r>
+        <w:t xml:space="preserve">, </w:t>
+      </w:r>
+      <w:proofErr w:type="spellStart"/>
+      <w:r>
+        <w:t>EmailB</w:t>
+      </w:r>
+      <w:proofErr w:type="spellEnd"/>
+      <w:r>
+        <w:t xml:space="preserve">, </w:t>
+      </w:r>
+      <w:proofErr w:type="spellStart"/>
+      <w:r>
+        <w:t>EmailA</w:t>
+      </w:r>
+      <w:proofErr w:type="spellEnd"/>
+      <w:r>
+        <w:t xml:space="preserve">, </w:t>
+      </w:r>
+      <w:proofErr w:type="spellStart"/>
+      <w:r>
+        <w:t>EmailB</w:t>
+      </w:r>
+      <w:proofErr w:type="spellEnd"/>
     </w:p>
     <w:p>
       <w:pPr>
@@ -1187,7 +1404,23 @@
           <w:b/>
           <w:bCs/>
         </w:rPr>
-        <w:t xml:space="preserve"> Downsampling Example:</w:t>
+        <w:t xml:space="preserve"> </w:t>
+      </w:r>
+      <w:proofErr w:type="spellStart"/>
+      <w:r>
+        <w:rPr>
+          <w:b/>
+          <w:bCs/>
+        </w:rPr>
+        <w:t>Downsampling</w:t>
+      </w:r>
+      <w:proofErr w:type="spellEnd"/>
+      <w:r>
+        <w:rPr>
+          <w:b/>
+          <w:bCs/>
+        </w:rPr>
+        <w:t xml:space="preserve"> Example:</w:t>
       </w:r>
     </w:p>
     <w:p>
@@ -1245,8 +1478,21 @@
         </w:numPr>
       </w:pPr>
       <w:r>
-        <w:t>Spam: EmailA, EmailB</w:t>
-      </w:r>
+        <w:t xml:space="preserve">Spam: </w:t>
+      </w:r>
+      <w:proofErr w:type="spellStart"/>
+      <w:r>
+        <w:t>EmailA</w:t>
+      </w:r>
+      <w:proofErr w:type="spellEnd"/>
+      <w:r>
+        <w:t xml:space="preserve">, </w:t>
+      </w:r>
+      <w:proofErr w:type="spellStart"/>
+      <w:r>
+        <w:t>EmailB</w:t>
+      </w:r>
+      <w:proofErr w:type="spellEnd"/>
     </w:p>
     <w:p>
       <w:pPr>
@@ -1255,12 +1501,21 @@
           <w:numId w:val="5"/>
         </w:numPr>
       </w:pPr>
-      <w:r>
-        <w:rPr>
-          <w:b/>
-          <w:bCs/>
-        </w:rPr>
-        <w:t>Downsample Not Spam</w:t>
+      <w:proofErr w:type="spellStart"/>
+      <w:r>
+        <w:rPr>
+          <w:b/>
+          <w:bCs/>
+        </w:rPr>
+        <w:t>Downsample</w:t>
+      </w:r>
+      <w:proofErr w:type="spellEnd"/>
+      <w:r>
+        <w:rPr>
+          <w:b/>
+          <w:bCs/>
+        </w:rPr>
+        <w:t xml:space="preserve"> Not Spam</w:t>
       </w:r>
       <w:r>
         <w:t xml:space="preserve"> by randomly selecting 2 emails:</w:t>
@@ -1274,7 +1529,15 @@
         </w:numPr>
       </w:pPr>
       <w:r>
-        <w:t>Not Spam after downsampling: Email3, Email7</w:t>
+        <w:t xml:space="preserve">Not Spam after </w:t>
+      </w:r>
+      <w:proofErr w:type="spellStart"/>
+      <w:r>
+        <w:t>downsampling</w:t>
+      </w:r>
+      <w:proofErr w:type="spellEnd"/>
+      <w:r>
+        <w:t>: Email3, Email7</w:t>
       </w:r>
     </w:p>
     <w:p>
@@ -1319,6 +1582,107 @@
       </w:r>
       <w:r>
         <w:t xml:space="preserve"> Balanced, but we lost 6 Not Spam emails, which might contain useful info.</w:t>
+      </w:r>
+    </w:p>
+    <w:p/>
+    <w:p>
+      <w:pPr>
+        <w:rPr>
+          <w:b/>
+          <w:bCs/>
+          <w:sz w:val="28"/>
+          <w:szCs w:val="28"/>
+        </w:rPr>
+      </w:pPr>
+      <w:r>
+        <w:rPr>
+          <w:b/>
+          <w:bCs/>
+          <w:sz w:val="28"/>
+          <w:szCs w:val="28"/>
+        </w:rPr>
+        <w:t xml:space="preserve">8. What is data leakage and how we can </w:t>
+      </w:r>
+      <w:proofErr w:type="gramStart"/>
+      <w:r>
+        <w:rPr>
+          <w:b/>
+          <w:bCs/>
+          <w:sz w:val="28"/>
+          <w:szCs w:val="28"/>
+        </w:rPr>
+        <w:t>found</w:t>
+      </w:r>
+      <w:proofErr w:type="gramEnd"/>
+      <w:r>
+        <w:rPr>
+          <w:b/>
+          <w:bCs/>
+          <w:sz w:val="28"/>
+          <w:szCs w:val="28"/>
+        </w:rPr>
+        <w:t xml:space="preserve"> it?</w:t>
+      </w:r>
+    </w:p>
+    <w:p>
+      <w:r>
+        <w:rPr>
+          <w:b/>
+          <w:bCs/>
+        </w:rPr>
+        <w:t>1.</w:t>
+      </w:r>
+      <w:r>
+        <w:t xml:space="preserve"> Data leakage is when your model accidentally sees the answers (target data) during training.</w:t>
+      </w:r>
+      <w:r>
+        <w:br/>
+      </w:r>
+      <w:r>
+        <w:rPr>
+          <w:b/>
+          <w:bCs/>
+        </w:rPr>
+        <w:t>2.</w:t>
+      </w:r>
+      <w:r>
+        <w:t xml:space="preserve"> This makes the model look very accurate, but it won't work well on real data.</w:t>
+      </w:r>
+      <w:r>
+        <w:br/>
+      </w:r>
+      <w:r>
+        <w:rPr>
+          <w:b/>
+          <w:bCs/>
+        </w:rPr>
+        <w:t>3.</w:t>
+      </w:r>
+      <w:r>
+        <w:t xml:space="preserve"> It can happen if future information or labels are used in training features.</w:t>
+      </w:r>
+      <w:r>
+        <w:br/>
+      </w:r>
+      <w:r>
+        <w:rPr>
+          <w:b/>
+          <w:bCs/>
+        </w:rPr>
+        <w:t>4.</w:t>
+      </w:r>
+      <w:r>
+        <w:t xml:space="preserve"> To find it, carefully check that your model only uses data available </w:t>
+      </w:r>
+      <w:r>
+        <w:rPr>
+          <w:i/>
+          <w:iCs/>
+        </w:rPr>
+        <w:t>before</w:t>
+      </w:r>
+      <w:r>
+        <w:t xml:space="preserve"> prediction time.</w:t>
       </w:r>
     </w:p>
     <w:p/>

</xml_diff>

<commit_message>
Performance matrix for classification model
</commit_message>
<xml_diff>
--- a/ML_Interview_questions.docx
+++ b/ML_Interview_questions.docx
@@ -1683,6 +1683,245 @@
       </w:r>
       <w:r>
         <w:t xml:space="preserve"> prediction time.</w:t>
+      </w:r>
+    </w:p>
+    <w:p/>
+    <w:p>
+      <w:r>
+        <w:rPr>
+          <w:b/>
+          <w:bCs/>
+          <w:sz w:val="28"/>
+          <w:szCs w:val="28"/>
+        </w:rPr>
+        <w:t>9.</w:t>
+      </w:r>
+      <w:r>
+        <w:rPr>
+          <w:b/>
+          <w:bCs/>
+          <w:sz w:val="28"/>
+          <w:szCs w:val="28"/>
+        </w:rPr>
+        <w:t xml:space="preserve"> Explain the classification report and the metrics it includes.</w:t>
+      </w:r>
+      <w:r>
+        <w:t xml:space="preserve"> </w:t>
+      </w:r>
+    </w:p>
+    <w:p>
+      <w:r>
+        <w:t xml:space="preserve">The classification report provides key metrics to evaluate a model’s performance, including: Precision: The proportion of true positives to all predicted positives, measuring accuracy of positive predictions. </w:t>
+      </w:r>
+    </w:p>
+    <w:p>
+      <w:r>
+        <w:t xml:space="preserve">Recall: The proportion of true positives to all actual positives, indicating how well the model finds positive instances. </w:t>
+      </w:r>
+    </w:p>
+    <w:p>
+      <w:r>
+        <w:t xml:space="preserve">F1-Score: The harmonic </w:t>
+      </w:r>
+      <w:proofErr w:type="gramStart"/>
+      <w:r>
+        <w:t>mean</w:t>
+      </w:r>
+      <w:proofErr w:type="gramEnd"/>
+      <w:r>
+        <w:t xml:space="preserve"> of precision and recall, balancing the two metrics. </w:t>
+      </w:r>
+    </w:p>
+    <w:p>
+      <w:r>
+        <w:t xml:space="preserve">Support: The number of true instances for each class in the dataset. </w:t>
+      </w:r>
+    </w:p>
+    <w:p>
+      <w:r>
+        <w:t xml:space="preserve">Accuracy: The overall proportion of correct predictions. </w:t>
+      </w:r>
+    </w:p>
+    <w:p>
+      <w:r>
+        <w:t xml:space="preserve">Macro Average: The average of precision, recall, and F1-score across all classes, treating them equally. </w:t>
+      </w:r>
+    </w:p>
+    <w:p>
+      <w:r>
+        <w:t>Weighted Average: The average of metrics, weighted by class support, giving more importance to frequent classes.</w:t>
+      </w:r>
+    </w:p>
+    <w:p/>
+    <w:p>
+      <w:pPr>
+        <w:rPr>
+          <w:b/>
+          <w:bCs/>
+        </w:rPr>
+      </w:pPr>
+      <w:r>
+        <w:rPr>
+          <w:b/>
+          <w:bCs/>
+        </w:rPr>
+        <w:t>EXAMPLE FOR LAT FOUR</w:t>
+      </w:r>
+    </w:p>
+    <w:p>
+      <w:pPr>
+        <w:rPr>
+          <w:b/>
+          <w:bCs/>
+        </w:rPr>
+      </w:pPr>
+      <w:r>
+        <w:rPr>
+          <w:b/>
+          <w:bCs/>
+        </w:rPr>
+        <w:lastRenderedPageBreak/>
+        <w:drawing>
+          <wp:inline distT="0" distB="0" distL="0" distR="0" wp14:anchorId="788CF87A" wp14:editId="309CFBAA">
+            <wp:extent cx="3797020" cy="2278380"/>
+            <wp:effectExtent l="0" t="0" r="0" b="7620"/>
+            <wp:docPr id="1032658278" name="Picture 1"/>
+            <wp:cNvGraphicFramePr>
+              <a:graphicFrameLocks xmlns:a="http://schemas.openxmlformats.org/drawingml/2006/main" noChangeAspect="1"/>
+            </wp:cNvGraphicFramePr>
+            <a:graphic xmlns:a="http://schemas.openxmlformats.org/drawingml/2006/main">
+              <a:graphicData uri="http://schemas.openxmlformats.org/drawingml/2006/picture">
+                <pic:pic xmlns:pic="http://schemas.openxmlformats.org/drawingml/2006/picture">
+                  <pic:nvPicPr>
+                    <pic:cNvPr id="1032658278" name=""/>
+                    <pic:cNvPicPr/>
+                  </pic:nvPicPr>
+                  <pic:blipFill>
+                    <a:blip r:embed="rId13"/>
+                    <a:stretch>
+                      <a:fillRect/>
+                    </a:stretch>
+                  </pic:blipFill>
+                  <pic:spPr>
+                    <a:xfrm>
+                      <a:off x="0" y="0"/>
+                      <a:ext cx="3803116" cy="2282038"/>
+                    </a:xfrm>
+                    <a:prstGeom prst="rect">
+                      <a:avLst/>
+                    </a:prstGeom>
+                  </pic:spPr>
+                </pic:pic>
+              </a:graphicData>
+            </a:graphic>
+          </wp:inline>
+        </w:drawing>
+      </w:r>
+    </w:p>
+    <w:p>
+      <w:pPr>
+        <w:rPr>
+          <w:b/>
+          <w:bCs/>
+        </w:rPr>
+      </w:pPr>
+      <w:r>
+        <w:rPr>
+          <w:b/>
+          <w:bCs/>
+        </w:rPr>
+        <w:drawing>
+          <wp:inline distT="0" distB="0" distL="0" distR="0" wp14:anchorId="09C780C1" wp14:editId="4CB5D41D">
+            <wp:extent cx="3810000" cy="3126866"/>
+            <wp:effectExtent l="0" t="0" r="0" b="0"/>
+            <wp:docPr id="1781492241" name="Picture 1"/>
+            <wp:cNvGraphicFramePr>
+              <a:graphicFrameLocks xmlns:a="http://schemas.openxmlformats.org/drawingml/2006/main" noChangeAspect="1"/>
+            </wp:cNvGraphicFramePr>
+            <a:graphic xmlns:a="http://schemas.openxmlformats.org/drawingml/2006/main">
+              <a:graphicData uri="http://schemas.openxmlformats.org/drawingml/2006/picture">
+                <pic:pic xmlns:pic="http://schemas.openxmlformats.org/drawingml/2006/picture">
+                  <pic:nvPicPr>
+                    <pic:cNvPr id="1781492241" name=""/>
+                    <pic:cNvPicPr/>
+                  </pic:nvPicPr>
+                  <pic:blipFill>
+                    <a:blip r:embed="rId14"/>
+                    <a:stretch>
+                      <a:fillRect/>
+                    </a:stretch>
+                  </pic:blipFill>
+                  <pic:spPr>
+                    <a:xfrm>
+                      <a:off x="0" y="0"/>
+                      <a:ext cx="3815881" cy="3131692"/>
+                    </a:xfrm>
+                    <a:prstGeom prst="rect">
+                      <a:avLst/>
+                    </a:prstGeom>
+                  </pic:spPr>
+                </pic:pic>
+              </a:graphicData>
+            </a:graphic>
+          </wp:inline>
+        </w:drawing>
+      </w:r>
+    </w:p>
+    <w:p>
+      <w:pPr>
+        <w:rPr>
+          <w:b/>
+          <w:bCs/>
+        </w:rPr>
+      </w:pPr>
+    </w:p>
+    <w:p>
+      <w:pPr>
+        <w:rPr>
+          <w:b/>
+          <w:bCs/>
+        </w:rPr>
+      </w:pPr>
+      <w:r>
+        <w:rPr>
+          <w:b/>
+          <w:bCs/>
+        </w:rPr>
+        <w:drawing>
+          <wp:inline distT="0" distB="0" distL="0" distR="0" wp14:anchorId="030102FE" wp14:editId="1E8EB1FB">
+            <wp:extent cx="3672840" cy="2762096"/>
+            <wp:effectExtent l="0" t="0" r="3810" b="635"/>
+            <wp:docPr id="1411133831" name="Picture 1"/>
+            <wp:cNvGraphicFramePr>
+              <a:graphicFrameLocks xmlns:a="http://schemas.openxmlformats.org/drawingml/2006/main" noChangeAspect="1"/>
+            </wp:cNvGraphicFramePr>
+            <a:graphic xmlns:a="http://schemas.openxmlformats.org/drawingml/2006/main">
+              <a:graphicData uri="http://schemas.openxmlformats.org/drawingml/2006/picture">
+                <pic:pic xmlns:pic="http://schemas.openxmlformats.org/drawingml/2006/picture">
+                  <pic:nvPicPr>
+                    <pic:cNvPr id="1411133831" name=""/>
+                    <pic:cNvPicPr/>
+                  </pic:nvPicPr>
+                  <pic:blipFill>
+                    <a:blip r:embed="rId15"/>
+                    <a:stretch>
+                      <a:fillRect/>
+                    </a:stretch>
+                  </pic:blipFill>
+                  <pic:spPr>
+                    <a:xfrm>
+                      <a:off x="0" y="0"/>
+                      <a:ext cx="3675630" cy="2764194"/>
+                    </a:xfrm>
+                    <a:prstGeom prst="rect">
+                      <a:avLst/>
+                    </a:prstGeom>
+                  </pic:spPr>
+                </pic:pic>
+              </a:graphicData>
+            </a:graphic>
+          </wp:inline>
+        </w:drawing>
       </w:r>
     </w:p>
     <w:p/>

</xml_diff>

<commit_message>
support, micro average, weighted sum for classification performacance metrix
</commit_message>
<xml_diff>
--- a/ML_Interview_questions.docx
+++ b/ML_Interview_questions.docx
@@ -364,15 +364,7 @@
         <w:t>Example</w:t>
       </w:r>
       <w:r>
-        <w:t>: If a model learns weights [2, -3, 0.5], L1 would penalize |2| + |-3| + |0.5| = 5.5, while L2 would penalize 2² + (-</w:t>
-      </w:r>
-      <w:proofErr w:type="gramStart"/>
-      <w:r>
-        <w:t>3)²</w:t>
-      </w:r>
-      <w:proofErr w:type="gramEnd"/>
-      <w:r>
-        <w:t xml:space="preserve"> + 0.5² = 13.25.</w:t>
+        <w:t>: If a model learns weights [2, -3, 0.5], L1 would penalize |2| + |-3| + |0.5| = 5.5, while L2 would penalize 2² + (-3)² + 0.5² = 13.25.</w:t>
       </w:r>
     </w:p>
     <w:p/>
@@ -473,7 +465,6 @@
       <w:r>
         <w:t xml:space="preserve">A </w:t>
       </w:r>
-      <w:proofErr w:type="gramStart"/>
       <w:r>
         <w:rPr>
           <w:b/>
@@ -481,11 +472,9 @@
         </w:rPr>
         <w:t>local minima</w:t>
       </w:r>
-      <w:proofErr w:type="gramEnd"/>
       <w:r>
         <w:t xml:space="preserve"> is a point where a function’s value is lower than nearby points, while a </w:t>
       </w:r>
-      <w:proofErr w:type="gramStart"/>
       <w:r>
         <w:rPr>
           <w:b/>
@@ -493,7 +482,6 @@
         </w:rPr>
         <w:t>global minima</w:t>
       </w:r>
-      <w:proofErr w:type="gramEnd"/>
       <w:r>
         <w:t xml:space="preserve"> is the absolute lowest point across the entire function.</w:t>
       </w:r>
@@ -595,24 +583,11 @@
     </w:p>
     <w:p>
       <w:r>
-        <w:t xml:space="preserve">And </w:t>
-      </w:r>
-      <w:proofErr w:type="gramStart"/>
-      <w:r>
-        <w:t>also</w:t>
-      </w:r>
-      <w:proofErr w:type="gramEnd"/>
-      <w:r>
-        <w:t xml:space="preserve"> we can’t use linear regression loss function on classification, </w:t>
-      </w:r>
-      <w:r>
-        <w:t xml:space="preserve">because means square error only finds the distance between predicted data points and correct data points in continuous value </w:t>
-      </w:r>
-      <w:proofErr w:type="gramStart"/>
-      <w:r>
-        <w:t>manner(</w:t>
-      </w:r>
-      <w:proofErr w:type="gramEnd"/>
+        <w:t xml:space="preserve">And also we can’t use linear regression loss function on classification, </w:t>
+      </w:r>
+      <w:r>
+        <w:t>because means square error only finds the distance between predicted data points and correct data points in continuous value manner(</w:t>
+      </w:r>
       <w:r>
         <w:t>2.5, 3.7, etc.)</w:t>
       </w:r>
@@ -636,15 +611,7 @@
         <w:t>, following is the formula for cross entropy which will gives values from 0 or 1</w:t>
       </w:r>
       <w:r>
-        <w:t xml:space="preserve"> when we put 0 or 1 values to </w:t>
-      </w:r>
-      <w:proofErr w:type="spellStart"/>
-      <w:r>
-        <w:t>yi</w:t>
-      </w:r>
-      <w:proofErr w:type="spellEnd"/>
-      <w:r>
-        <w:t>.</w:t>
+        <w:t xml:space="preserve"> when we put 0 or 1 values to yi.</w:t>
       </w:r>
     </w:p>
     <w:p>
@@ -764,23 +731,7 @@
           <w:b/>
           <w:bCs/>
         </w:rPr>
-        <w:t xml:space="preserve">ratio between the true </w:t>
-      </w:r>
-      <w:proofErr w:type="gramStart"/>
-      <w:r>
-        <w:rPr>
-          <w:b/>
-          <w:bCs/>
-        </w:rPr>
-        <w:t>positives(</w:t>
-      </w:r>
-      <w:proofErr w:type="gramEnd"/>
-      <w:r>
-        <w:rPr>
-          <w:b/>
-          <w:bCs/>
-        </w:rPr>
-        <w:t xml:space="preserve">TP) and all the positive examples (TP+FP) </w:t>
+        <w:t xml:space="preserve">ratio between the true positives(TP) and all the positive examples (TP+FP) </w:t>
       </w:r>
       <w:r>
         <w:t xml:space="preserve">predicted by the model. In other words, precision measures how many of the predicted positive examples are </w:t>
@@ -884,137 +835,85 @@
           <w:sz w:val="28"/>
           <w:szCs w:val="28"/>
         </w:rPr>
-        <w:t xml:space="preserve">7. What is the difference between </w:t>
-      </w:r>
-      <w:proofErr w:type="spellStart"/>
-      <w:r>
-        <w:rPr>
-          <w:b/>
-          <w:bCs/>
-          <w:sz w:val="28"/>
-          <w:szCs w:val="28"/>
+        <w:t>7. What is the difference between upsampling and downsampling?</w:t>
+      </w:r>
+    </w:p>
+    <w:p>
+      <w:r>
+        <w:t xml:space="preserve"> In </w:t>
+      </w:r>
+      <w:r>
+        <w:rPr>
+          <w:b/>
+          <w:bCs/>
         </w:rPr>
         <w:t>upsampling</w:t>
       </w:r>
-      <w:proofErr w:type="spellEnd"/>
-      <w:r>
-        <w:rPr>
-          <w:b/>
-          <w:bCs/>
-          <w:sz w:val="28"/>
-          <w:szCs w:val="28"/>
-        </w:rPr>
-        <w:t xml:space="preserve"> and </w:t>
-      </w:r>
-      <w:proofErr w:type="spellStart"/>
-      <w:r>
-        <w:rPr>
-          <w:b/>
-          <w:bCs/>
-          <w:sz w:val="28"/>
-          <w:szCs w:val="28"/>
+      <w:r>
+        <w:t xml:space="preserve"> method, we </w:t>
+      </w:r>
+      <w:r>
+        <w:rPr>
+          <w:b/>
+          <w:bCs/>
+        </w:rPr>
+        <w:t>increase</w:t>
+      </w:r>
+      <w:r>
+        <w:t xml:space="preserve"> the number of samples in the </w:t>
+      </w:r>
+      <w:r>
+        <w:rPr>
+          <w:b/>
+          <w:bCs/>
+        </w:rPr>
+        <w:t>minority class</w:t>
+      </w:r>
+      <w:r>
+        <w:t xml:space="preserve"> by randomly selecting some points from the minority class and adding them to the dataset repeat this process till the </w:t>
+      </w:r>
+      <w:r>
+        <w:rPr>
+          <w:b/>
+          <w:bCs/>
+        </w:rPr>
+        <w:t>dataset gets balanced for each class</w:t>
+      </w:r>
+      <w:r>
+        <w:t xml:space="preserve">. But, here is a </w:t>
+      </w:r>
+      <w:r>
+        <w:rPr>
+          <w:b/>
+          <w:bCs/>
+        </w:rPr>
+        <w:t>disadvantage</w:t>
+      </w:r>
+      <w:r>
+        <w:t xml:space="preserve"> the training accuracy becomes high as in each epoch model trained more than once in each epoch but the </w:t>
+      </w:r>
+      <w:r>
+        <w:rPr>
+          <w:b/>
+          <w:bCs/>
+        </w:rPr>
+        <w:t>same high accuracy is not observed in the validation accuracy.</w:t>
+      </w:r>
+      <w:r>
+        <w:t xml:space="preserve">  </w:t>
+      </w:r>
+    </w:p>
+    <w:p>
+      <w:r>
+        <w:t xml:space="preserve">In </w:t>
+      </w:r>
+      <w:r>
+        <w:rPr>
+          <w:b/>
+          <w:bCs/>
         </w:rPr>
         <w:t>downsampling</w:t>
       </w:r>
-      <w:proofErr w:type="spellEnd"/>
-      <w:r>
-        <w:rPr>
-          <w:b/>
-          <w:bCs/>
-          <w:sz w:val="28"/>
-          <w:szCs w:val="28"/>
-        </w:rPr>
-        <w:t>?</w:t>
-      </w:r>
-    </w:p>
-    <w:p>
-      <w:r>
-        <w:t xml:space="preserve"> In </w:t>
-      </w:r>
-      <w:proofErr w:type="spellStart"/>
-      <w:r>
-        <w:rPr>
-          <w:b/>
-          <w:bCs/>
-        </w:rPr>
-        <w:t>upsampling</w:t>
-      </w:r>
-      <w:proofErr w:type="spellEnd"/>
-      <w:r>
-        <w:t xml:space="preserve"> method, we </w:t>
-      </w:r>
-      <w:r>
-        <w:rPr>
-          <w:b/>
-          <w:bCs/>
-        </w:rPr>
-        <w:t>increase</w:t>
-      </w:r>
-      <w:r>
-        <w:t xml:space="preserve"> the number of samples in the </w:t>
-      </w:r>
-      <w:r>
-        <w:rPr>
-          <w:b/>
-          <w:bCs/>
-        </w:rPr>
-        <w:t>minority class</w:t>
-      </w:r>
-      <w:r>
-        <w:t xml:space="preserve"> by randomly selecting some points from the minority class and adding them to the dataset repeat this process till the </w:t>
-      </w:r>
-      <w:r>
-        <w:rPr>
-          <w:b/>
-          <w:bCs/>
-        </w:rPr>
-        <w:t>dataset gets balanced for each class</w:t>
-      </w:r>
-      <w:r>
-        <w:t xml:space="preserve">. </w:t>
-      </w:r>
-      <w:proofErr w:type="gramStart"/>
-      <w:r>
-        <w:t>But,</w:t>
-      </w:r>
-      <w:proofErr w:type="gramEnd"/>
-      <w:r>
-        <w:t xml:space="preserve"> here is a </w:t>
-      </w:r>
-      <w:r>
-        <w:rPr>
-          <w:b/>
-          <w:bCs/>
-        </w:rPr>
-        <w:t>disadvantage</w:t>
-      </w:r>
-      <w:r>
-        <w:t xml:space="preserve"> the training accuracy becomes high as in each epoch model trained more than once in each epoch but the </w:t>
-      </w:r>
-      <w:r>
-        <w:rPr>
-          <w:b/>
-          <w:bCs/>
-        </w:rPr>
-        <w:t>same high accuracy is not observed in the validation accuracy.</w:t>
-      </w:r>
-      <w:r>
-        <w:t xml:space="preserve">  </w:t>
-      </w:r>
-    </w:p>
-    <w:p>
-      <w:r>
-        <w:t xml:space="preserve">In </w:t>
-      </w:r>
-      <w:proofErr w:type="spellStart"/>
-      <w:r>
-        <w:rPr>
-          <w:b/>
-          <w:bCs/>
-        </w:rPr>
-        <w:t>downsampling</w:t>
-      </w:r>
-      <w:proofErr w:type="spellEnd"/>
       <w:r>
         <w:t xml:space="preserve">, we </w:t>
       </w:r>
@@ -1145,23 +1044,7 @@
           <w:b/>
           <w:bCs/>
         </w:rPr>
-        <w:t xml:space="preserve"> </w:t>
-      </w:r>
-      <w:proofErr w:type="spellStart"/>
-      <w:r>
-        <w:rPr>
-          <w:b/>
-          <w:bCs/>
-        </w:rPr>
-        <w:t>Upsampling</w:t>
-      </w:r>
-      <w:proofErr w:type="spellEnd"/>
-      <w:r>
-        <w:rPr>
-          <w:b/>
-          <w:bCs/>
-        </w:rPr>
-        <w:t xml:space="preserve"> Example:</w:t>
+        <w:t xml:space="preserve"> Upsampling Example:</w:t>
       </w:r>
     </w:p>
     <w:p>
@@ -1209,21 +1092,8 @@
         </w:numPr>
       </w:pPr>
       <w:r>
-        <w:t xml:space="preserve">Spam: </w:t>
-      </w:r>
-      <w:proofErr w:type="spellStart"/>
-      <w:r>
-        <w:t>EmailA</w:t>
-      </w:r>
-      <w:proofErr w:type="spellEnd"/>
-      <w:r>
-        <w:t xml:space="preserve">, </w:t>
-      </w:r>
-      <w:proofErr w:type="spellStart"/>
-      <w:r>
-        <w:t>EmailB</w:t>
-      </w:r>
-      <w:proofErr w:type="spellEnd"/>
+        <w:t>Spam: EmailA, EmailB</w:t>
+      </w:r>
     </w:p>
     <w:p>
       <w:pPr>
@@ -1232,21 +1102,12 @@
           <w:numId w:val="4"/>
         </w:numPr>
       </w:pPr>
-      <w:proofErr w:type="spellStart"/>
-      <w:r>
-        <w:rPr>
-          <w:b/>
-          <w:bCs/>
-        </w:rPr>
-        <w:t>Upsample</w:t>
-      </w:r>
-      <w:proofErr w:type="spellEnd"/>
-      <w:r>
-        <w:rPr>
-          <w:b/>
-          <w:bCs/>
-        </w:rPr>
-        <w:t xml:space="preserve"> Spam</w:t>
+      <w:r>
+        <w:rPr>
+          <w:b/>
+          <w:bCs/>
+        </w:rPr>
+        <w:t>Upsample Spam</w:t>
       </w:r>
       <w:r>
         <w:t xml:space="preserve"> by randomly duplicating samples:</w:t>
@@ -1260,77 +1121,8 @@
         </w:numPr>
       </w:pPr>
       <w:r>
-        <w:t xml:space="preserve">Spam after </w:t>
-      </w:r>
-      <w:proofErr w:type="spellStart"/>
-      <w:r>
-        <w:t>upsampling</w:t>
-      </w:r>
-      <w:proofErr w:type="spellEnd"/>
-      <w:r>
-        <w:t xml:space="preserve">: </w:t>
-      </w:r>
-      <w:proofErr w:type="spellStart"/>
-      <w:r>
-        <w:t>EmailA</w:t>
-      </w:r>
-      <w:proofErr w:type="spellEnd"/>
-      <w:r>
-        <w:t xml:space="preserve">, </w:t>
-      </w:r>
-      <w:proofErr w:type="spellStart"/>
-      <w:r>
-        <w:t>EmailB</w:t>
-      </w:r>
-      <w:proofErr w:type="spellEnd"/>
-      <w:r>
-        <w:t xml:space="preserve">, </w:t>
-      </w:r>
-      <w:proofErr w:type="spellStart"/>
-      <w:r>
-        <w:t>EmailA</w:t>
-      </w:r>
-      <w:proofErr w:type="spellEnd"/>
-      <w:r>
-        <w:t xml:space="preserve">, </w:t>
-      </w:r>
-      <w:proofErr w:type="spellStart"/>
-      <w:r>
-        <w:t>EmailB</w:t>
-      </w:r>
-      <w:proofErr w:type="spellEnd"/>
-      <w:r>
-        <w:t xml:space="preserve">, </w:t>
-      </w:r>
-      <w:proofErr w:type="spellStart"/>
-      <w:r>
-        <w:t>EmailA</w:t>
-      </w:r>
-      <w:proofErr w:type="spellEnd"/>
-      <w:r>
-        <w:t xml:space="preserve">, </w:t>
-      </w:r>
-      <w:proofErr w:type="spellStart"/>
-      <w:r>
-        <w:t>EmailB</w:t>
-      </w:r>
-      <w:proofErr w:type="spellEnd"/>
-      <w:r>
-        <w:t xml:space="preserve">, </w:t>
-      </w:r>
-      <w:proofErr w:type="spellStart"/>
-      <w:r>
-        <w:t>EmailA</w:t>
-      </w:r>
-      <w:proofErr w:type="spellEnd"/>
-      <w:r>
-        <w:t xml:space="preserve">, </w:t>
-      </w:r>
-      <w:proofErr w:type="spellStart"/>
-      <w:r>
-        <w:t>EmailB</w:t>
-      </w:r>
-      <w:proofErr w:type="spellEnd"/>
+        <w:t>Spam after upsampling: EmailA, EmailB, EmailA, EmailB, EmailA, EmailB, EmailA, EmailB</w:t>
+      </w:r>
     </w:p>
     <w:p>
       <w:pPr>
@@ -1404,23 +1196,7 @@
           <w:b/>
           <w:bCs/>
         </w:rPr>
-        <w:t xml:space="preserve"> </w:t>
-      </w:r>
-      <w:proofErr w:type="spellStart"/>
-      <w:r>
-        <w:rPr>
-          <w:b/>
-          <w:bCs/>
-        </w:rPr>
-        <w:t>Downsampling</w:t>
-      </w:r>
-      <w:proofErr w:type="spellEnd"/>
-      <w:r>
-        <w:rPr>
-          <w:b/>
-          <w:bCs/>
-        </w:rPr>
-        <w:t xml:space="preserve"> Example:</w:t>
+        <w:t xml:space="preserve"> Downsampling Example:</w:t>
       </w:r>
     </w:p>
     <w:p>
@@ -1478,21 +1254,8 @@
         </w:numPr>
       </w:pPr>
       <w:r>
-        <w:t xml:space="preserve">Spam: </w:t>
-      </w:r>
-      <w:proofErr w:type="spellStart"/>
-      <w:r>
-        <w:t>EmailA</w:t>
-      </w:r>
-      <w:proofErr w:type="spellEnd"/>
-      <w:r>
-        <w:t xml:space="preserve">, </w:t>
-      </w:r>
-      <w:proofErr w:type="spellStart"/>
-      <w:r>
-        <w:t>EmailB</w:t>
-      </w:r>
-      <w:proofErr w:type="spellEnd"/>
+        <w:t>Spam: EmailA, EmailB</w:t>
+      </w:r>
     </w:p>
     <w:p>
       <w:pPr>
@@ -1501,21 +1264,12 @@
           <w:numId w:val="5"/>
         </w:numPr>
       </w:pPr>
-      <w:proofErr w:type="spellStart"/>
-      <w:r>
-        <w:rPr>
-          <w:b/>
-          <w:bCs/>
-        </w:rPr>
-        <w:t>Downsample</w:t>
-      </w:r>
-      <w:proofErr w:type="spellEnd"/>
-      <w:r>
-        <w:rPr>
-          <w:b/>
-          <w:bCs/>
-        </w:rPr>
-        <w:t xml:space="preserve"> Not Spam</w:t>
+      <w:r>
+        <w:rPr>
+          <w:b/>
+          <w:bCs/>
+        </w:rPr>
+        <w:t>Downsample Not Spam</w:t>
       </w:r>
       <w:r>
         <w:t xml:space="preserve"> by randomly selecting 2 emails:</w:t>
@@ -1529,15 +1283,7 @@
         </w:numPr>
       </w:pPr>
       <w:r>
-        <w:t xml:space="preserve">Not Spam after </w:t>
-      </w:r>
-      <w:proofErr w:type="spellStart"/>
-      <w:r>
-        <w:t>downsampling</w:t>
-      </w:r>
-      <w:proofErr w:type="spellEnd"/>
-      <w:r>
-        <w:t>: Email3, Email7</w:t>
+        <w:t>Not Spam after downsampling: Email3, Email7</w:t>
       </w:r>
     </w:p>
     <w:p>
@@ -1601,9 +1347,72 @@
           <w:sz w:val="28"/>
           <w:szCs w:val="28"/>
         </w:rPr>
-        <w:t xml:space="preserve">8. What is data leakage and how we can </w:t>
-      </w:r>
-      <w:proofErr w:type="gramStart"/>
+        <w:t>8. What is data leakage and how we can found it?</w:t>
+      </w:r>
+    </w:p>
+    <w:p>
+      <w:r>
+        <w:rPr>
+          <w:b/>
+          <w:bCs/>
+        </w:rPr>
+        <w:t>1.</w:t>
+      </w:r>
+      <w:r>
+        <w:t xml:space="preserve"> Data leakage is when your model accidentally sees the answers (target data) during training.</w:t>
+      </w:r>
+      <w:r>
+        <w:br/>
+      </w:r>
+      <w:r>
+        <w:rPr>
+          <w:b/>
+          <w:bCs/>
+        </w:rPr>
+        <w:t>2.</w:t>
+      </w:r>
+      <w:r>
+        <w:t xml:space="preserve"> This makes the model look very accurate, but it won't work well on real data.</w:t>
+      </w:r>
+      <w:r>
+        <w:br/>
+      </w:r>
+      <w:r>
+        <w:rPr>
+          <w:b/>
+          <w:bCs/>
+        </w:rPr>
+        <w:t>3.</w:t>
+      </w:r>
+      <w:r>
+        <w:t xml:space="preserve"> It can happen if future information or labels are used in training features.</w:t>
+      </w:r>
+      <w:r>
+        <w:br/>
+      </w:r>
+      <w:r>
+        <w:rPr>
+          <w:b/>
+          <w:bCs/>
+        </w:rPr>
+        <w:t>4.</w:t>
+      </w:r>
+      <w:r>
+        <w:t xml:space="preserve"> To find it, carefully check that your model only uses data available </w:t>
+      </w:r>
+      <w:r>
+        <w:rPr>
+          <w:i/>
+          <w:iCs/>
+        </w:rPr>
+        <w:t>before</w:t>
+      </w:r>
+      <w:r>
+        <w:t xml:space="preserve"> prediction time.</w:t>
+      </w:r>
+    </w:p>
+    <w:p/>
+    <w:p>
       <w:r>
         <w:rPr>
           <w:b/>
@@ -1611,174 +1420,89 @@
           <w:sz w:val="28"/>
           <w:szCs w:val="28"/>
         </w:rPr>
-        <w:t>found</w:t>
-      </w:r>
-      <w:proofErr w:type="gramEnd"/>
-      <w:r>
-        <w:rPr>
-          <w:b/>
-          <w:bCs/>
-          <w:sz w:val="28"/>
-          <w:szCs w:val="28"/>
-        </w:rPr>
-        <w:t xml:space="preserve"> it?</w:t>
-      </w:r>
-    </w:p>
-    <w:p>
-      <w:r>
-        <w:rPr>
-          <w:b/>
-          <w:bCs/>
-        </w:rPr>
-        <w:t>1.</w:t>
-      </w:r>
-      <w:r>
-        <w:t xml:space="preserve"> Data leakage is when your model accidentally sees the answers (target data) during training.</w:t>
-      </w:r>
-      <w:r>
-        <w:br/>
-      </w:r>
-      <w:r>
-        <w:rPr>
-          <w:b/>
-          <w:bCs/>
-        </w:rPr>
-        <w:t>2.</w:t>
-      </w:r>
-      <w:r>
-        <w:t xml:space="preserve"> This makes the model look very accurate, but it won't work well on real data.</w:t>
-      </w:r>
-      <w:r>
-        <w:br/>
-      </w:r>
-      <w:r>
-        <w:rPr>
-          <w:b/>
-          <w:bCs/>
-        </w:rPr>
-        <w:t>3.</w:t>
-      </w:r>
-      <w:r>
-        <w:t xml:space="preserve"> It can happen if future information or labels are used in training features.</w:t>
-      </w:r>
-      <w:r>
-        <w:br/>
-      </w:r>
-      <w:r>
-        <w:rPr>
-          <w:b/>
-          <w:bCs/>
-        </w:rPr>
-        <w:t>4.</w:t>
-      </w:r>
-      <w:r>
-        <w:t xml:space="preserve"> To find it, carefully check that your model only uses data available </w:t>
-      </w:r>
-      <w:r>
-        <w:rPr>
-          <w:i/>
-          <w:iCs/>
-        </w:rPr>
-        <w:t>before</w:t>
-      </w:r>
-      <w:r>
-        <w:t xml:space="preserve"> prediction time.</w:t>
+        <w:t>9. Explain the classification report and the metrics it includes.</w:t>
+      </w:r>
+      <w:r>
+        <w:t xml:space="preserve"> </w:t>
+      </w:r>
+    </w:p>
+    <w:p>
+      <w:r>
+        <w:t xml:space="preserve">The classification report provides key metrics to evaluate a model’s performance, including: Precision: The proportion of true positives to all predicted positives, measuring accuracy of positive predictions. </w:t>
+      </w:r>
+    </w:p>
+    <w:p>
+      <w:r>
+        <w:t xml:space="preserve">Recall: The proportion of true positives to all actual positives, indicating how well the model finds positive instances. </w:t>
+      </w:r>
+    </w:p>
+    <w:p>
+      <w:r>
+        <w:t xml:space="preserve">F1-Score: The harmonic mean of precision and recall, balancing the two metrics. </w:t>
+      </w:r>
+    </w:p>
+    <w:p>
+      <w:r>
+        <w:t xml:space="preserve">Support: The number of true instances for each class in the dataset. </w:t>
+      </w:r>
+    </w:p>
+    <w:p>
+      <w:r>
+        <w:t xml:space="preserve">Accuracy: The overall proportion of correct predictions. </w:t>
+      </w:r>
+    </w:p>
+    <w:p>
+      <w:r>
+        <w:t xml:space="preserve">Macro Average: The average of precision, recall, and F1-score across all classes, treating them equally. </w:t>
+      </w:r>
+    </w:p>
+    <w:p>
+      <w:r>
+        <w:t>Weighted Average: The average of metrics, weighted by class support, giving more importance to frequent classes.</w:t>
       </w:r>
     </w:p>
     <w:p/>
     <w:p>
-      <w:r>
-        <w:rPr>
-          <w:b/>
-          <w:bCs/>
-          <w:sz w:val="28"/>
-          <w:szCs w:val="28"/>
-        </w:rPr>
-        <w:t>9.</w:t>
-      </w:r>
-      <w:r>
-        <w:rPr>
-          <w:b/>
-          <w:bCs/>
-          <w:sz w:val="28"/>
-          <w:szCs w:val="28"/>
-        </w:rPr>
-        <w:t xml:space="preserve"> Explain the classification report and the metrics it includes.</w:t>
-      </w:r>
-      <w:r>
-        <w:t xml:space="preserve"> </w:t>
-      </w:r>
-    </w:p>
-    <w:p>
-      <w:r>
-        <w:t xml:space="preserve">The classification report provides key metrics to evaluate a model’s performance, including: Precision: The proportion of true positives to all predicted positives, measuring accuracy of positive predictions. </w:t>
-      </w:r>
-    </w:p>
-    <w:p>
-      <w:r>
-        <w:t xml:space="preserve">Recall: The proportion of true positives to all actual positives, indicating how well the model finds positive instances. </w:t>
-      </w:r>
-    </w:p>
-    <w:p>
-      <w:r>
-        <w:t xml:space="preserve">F1-Score: The harmonic </w:t>
-      </w:r>
-      <w:proofErr w:type="gramStart"/>
-      <w:r>
-        <w:t>mean</w:t>
-      </w:r>
-      <w:proofErr w:type="gramEnd"/>
-      <w:r>
-        <w:t xml:space="preserve"> of precision and recall, balancing the two metrics. </w:t>
-      </w:r>
-    </w:p>
-    <w:p>
-      <w:r>
-        <w:t xml:space="preserve">Support: The number of true instances for each class in the dataset. </w:t>
-      </w:r>
-    </w:p>
-    <w:p>
-      <w:r>
-        <w:t xml:space="preserve">Accuracy: The overall proportion of correct predictions. </w:t>
-      </w:r>
-    </w:p>
-    <w:p>
-      <w:r>
-        <w:t xml:space="preserve">Macro Average: The average of precision, recall, and F1-score across all classes, treating them equally. </w:t>
-      </w:r>
-    </w:p>
-    <w:p>
-      <w:r>
-        <w:t>Weighted Average: The average of metrics, weighted by class support, giving more importance to frequent classes.</w:t>
-      </w:r>
-    </w:p>
-    <w:p/>
-    <w:p>
-      <w:pPr>
-        <w:rPr>
-          <w:b/>
-          <w:bCs/>
-        </w:rPr>
-      </w:pPr>
-      <w:r>
-        <w:rPr>
-          <w:b/>
-          <w:bCs/>
-        </w:rPr>
-        <w:t>EXAMPLE FOR LAT FOUR</w:t>
-      </w:r>
-    </w:p>
-    <w:p>
-      <w:pPr>
-        <w:rPr>
-          <w:b/>
-          <w:bCs/>
-        </w:rPr>
-      </w:pPr>
-      <w:r>
-        <w:rPr>
-          <w:b/>
-          <w:bCs/>
+      <w:pPr>
+        <w:rPr>
+          <w:b/>
+          <w:bCs/>
+        </w:rPr>
+      </w:pPr>
+      <w:r>
+        <w:rPr>
+          <w:b/>
+          <w:bCs/>
+        </w:rPr>
+        <w:t>EXAMPLE FOR LA</w:t>
+      </w:r>
+      <w:r>
+        <w:rPr>
+          <w:b/>
+          <w:bCs/>
+        </w:rPr>
+        <w:t>S</w:t>
+      </w:r>
+      <w:r>
+        <w:rPr>
+          <w:b/>
+          <w:bCs/>
+        </w:rPr>
+        <w:t>T FOUR</w:t>
+      </w:r>
+    </w:p>
+    <w:p>
+      <w:pPr>
+        <w:rPr>
+          <w:b/>
+          <w:bCs/>
+        </w:rPr>
+      </w:pPr>
+      <w:r>
+        <w:rPr>
+          <w:b/>
+          <w:bCs/>
+          <w:noProof/>
         </w:rPr>
         <w:lastRenderedPageBreak/>
         <w:drawing>
@@ -1829,6 +1553,7 @@
         <w:rPr>
           <w:b/>
           <w:bCs/>
+          <w:noProof/>
         </w:rPr>
         <w:drawing>
           <wp:inline distT="0" distB="0" distL="0" distR="0" wp14:anchorId="09C780C1" wp14:editId="4CB5D41D">
@@ -1886,6 +1611,7 @@
         <w:rPr>
           <w:b/>
           <w:bCs/>
+          <w:noProof/>
         </w:rPr>
         <w:drawing>
           <wp:inline distT="0" distB="0" distL="0" distR="0" wp14:anchorId="030102FE" wp14:editId="1E8EB1FB">
@@ -3189,6 +2915,7 @@
   <w:style w:type="character" w:default="1" w:styleId="DefaultParagraphFont">
     <w:name w:val="Default Paragraph Font"/>
     <w:uiPriority w:val="1"/>
+    <w:semiHidden/>
     <w:unhideWhenUsed/>
   </w:style>
   <w:style w:type="table" w:default="1" w:styleId="TableNormal">

</xml_diff>

<commit_message>
What is random forest model in ML, How to avoid overfitting on random forest model
</commit_message>
<xml_diff>
--- a/ML_Interview_questions.docx
+++ b/ML_Interview_questions.docx
@@ -1650,7 +1650,122 @@
         </w:drawing>
       </w:r>
     </w:p>
-    <w:p/>
+    <w:p>
+      <w:r>
+        <w:rPr>
+          <w:b/>
+          <w:bCs/>
+          <w:sz w:val="28"/>
+          <w:szCs w:val="28"/>
+        </w:rPr>
+        <w:lastRenderedPageBreak/>
+        <w:t>11. What are some of the hyperparameters of the random forest regressor which help to avoid overfitting?</w:t>
+      </w:r>
+      <w:r>
+        <w:t xml:space="preserve"> </w:t>
+      </w:r>
+    </w:p>
+    <w:p>
+      <w:r>
+        <w:t xml:space="preserve">The most important hyperparameters of a Random Forest are: </w:t>
+      </w:r>
+    </w:p>
+    <w:p>
+      <w:r>
+        <w:t xml:space="preserve">max_depth: Sometimes the larger depth of the tree can create overfitting. To overcome it, the depth should be limited. </w:t>
+      </w:r>
+    </w:p>
+    <w:p>
+      <w:r>
+        <w:t>n-estimator: It is the number of decision trees we want in our forest.</w:t>
+      </w:r>
+      <w:r>
+        <w:t xml:space="preserve"> </w:t>
+      </w:r>
+    </w:p>
+    <w:p>
+      <w:r>
+        <w:t>max_leaf_nodes: It helps the model to control the splitting of the nodes and in turn, the depth of the model is also restricted</w:t>
+      </w:r>
+    </w:p>
+    <w:p>
+      <w:r>
+        <w:drawing>
+          <wp:inline distT="0" distB="0" distL="0" distR="0" wp14:anchorId="72C4E698" wp14:editId="03A2F4C0">
+            <wp:extent cx="4648200" cy="1585105"/>
+            <wp:effectExtent l="0" t="0" r="0" b="0"/>
+            <wp:docPr id="1275370119" name="Picture 1"/>
+            <wp:cNvGraphicFramePr>
+              <a:graphicFrameLocks xmlns:a="http://schemas.openxmlformats.org/drawingml/2006/main" noChangeAspect="1"/>
+            </wp:cNvGraphicFramePr>
+            <a:graphic xmlns:a="http://schemas.openxmlformats.org/drawingml/2006/main">
+              <a:graphicData uri="http://schemas.openxmlformats.org/drawingml/2006/picture">
+                <pic:pic xmlns:pic="http://schemas.openxmlformats.org/drawingml/2006/picture">
+                  <pic:nvPicPr>
+                    <pic:cNvPr id="1275370119" name=""/>
+                    <pic:cNvPicPr/>
+                  </pic:nvPicPr>
+                  <pic:blipFill>
+                    <a:blip r:embed="rId16"/>
+                    <a:stretch>
+                      <a:fillRect/>
+                    </a:stretch>
+                  </pic:blipFill>
+                  <pic:spPr>
+                    <a:xfrm>
+                      <a:off x="0" y="0"/>
+                      <a:ext cx="4656690" cy="1588000"/>
+                    </a:xfrm>
+                    <a:prstGeom prst="rect">
+                      <a:avLst/>
+                    </a:prstGeom>
+                  </pic:spPr>
+                </pic:pic>
+              </a:graphicData>
+            </a:graphic>
+          </wp:inline>
+        </w:drawing>
+      </w:r>
+    </w:p>
+    <w:p>
+      <w:r>
+        <w:drawing>
+          <wp:inline distT="0" distB="0" distL="0" distR="0" wp14:anchorId="507CF6EA" wp14:editId="2DBF01BE">
+            <wp:extent cx="4206240" cy="3294043"/>
+            <wp:effectExtent l="0" t="0" r="3810" b="1905"/>
+            <wp:docPr id="97616672" name="Picture 1"/>
+            <wp:cNvGraphicFramePr>
+              <a:graphicFrameLocks xmlns:a="http://schemas.openxmlformats.org/drawingml/2006/main" noChangeAspect="1"/>
+            </wp:cNvGraphicFramePr>
+            <a:graphic xmlns:a="http://schemas.openxmlformats.org/drawingml/2006/main">
+              <a:graphicData uri="http://schemas.openxmlformats.org/drawingml/2006/picture">
+                <pic:pic xmlns:pic="http://schemas.openxmlformats.org/drawingml/2006/picture">
+                  <pic:nvPicPr>
+                    <pic:cNvPr id="97616672" name=""/>
+                    <pic:cNvPicPr/>
+                  </pic:nvPicPr>
+                  <pic:blipFill>
+                    <a:blip r:embed="rId17"/>
+                    <a:stretch>
+                      <a:fillRect/>
+                    </a:stretch>
+                  </pic:blipFill>
+                  <pic:spPr>
+                    <a:xfrm>
+                      <a:off x="0" y="0"/>
+                      <a:ext cx="4215218" cy="3301074"/>
+                    </a:xfrm>
+                    <a:prstGeom prst="rect">
+                      <a:avLst/>
+                    </a:prstGeom>
+                  </pic:spPr>
+                </pic:pic>
+              </a:graphicData>
+            </a:graphic>
+          </wp:inline>
+        </w:drawing>
+      </w:r>
+    </w:p>
     <w:p/>
     <w:p/>
     <w:p>
@@ -2915,7 +3030,6 @@
   <w:style w:type="character" w:default="1" w:styleId="DefaultParagraphFont">
     <w:name w:val="Default Paragraph Font"/>
     <w:uiPriority w:val="1"/>
-    <w:semiHidden/>
     <w:unhideWhenUsed/>
   </w:style>
   <w:style w:type="table" w:default="1" w:styleId="TableNormal">

</xml_diff>

<commit_message>
What is bais-variance trade-off and ROC AUC curve
</commit_message>
<xml_diff>
--- a/ML_Interview_questions.docx
+++ b/ML_Interview_questions.docx
@@ -364,7 +364,15 @@
         <w:t>Example</w:t>
       </w:r>
       <w:r>
-        <w:t>: If a model learns weights [2, -3, 0.5], L1 would penalize |2| + |-3| + |0.5| = 5.5, while L2 would penalize 2² + (-3)² + 0.5² = 13.25.</w:t>
+        <w:t>: If a model learns weights [2, -3, 0.5], L1 would penalize |2| + |-3| + |0.5| = 5.5, while L2 would penalize 2² + (-</w:t>
+      </w:r>
+      <w:proofErr w:type="gramStart"/>
+      <w:r>
+        <w:t>3)²</w:t>
+      </w:r>
+      <w:proofErr w:type="gramEnd"/>
+      <w:r>
+        <w:t xml:space="preserve"> + 0.5² = 13.25.</w:t>
       </w:r>
     </w:p>
     <w:p/>
@@ -465,6 +473,7 @@
       <w:r>
         <w:t xml:space="preserve">A </w:t>
       </w:r>
+      <w:proofErr w:type="gramStart"/>
       <w:r>
         <w:rPr>
           <w:b/>
@@ -472,9 +481,11 @@
         </w:rPr>
         <w:t>local minima</w:t>
       </w:r>
+      <w:proofErr w:type="gramEnd"/>
       <w:r>
         <w:t xml:space="preserve"> is a point where a function’s value is lower than nearby points, while a </w:t>
       </w:r>
+      <w:proofErr w:type="gramStart"/>
       <w:r>
         <w:rPr>
           <w:b/>
@@ -482,6 +493,7 @@
         </w:rPr>
         <w:t>global minima</w:t>
       </w:r>
+      <w:proofErr w:type="gramEnd"/>
       <w:r>
         <w:t xml:space="preserve"> is the absolute lowest point across the entire function.</w:t>
       </w:r>
@@ -583,11 +595,24 @@
     </w:p>
     <w:p>
       <w:r>
-        <w:t xml:space="preserve">And also we can’t use linear regression loss function on classification, </w:t>
-      </w:r>
-      <w:r>
-        <w:t>because means square error only finds the distance between predicted data points and correct data points in continuous value manner(</w:t>
-      </w:r>
+        <w:t xml:space="preserve">And </w:t>
+      </w:r>
+      <w:proofErr w:type="gramStart"/>
+      <w:r>
+        <w:t>also</w:t>
+      </w:r>
+      <w:proofErr w:type="gramEnd"/>
+      <w:r>
+        <w:t xml:space="preserve"> we can’t use linear regression loss function on classification, </w:t>
+      </w:r>
+      <w:r>
+        <w:t xml:space="preserve">because means square error only finds the distance between predicted data points and correct data points in continuous value </w:t>
+      </w:r>
+      <w:proofErr w:type="gramStart"/>
+      <w:r>
+        <w:t>manner(</w:t>
+      </w:r>
+      <w:proofErr w:type="gramEnd"/>
       <w:r>
         <w:t>2.5, 3.7, etc.)</w:t>
       </w:r>
@@ -611,7 +636,15 @@
         <w:t>, following is the formula for cross entropy which will gives values from 0 or 1</w:t>
       </w:r>
       <w:r>
-        <w:t xml:space="preserve"> when we put 0 or 1 values to yi.</w:t>
+        <w:t xml:space="preserve"> when we put 0 or 1 values to </w:t>
+      </w:r>
+      <w:proofErr w:type="spellStart"/>
+      <w:r>
+        <w:t>yi</w:t>
+      </w:r>
+      <w:proofErr w:type="spellEnd"/>
+      <w:r>
+        <w:t>.</w:t>
       </w:r>
     </w:p>
     <w:p>
@@ -731,7 +764,23 @@
           <w:b/>
           <w:bCs/>
         </w:rPr>
-        <w:t xml:space="preserve">ratio between the true positives(TP) and all the positive examples (TP+FP) </w:t>
+        <w:t xml:space="preserve">ratio between the true </w:t>
+      </w:r>
+      <w:proofErr w:type="gramStart"/>
+      <w:r>
+        <w:rPr>
+          <w:b/>
+          <w:bCs/>
+        </w:rPr>
+        <w:t>positives(</w:t>
+      </w:r>
+      <w:proofErr w:type="gramEnd"/>
+      <w:r>
+        <w:rPr>
+          <w:b/>
+          <w:bCs/>
+        </w:rPr>
+        <w:t xml:space="preserve">TP) and all the positive examples (TP+FP) </w:t>
       </w:r>
       <w:r>
         <w:t xml:space="preserve">predicted by the model. In other words, precision measures how many of the predicted positive examples are </w:t>
@@ -835,13 +884,54 @@
           <w:sz w:val="28"/>
           <w:szCs w:val="28"/>
         </w:rPr>
-        <w:t>7. What is the difference between upsampling and downsampling?</w:t>
+        <w:t xml:space="preserve">7. What is the difference between </w:t>
+      </w:r>
+      <w:proofErr w:type="spellStart"/>
+      <w:r>
+        <w:rPr>
+          <w:b/>
+          <w:bCs/>
+          <w:sz w:val="28"/>
+          <w:szCs w:val="28"/>
+        </w:rPr>
+        <w:t>upsampling</w:t>
+      </w:r>
+      <w:proofErr w:type="spellEnd"/>
+      <w:r>
+        <w:rPr>
+          <w:b/>
+          <w:bCs/>
+          <w:sz w:val="28"/>
+          <w:szCs w:val="28"/>
+        </w:rPr>
+        <w:t xml:space="preserve"> and </w:t>
+      </w:r>
+      <w:proofErr w:type="spellStart"/>
+      <w:r>
+        <w:rPr>
+          <w:b/>
+          <w:bCs/>
+          <w:sz w:val="28"/>
+          <w:szCs w:val="28"/>
+        </w:rPr>
+        <w:t>downsampling</w:t>
+      </w:r>
+      <w:proofErr w:type="spellEnd"/>
+      <w:r>
+        <w:rPr>
+          <w:b/>
+          <w:bCs/>
+          <w:sz w:val="28"/>
+          <w:szCs w:val="28"/>
+        </w:rPr>
+        <w:t>?</w:t>
       </w:r>
     </w:p>
     <w:p>
       <w:r>
         <w:t xml:space="preserve"> In </w:t>
       </w:r>
+      <w:proofErr w:type="spellStart"/>
       <w:r>
         <w:rPr>
           <w:b/>
@@ -849,6 +939,7 @@
         </w:rPr>
         <w:t>upsampling</w:t>
       </w:r>
+      <w:proofErr w:type="spellEnd"/>
       <w:r>
         <w:t xml:space="preserve"> method, we </w:t>
       </w:r>
@@ -880,7 +971,15 @@
         <w:t>dataset gets balanced for each class</w:t>
       </w:r>
       <w:r>
-        <w:t xml:space="preserve">. But, here is a </w:t>
+        <w:t xml:space="preserve">. </w:t>
+      </w:r>
+      <w:proofErr w:type="gramStart"/>
+      <w:r>
+        <w:t>But,</w:t>
+      </w:r>
+      <w:proofErr w:type="gramEnd"/>
+      <w:r>
+        <w:t xml:space="preserve"> here is a </w:t>
       </w:r>
       <w:r>
         <w:rPr>
@@ -907,6 +1006,7 @@
       <w:r>
         <w:t xml:space="preserve">In </w:t>
       </w:r>
+      <w:proofErr w:type="spellStart"/>
       <w:r>
         <w:rPr>
           <w:b/>
@@ -914,6 +1014,7 @@
         </w:rPr>
         <w:t>downsampling</w:t>
       </w:r>
+      <w:proofErr w:type="spellEnd"/>
       <w:r>
         <w:t xml:space="preserve">, we </w:t>
       </w:r>
@@ -1044,7 +1145,23 @@
           <w:b/>
           <w:bCs/>
         </w:rPr>
-        <w:t xml:space="preserve"> Upsampling Example:</w:t>
+        <w:t xml:space="preserve"> </w:t>
+      </w:r>
+      <w:proofErr w:type="spellStart"/>
+      <w:r>
+        <w:rPr>
+          <w:b/>
+          <w:bCs/>
+        </w:rPr>
+        <w:t>Upsampling</w:t>
+      </w:r>
+      <w:proofErr w:type="spellEnd"/>
+      <w:r>
+        <w:rPr>
+          <w:b/>
+          <w:bCs/>
+        </w:rPr>
+        <w:t xml:space="preserve"> Example:</w:t>
       </w:r>
     </w:p>
     <w:p>
@@ -1092,8 +1209,21 @@
         </w:numPr>
       </w:pPr>
       <w:r>
-        <w:t>Spam: EmailA, EmailB</w:t>
-      </w:r>
+        <w:t xml:space="preserve">Spam: </w:t>
+      </w:r>
+      <w:proofErr w:type="spellStart"/>
+      <w:r>
+        <w:t>EmailA</w:t>
+      </w:r>
+      <w:proofErr w:type="spellEnd"/>
+      <w:r>
+        <w:t xml:space="preserve">, </w:t>
+      </w:r>
+      <w:proofErr w:type="spellStart"/>
+      <w:r>
+        <w:t>EmailB</w:t>
+      </w:r>
+      <w:proofErr w:type="spellEnd"/>
     </w:p>
     <w:p>
       <w:pPr>
@@ -1102,12 +1232,21 @@
           <w:numId w:val="4"/>
         </w:numPr>
       </w:pPr>
-      <w:r>
-        <w:rPr>
-          <w:b/>
-          <w:bCs/>
-        </w:rPr>
-        <w:t>Upsample Spam</w:t>
+      <w:proofErr w:type="spellStart"/>
+      <w:r>
+        <w:rPr>
+          <w:b/>
+          <w:bCs/>
+        </w:rPr>
+        <w:t>Upsample</w:t>
+      </w:r>
+      <w:proofErr w:type="spellEnd"/>
+      <w:r>
+        <w:rPr>
+          <w:b/>
+          <w:bCs/>
+        </w:rPr>
+        <w:t xml:space="preserve"> Spam</w:t>
       </w:r>
       <w:r>
         <w:t xml:space="preserve"> by randomly duplicating samples:</w:t>
@@ -1121,8 +1260,77 @@
         </w:numPr>
       </w:pPr>
       <w:r>
-        <w:t>Spam after upsampling: EmailA, EmailB, EmailA, EmailB, EmailA, EmailB, EmailA, EmailB</w:t>
-      </w:r>
+        <w:t xml:space="preserve">Spam after </w:t>
+      </w:r>
+      <w:proofErr w:type="spellStart"/>
+      <w:r>
+        <w:t>upsampling</w:t>
+      </w:r>
+      <w:proofErr w:type="spellEnd"/>
+      <w:r>
+        <w:t xml:space="preserve">: </w:t>
+      </w:r>
+      <w:proofErr w:type="spellStart"/>
+      <w:r>
+        <w:t>EmailA</w:t>
+      </w:r>
+      <w:proofErr w:type="spellEnd"/>
+      <w:r>
+        <w:t xml:space="preserve">, </w:t>
+      </w:r>
+      <w:proofErr w:type="spellStart"/>
+      <w:r>
+        <w:t>EmailB</w:t>
+      </w:r>
+      <w:proofErr w:type="spellEnd"/>
+      <w:r>
+        <w:t xml:space="preserve">, </w:t>
+      </w:r>
+      <w:proofErr w:type="spellStart"/>
+      <w:r>
+        <w:t>EmailA</w:t>
+      </w:r>
+      <w:proofErr w:type="spellEnd"/>
+      <w:r>
+        <w:t xml:space="preserve">, </w:t>
+      </w:r>
+      <w:proofErr w:type="spellStart"/>
+      <w:r>
+        <w:t>EmailB</w:t>
+      </w:r>
+      <w:proofErr w:type="spellEnd"/>
+      <w:r>
+        <w:t xml:space="preserve">, </w:t>
+      </w:r>
+      <w:proofErr w:type="spellStart"/>
+      <w:r>
+        <w:t>EmailA</w:t>
+      </w:r>
+      <w:proofErr w:type="spellEnd"/>
+      <w:r>
+        <w:t xml:space="preserve">, </w:t>
+      </w:r>
+      <w:proofErr w:type="spellStart"/>
+      <w:r>
+        <w:t>EmailB</w:t>
+      </w:r>
+      <w:proofErr w:type="spellEnd"/>
+      <w:r>
+        <w:t xml:space="preserve">, </w:t>
+      </w:r>
+      <w:proofErr w:type="spellStart"/>
+      <w:r>
+        <w:t>EmailA</w:t>
+      </w:r>
+      <w:proofErr w:type="spellEnd"/>
+      <w:r>
+        <w:t xml:space="preserve">, </w:t>
+      </w:r>
+      <w:proofErr w:type="spellStart"/>
+      <w:r>
+        <w:t>EmailB</w:t>
+      </w:r>
+      <w:proofErr w:type="spellEnd"/>
     </w:p>
     <w:p>
       <w:pPr>
@@ -1196,7 +1404,23 @@
           <w:b/>
           <w:bCs/>
         </w:rPr>
-        <w:t xml:space="preserve"> Downsampling Example:</w:t>
+        <w:t xml:space="preserve"> </w:t>
+      </w:r>
+      <w:proofErr w:type="spellStart"/>
+      <w:r>
+        <w:rPr>
+          <w:b/>
+          <w:bCs/>
+        </w:rPr>
+        <w:t>Downsampling</w:t>
+      </w:r>
+      <w:proofErr w:type="spellEnd"/>
+      <w:r>
+        <w:rPr>
+          <w:b/>
+          <w:bCs/>
+        </w:rPr>
+        <w:t xml:space="preserve"> Example:</w:t>
       </w:r>
     </w:p>
     <w:p>
@@ -1254,8 +1478,21 @@
         </w:numPr>
       </w:pPr>
       <w:r>
-        <w:t>Spam: EmailA, EmailB</w:t>
-      </w:r>
+        <w:t xml:space="preserve">Spam: </w:t>
+      </w:r>
+      <w:proofErr w:type="spellStart"/>
+      <w:r>
+        <w:t>EmailA</w:t>
+      </w:r>
+      <w:proofErr w:type="spellEnd"/>
+      <w:r>
+        <w:t xml:space="preserve">, </w:t>
+      </w:r>
+      <w:proofErr w:type="spellStart"/>
+      <w:r>
+        <w:t>EmailB</w:t>
+      </w:r>
+      <w:proofErr w:type="spellEnd"/>
     </w:p>
     <w:p>
       <w:pPr>
@@ -1264,12 +1501,21 @@
           <w:numId w:val="5"/>
         </w:numPr>
       </w:pPr>
-      <w:r>
-        <w:rPr>
-          <w:b/>
-          <w:bCs/>
-        </w:rPr>
-        <w:t>Downsample Not Spam</w:t>
+      <w:proofErr w:type="spellStart"/>
+      <w:r>
+        <w:rPr>
+          <w:b/>
+          <w:bCs/>
+        </w:rPr>
+        <w:t>Downsample</w:t>
+      </w:r>
+      <w:proofErr w:type="spellEnd"/>
+      <w:r>
+        <w:rPr>
+          <w:b/>
+          <w:bCs/>
+        </w:rPr>
+        <w:t xml:space="preserve"> Not Spam</w:t>
       </w:r>
       <w:r>
         <w:t xml:space="preserve"> by randomly selecting 2 emails:</w:t>
@@ -1283,7 +1529,15 @@
         </w:numPr>
       </w:pPr>
       <w:r>
-        <w:t>Not Spam after downsampling: Email3, Email7</w:t>
+        <w:t xml:space="preserve">Not Spam after </w:t>
+      </w:r>
+      <w:proofErr w:type="spellStart"/>
+      <w:r>
+        <w:t>downsampling</w:t>
+      </w:r>
+      <w:proofErr w:type="spellEnd"/>
+      <w:r>
+        <w:t>: Email3, Email7</w:t>
       </w:r>
     </w:p>
     <w:p>
@@ -1347,7 +1601,27 @@
           <w:sz w:val="28"/>
           <w:szCs w:val="28"/>
         </w:rPr>
-        <w:t>8. What is data leakage and how we can found it?</w:t>
+        <w:t xml:space="preserve">8. What is data leakage and how we can </w:t>
+      </w:r>
+      <w:proofErr w:type="gramStart"/>
+      <w:r>
+        <w:rPr>
+          <w:b/>
+          <w:bCs/>
+          <w:sz w:val="28"/>
+          <w:szCs w:val="28"/>
+        </w:rPr>
+        <w:t>found</w:t>
+      </w:r>
+      <w:proofErr w:type="gramEnd"/>
+      <w:r>
+        <w:rPr>
+          <w:b/>
+          <w:bCs/>
+          <w:sz w:val="28"/>
+          <w:szCs w:val="28"/>
+        </w:rPr>
+        <w:t xml:space="preserve"> it?</w:t>
       </w:r>
     </w:p>
     <w:p>
@@ -1438,7 +1712,15 @@
     </w:p>
     <w:p>
       <w:r>
-        <w:t xml:space="preserve">F1-Score: The harmonic mean of precision and recall, balancing the two metrics. </w:t>
+        <w:t xml:space="preserve">F1-Score: The harmonic </w:t>
+      </w:r>
+      <w:proofErr w:type="gramStart"/>
+      <w:r>
+        <w:t>mean</w:t>
+      </w:r>
+      <w:proofErr w:type="gramEnd"/>
+      <w:r>
+        <w:t xml:space="preserve"> of precision and recall, balancing the two metrics. </w:t>
       </w:r>
     </w:p>
     <w:p>
@@ -1671,8 +1953,13 @@
       </w:r>
     </w:p>
     <w:p>
-      <w:r>
-        <w:t xml:space="preserve">max_depth: Sometimes the larger depth of the tree can create overfitting. To overcome it, the depth should be limited. </w:t>
+      <w:proofErr w:type="spellStart"/>
+      <w:r>
+        <w:t>max_depth</w:t>
+      </w:r>
+      <w:proofErr w:type="spellEnd"/>
+      <w:r>
+        <w:t xml:space="preserve">: Sometimes the larger depth of the tree can create overfitting. To overcome it, the depth should be limited. </w:t>
       </w:r>
     </w:p>
     <w:p>
@@ -1684,12 +1971,20 @@
       </w:r>
     </w:p>
     <w:p>
-      <w:r>
-        <w:t>max_leaf_nodes: It helps the model to control the splitting of the nodes and in turn, the depth of the model is also restricted</w:t>
-      </w:r>
-    </w:p>
-    <w:p>
-      <w:r>
+      <w:proofErr w:type="spellStart"/>
+      <w:r>
+        <w:t>max_leaf_nodes</w:t>
+      </w:r>
+      <w:proofErr w:type="spellEnd"/>
+      <w:r>
+        <w:t>: It helps the model to control the splitting of the nodes and in turn, the depth of the model is also restricted</w:t>
+      </w:r>
+    </w:p>
+    <w:p>
+      <w:r>
+        <w:rPr>
+          <w:noProof/>
+        </w:rPr>
         <w:drawing>
           <wp:inline distT="0" distB="0" distL="0" distR="0" wp14:anchorId="72C4E698" wp14:editId="03A2F4C0">
             <wp:extent cx="4648200" cy="1585105"/>
@@ -1729,6 +2024,9 @@
     </w:p>
     <w:p>
       <w:r>
+        <w:rPr>
+          <w:noProof/>
+        </w:rPr>
         <w:drawing>
           <wp:inline distT="0" distB="0" distL="0" distR="0" wp14:anchorId="507CF6EA" wp14:editId="2DBF01BE">
             <wp:extent cx="4206240" cy="3294043"/>
@@ -1764,6 +2062,241 @@
             </a:graphic>
           </wp:inline>
         </w:drawing>
+      </w:r>
+    </w:p>
+    <w:p/>
+    <w:p>
+      <w:pPr>
+        <w:rPr>
+          <w:b/>
+          <w:bCs/>
+          <w:sz w:val="28"/>
+          <w:szCs w:val="28"/>
+        </w:rPr>
+      </w:pPr>
+      <w:r>
+        <w:rPr>
+          <w:b/>
+          <w:bCs/>
+          <w:sz w:val="28"/>
+          <w:szCs w:val="28"/>
+        </w:rPr>
+        <w:t xml:space="preserve">12. What is the bias-variance </w:t>
+      </w:r>
+      <w:proofErr w:type="spellStart"/>
+      <w:r>
+        <w:rPr>
+          <w:b/>
+          <w:bCs/>
+          <w:sz w:val="28"/>
+          <w:szCs w:val="28"/>
+        </w:rPr>
+        <w:t>tradeoff</w:t>
+      </w:r>
+      <w:proofErr w:type="spellEnd"/>
+      <w:r>
+        <w:rPr>
+          <w:b/>
+          <w:bCs/>
+          <w:sz w:val="28"/>
+          <w:szCs w:val="28"/>
+        </w:rPr>
+        <w:t>?</w:t>
+      </w:r>
+    </w:p>
+    <w:p>
+      <w:r>
+        <w:t xml:space="preserve">First, let’s understand what is bias and variance: </w:t>
+      </w:r>
+    </w:p>
+    <w:p>
+      <w:r>
+        <w:rPr>
+          <w:b/>
+          <w:bCs/>
+        </w:rPr>
+        <w:t>Bias</w:t>
+      </w:r>
+      <w:r>
+        <w:t xml:space="preserve"> refers to the </w:t>
+      </w:r>
+      <w:r>
+        <w:rPr>
+          <w:b/>
+          <w:bCs/>
+        </w:rPr>
+        <w:t>difference between the actual values and the predicted values</w:t>
+      </w:r>
+      <w:r>
+        <w:t xml:space="preserve"> by the model. </w:t>
+      </w:r>
+      <w:r>
+        <w:rPr>
+          <w:b/>
+          <w:bCs/>
+        </w:rPr>
+        <w:t xml:space="preserve">Low bias </w:t>
+      </w:r>
+      <w:r>
+        <w:t xml:space="preserve">means the model </w:t>
+      </w:r>
+      <w:r>
+        <w:rPr>
+          <w:b/>
+          <w:bCs/>
+        </w:rPr>
+        <w:t>has learned the pattern</w:t>
+      </w:r>
+      <w:r>
+        <w:t xml:space="preserve"> in the data and </w:t>
+      </w:r>
+      <w:r>
+        <w:rPr>
+          <w:b/>
+          <w:bCs/>
+        </w:rPr>
+        <w:t>high bias</w:t>
+      </w:r>
+      <w:r>
+        <w:t xml:space="preserve"> means the model is </w:t>
+      </w:r>
+      <w:r>
+        <w:rPr>
+          <w:b/>
+          <w:bCs/>
+        </w:rPr>
+        <w:t xml:space="preserve">unable to learn the patterns </w:t>
+      </w:r>
+      <w:r>
+        <w:t xml:space="preserve">present in the data </w:t>
+      </w:r>
+      <w:proofErr w:type="spellStart"/>
+      <w:r>
+        <w:t>i.e</w:t>
+      </w:r>
+      <w:proofErr w:type="spellEnd"/>
+      <w:r>
+        <w:t xml:space="preserve"> the underfitting. </w:t>
+      </w:r>
+    </w:p>
+    <w:p>
+      <w:r>
+        <w:rPr>
+          <w:b/>
+          <w:bCs/>
+        </w:rPr>
+        <w:lastRenderedPageBreak/>
+        <w:t>Variance</w:t>
+      </w:r>
+      <w:r>
+        <w:t xml:space="preserve"> refers to the </w:t>
+      </w:r>
+      <w:r>
+        <w:rPr>
+          <w:b/>
+          <w:bCs/>
+        </w:rPr>
+        <w:t xml:space="preserve">change in accuracy of the model’s prediction </w:t>
+      </w:r>
+      <w:r>
+        <w:t xml:space="preserve">on which the </w:t>
+      </w:r>
+      <w:r>
+        <w:rPr>
+          <w:b/>
+          <w:bCs/>
+        </w:rPr>
+        <w:t>model has not been trained.</w:t>
+      </w:r>
+      <w:r>
+        <w:t xml:space="preserve"> </w:t>
+      </w:r>
+      <w:r>
+        <w:rPr>
+          <w:b/>
+          <w:bCs/>
+        </w:rPr>
+        <w:t>Low variance</w:t>
+      </w:r>
+      <w:r>
+        <w:t xml:space="preserve"> is a </w:t>
+      </w:r>
+      <w:r>
+        <w:rPr>
+          <w:b/>
+          <w:bCs/>
+        </w:rPr>
+        <w:t>good case</w:t>
+      </w:r>
+      <w:r>
+        <w:t xml:space="preserve"> but </w:t>
+      </w:r>
+      <w:r>
+        <w:rPr>
+          <w:b/>
+          <w:bCs/>
+        </w:rPr>
+        <w:t>high variance</w:t>
+      </w:r>
+      <w:r>
+        <w:t xml:space="preserve"> means that the </w:t>
+      </w:r>
+      <w:r>
+        <w:rPr>
+          <w:b/>
+          <w:bCs/>
+        </w:rPr>
+        <w:t>performance of the training data and the validation data vary a lot.</w:t>
+      </w:r>
+      <w:r>
+        <w:t xml:space="preserve"> If the </w:t>
+      </w:r>
+      <w:r>
+        <w:rPr>
+          <w:b/>
+          <w:bCs/>
+        </w:rPr>
+        <w:t xml:space="preserve">bias is too low </w:t>
+      </w:r>
+      <w:r>
+        <w:t xml:space="preserve">but the </w:t>
+      </w:r>
+      <w:r>
+        <w:rPr>
+          <w:b/>
+          <w:bCs/>
+        </w:rPr>
+        <w:t>variance is too high</w:t>
+      </w:r>
+      <w:r>
+        <w:t xml:space="preserve"> then that case is known as</w:t>
+      </w:r>
+      <w:r>
+        <w:rPr>
+          <w:b/>
+          <w:bCs/>
+        </w:rPr>
+        <w:t xml:space="preserve"> overfitting</w:t>
+      </w:r>
+      <w:r>
+        <w:t xml:space="preserve">. So, finding a </w:t>
+      </w:r>
+      <w:r>
+        <w:rPr>
+          <w:b/>
+          <w:bCs/>
+        </w:rPr>
+        <w:t>balance between these two situations</w:t>
+      </w:r>
+      <w:r>
+        <w:t xml:space="preserve"> is known as the</w:t>
+      </w:r>
+      <w:r>
+        <w:rPr>
+          <w:b/>
+          <w:bCs/>
+        </w:rPr>
+        <w:t xml:space="preserve"> bias-variance trade-off</w:t>
       </w:r>
     </w:p>
     <w:p/>

</xml_diff>

<commit_message>
Is it necessary to train and test have always 80:20 ratio?
</commit_message>
<xml_diff>
--- a/ML_Interview_questions.docx
+++ b/ML_Interview_questions.docx
@@ -1712,15 +1712,7 @@
     </w:p>
     <w:p>
       <w:r>
-        <w:t xml:space="preserve">F1-Score: The harmonic </w:t>
-      </w:r>
-      <w:proofErr w:type="gramStart"/>
-      <w:r>
-        <w:t>mean</w:t>
-      </w:r>
-      <w:proofErr w:type="gramEnd"/>
-      <w:r>
-        <w:t xml:space="preserve"> of precision and recall, balancing the two metrics. </w:t>
+        <w:t xml:space="preserve">F1-Score: The harmonic mean of precision and recall, balancing the two metrics. </w:t>
       </w:r>
     </w:p>
     <w:p>
@@ -2180,6 +2172,12 @@
       </w:r>
     </w:p>
     <w:p>
+      <w:pPr>
+        <w:rPr>
+          <w:b/>
+          <w:bCs/>
+        </w:rPr>
+      </w:pPr>
       <w:r>
         <w:rPr>
           <w:b/>
@@ -2297,6 +2295,44 @@
           <w:bCs/>
         </w:rPr>
         <w:t xml:space="preserve"> bias-variance trade-off</w:t>
+      </w:r>
+    </w:p>
+    <w:p/>
+    <w:p>
+      <w:pPr>
+        <w:rPr>
+          <w:sz w:val="28"/>
+          <w:szCs w:val="28"/>
+        </w:rPr>
+      </w:pPr>
+      <w:r>
+        <w:rPr>
+          <w:b/>
+          <w:bCs/>
+          <w:sz w:val="28"/>
+          <w:szCs w:val="28"/>
+        </w:rPr>
+        <w:t>13. Is it always necessary to use an 80:20 ratio for the train test split?</w:t>
+      </w:r>
+      <w:r>
+        <w:rPr>
+          <w:sz w:val="28"/>
+          <w:szCs w:val="28"/>
+        </w:rPr>
+        <w:t xml:space="preserve"> </w:t>
+      </w:r>
+    </w:p>
+    <w:p>
+      <w:r>
+        <w:t xml:space="preserve">No, there is no such necessary condition that the data must be split into 80:20 ratio. The main purpose of the splitting is to have some data which the model has not seen previously so, that we can evaluate the performance of the model. If the dataset contains let’s say 50,000 rows of </w:t>
+      </w:r>
+      <w:proofErr w:type="gramStart"/>
+      <w:r>
+        <w:t>data</w:t>
+      </w:r>
+      <w:proofErr w:type="gramEnd"/>
+      <w:r>
+        <w:t xml:space="preserve"> then only 1000 or maybe 2000 rows of data is enough to evaluate the model’s performance.</w:t>
       </w:r>
     </w:p>
     <w:p/>

</xml_diff>

<commit_message>
What is principal componant analysis
</commit_message>
<xml_diff>
--- a/ML_Interview_questions.docx
+++ b/ML_Interview_questions.docx
@@ -2333,6 +2333,39 @@
       <w:proofErr w:type="gramEnd"/>
       <w:r>
         <w:t xml:space="preserve"> then only 1000 or maybe 2000 rows of data is enough to evaluate the model’s performance.</w:t>
+      </w:r>
+    </w:p>
+    <w:p/>
+    <w:p>
+      <w:pPr>
+        <w:rPr>
+          <w:b/>
+          <w:bCs/>
+          <w:sz w:val="28"/>
+          <w:szCs w:val="28"/>
+        </w:rPr>
+      </w:pPr>
+      <w:r>
+        <w:rPr>
+          <w:b/>
+          <w:bCs/>
+          <w:sz w:val="28"/>
+          <w:szCs w:val="28"/>
+        </w:rPr>
+        <w:t>14. What is PCA?</w:t>
+      </w:r>
+    </w:p>
+    <w:p>
+      <w:r>
+        <w:t xml:space="preserve">Principal Component Analysis (PCA) is an unsupervised machine learning technique used for dimensionality reduction. It reduces the number of features in a dataset while preserving most of its variance—often around 95%. This helps simplify the data, making it easier to visualize, </w:t>
+      </w:r>
+      <w:proofErr w:type="spellStart"/>
+      <w:r>
+        <w:t>analyze</w:t>
+      </w:r>
+      <w:proofErr w:type="spellEnd"/>
+      <w:r>
+        <w:t>, or use in other algorithms. PCA is especially useful for high-dimensional data and is commonly applied in tasks like image compression and data visualization.</w:t>
       </w:r>
     </w:p>
     <w:p/>

</xml_diff>

<commit_message>
What is One short learning
</commit_message>
<xml_diff>
--- a/ML_Interview_questions.docx
+++ b/ML_Interview_questions.docx
@@ -2073,9 +2073,9 @@
           <w:sz w:val="28"/>
           <w:szCs w:val="28"/>
         </w:rPr>
-        <w:t xml:space="preserve">12. What is the bias-variance </w:t>
-      </w:r>
-      <w:proofErr w:type="spellStart"/>
+        <w:t xml:space="preserve">12. </w:t>
+      </w:r>
+      <w:bookmarkStart w:id="0" w:name="_Hlk198054920"/>
       <w:r>
         <w:rPr>
           <w:b/>
@@ -2083,9 +2083,9 @@
           <w:sz w:val="28"/>
           <w:szCs w:val="28"/>
         </w:rPr>
-        <w:t>tradeoff</w:t>
-      </w:r>
-      <w:proofErr w:type="spellEnd"/>
+        <w:t xml:space="preserve">What is the bias-variance </w:t>
+      </w:r>
+      <w:proofErr w:type="spellStart"/>
       <w:r>
         <w:rPr>
           <w:b/>
@@ -2093,6 +2093,16 @@
           <w:sz w:val="28"/>
           <w:szCs w:val="28"/>
         </w:rPr>
+        <w:t>tradeoff</w:t>
+      </w:r>
+      <w:proofErr w:type="spellEnd"/>
+      <w:r>
+        <w:rPr>
+          <w:b/>
+          <w:bCs/>
+          <w:sz w:val="28"/>
+          <w:szCs w:val="28"/>
+        </w:rPr>
         <w:t>?</w:t>
       </w:r>
     </w:p>
@@ -2169,6 +2179,16 @@
       <w:proofErr w:type="spellEnd"/>
       <w:r>
         <w:t xml:space="preserve"> the underfitting. </w:t>
+      </w:r>
+      <w:r>
+        <w:t xml:space="preserve">It will </w:t>
+      </w:r>
+      <w:r>
+        <w:rPr>
+          <w:b/>
+          <w:bCs/>
+        </w:rPr>
+        <w:t>occur training dataset</w:t>
       </w:r>
     </w:p>
     <w:p>
@@ -2210,6 +2230,28 @@
         <w:t xml:space="preserve"> </w:t>
       </w:r>
       <w:r>
+        <w:t xml:space="preserve">Variance is </w:t>
+      </w:r>
+      <w:proofErr w:type="gramStart"/>
+      <w:r>
+        <w:rPr>
+          <w:b/>
+          <w:bCs/>
+        </w:rPr>
+        <w:t>occur</w:t>
+      </w:r>
+      <w:proofErr w:type="gramEnd"/>
+      <w:r>
+        <w:rPr>
+          <w:b/>
+          <w:bCs/>
+        </w:rPr>
+        <w:t xml:space="preserve"> on test data</w:t>
+      </w:r>
+      <w:r>
+        <w:t xml:space="preserve">, </w:t>
+      </w:r>
+      <w:r>
         <w:rPr>
           <w:b/>
           <w:bCs/>
@@ -2296,6 +2338,31 @@
         </w:rPr>
         <w:t xml:space="preserve"> bias-variance trade-off</w:t>
       </w:r>
+      <w:r>
+        <w:rPr>
+          <w:b/>
+          <w:bCs/>
+        </w:rPr>
+        <w:t>.</w:t>
+      </w:r>
+    </w:p>
+    <w:p>
+      <w:r>
+        <w:rPr>
+          <w:b/>
+          <w:bCs/>
+        </w:rPr>
+        <w:t xml:space="preserve">NOTE: </w:t>
+      </w:r>
+      <w:r>
+        <w:t>If Bias increases then variance decrease</w:t>
+      </w:r>
+    </w:p>
+    <w:p>
+      <w:r>
+        <w:t xml:space="preserve">            If Variance increases then bias decrease</w:t>
+      </w:r>
+      <w:bookmarkEnd w:id="0"/>
     </w:p>
     <w:p/>
     <w:p>
@@ -2366,6 +2433,30 @@
       <w:proofErr w:type="spellEnd"/>
       <w:r>
         <w:t>, or use in other algorithms. PCA is especially useful for high-dimensional data and is commonly applied in tasks like image compression and data visualization.</w:t>
+      </w:r>
+    </w:p>
+    <w:p>
+      <w:pPr>
+        <w:rPr>
+          <w:b/>
+          <w:bCs/>
+          <w:sz w:val="28"/>
+          <w:szCs w:val="28"/>
+        </w:rPr>
+      </w:pPr>
+      <w:r>
+        <w:rPr>
+          <w:b/>
+          <w:bCs/>
+          <w:sz w:val="28"/>
+          <w:szCs w:val="28"/>
+        </w:rPr>
+        <w:t xml:space="preserve">15. What is one-shot learning? </w:t>
+      </w:r>
+    </w:p>
+    <w:p>
+      <w:r>
+        <w:t>One-shot learning is a concept in machine learning where the model is trained to recognize the patterns in datasets from a single example instead of training on large datasets. This is useful when we haven’t large datasets. It is applied to find the similarity and dissimilarities between the two images.</w:t>
       </w:r>
     </w:p>
     <w:p/>

</xml_diff>

<commit_message>
What is the difference between Manhattan Distance and Euclidean distance?
</commit_message>
<xml_diff>
--- a/ML_Interview_questions.docx
+++ b/ML_Interview_questions.docx
@@ -2457,6 +2457,172 @@
     <w:p>
       <w:r>
         <w:t>One-shot learning is a concept in machine learning where the model is trained to recognize the patterns in datasets from a single example instead of training on large datasets. This is useful when we haven’t large datasets. It is applied to find the similarity and dissimilarities between the two images.</w:t>
+      </w:r>
+    </w:p>
+    <w:p>
+      <w:pPr>
+        <w:rPr>
+          <w:b/>
+          <w:bCs/>
+          <w:sz w:val="28"/>
+          <w:szCs w:val="28"/>
+        </w:rPr>
+      </w:pPr>
+      <w:r>
+        <w:rPr>
+          <w:b/>
+          <w:bCs/>
+          <w:sz w:val="28"/>
+          <w:szCs w:val="28"/>
+        </w:rPr>
+        <w:t xml:space="preserve">16. What is the difference between Manhattan Distance and Euclidean distance? </w:t>
+      </w:r>
+    </w:p>
+    <w:p>
+      <w:r>
+        <w:t xml:space="preserve">Both Manhattan Distance and Euclidean distance are two distance measurement techniques.  </w:t>
+      </w:r>
+      <w:r>
+        <w:rPr>
+          <w:b/>
+          <w:bCs/>
+        </w:rPr>
+        <w:t>Manhattan Distance (MD)</w:t>
+      </w:r>
+      <w:r>
+        <w:t xml:space="preserve"> is calculated as the </w:t>
+      </w:r>
+      <w:r>
+        <w:rPr>
+          <w:b/>
+          <w:bCs/>
+        </w:rPr>
+        <w:t>sum of absolute differences between the coordinates of two points</w:t>
+      </w:r>
+      <w:r>
+        <w:t xml:space="preserve"> along each dimension.  </w:t>
+      </w:r>
+    </w:p>
+    <w:p>
+      <w:r>
+        <w:t xml:space="preserve">MD= x–x + </w:t>
+      </w:r>
+      <w:r>
+        <w:rPr>
+          <w:rFonts w:ascii="Cambria Math" w:hAnsi="Cambria Math" w:cs="Cambria Math"/>
+        </w:rPr>
+        <w:t>∣</w:t>
+      </w:r>
+      <w:r>
+        <w:t xml:space="preserve"> 1 2</w:t>
+      </w:r>
+      <w:r>
+        <w:rPr>
+          <w:rFonts w:ascii="Cambria Math" w:hAnsi="Cambria Math" w:cs="Cambria Math"/>
+        </w:rPr>
+        <w:t>∣</w:t>
+      </w:r>
+      <w:r>
+        <w:rPr>
+          <w:rFonts w:ascii="Calibri" w:hAnsi="Calibri" w:cs="Calibri"/>
+        </w:rPr>
+        <w:t> </w:t>
+      </w:r>
+      <w:r>
+        <w:t xml:space="preserve">y </w:t>
+      </w:r>
+      <w:r>
+        <w:rPr>
+          <w:rFonts w:ascii="Calibri" w:hAnsi="Calibri" w:cs="Calibri"/>
+        </w:rPr>
+        <w:t>−</w:t>
+      </w:r>
+      <w:r>
+        <w:t xml:space="preserve">y </w:t>
+      </w:r>
+      <w:r>
+        <w:rPr>
+          <w:rFonts w:ascii="Cambria Math" w:hAnsi="Cambria Math" w:cs="Cambria Math"/>
+        </w:rPr>
+        <w:t>∣</w:t>
+      </w:r>
+      <w:r>
+        <w:t xml:space="preserve"> 1 2 </w:t>
+      </w:r>
+      <w:r>
+        <w:rPr>
+          <w:rFonts w:ascii="Cambria Math" w:hAnsi="Cambria Math" w:cs="Cambria Math"/>
+        </w:rPr>
+        <w:t>∣</w:t>
+      </w:r>
+      <w:r>
+        <w:t xml:space="preserve"> </w:t>
+      </w:r>
+    </w:p>
+    <w:p>
+      <w:r>
+        <w:rPr>
+          <w:b/>
+          <w:bCs/>
+        </w:rPr>
+        <w:t>Euclidean Distance (ED)</w:t>
+      </w:r>
+      <w:r>
+        <w:t xml:space="preserve"> is calculated as the </w:t>
+      </w:r>
+      <w:r>
+        <w:rPr>
+          <w:b/>
+          <w:bCs/>
+        </w:rPr>
+        <w:t>square root of the sum of squared differences between the coordinates of two points</w:t>
+      </w:r>
+      <w:r>
+        <w:t xml:space="preserve"> along each dimension. </w:t>
+      </w:r>
+    </w:p>
+    <w:p>
+      <w:r>
+        <w:t>ED= x</w:t>
+      </w:r>
+      <w:r>
+        <w:rPr>
+          <w:rFonts w:ascii="Calibri" w:hAnsi="Calibri" w:cs="Calibri"/>
+        </w:rPr>
+        <w:t>–</w:t>
+      </w:r>
+      <w:r>
+        <w:t xml:space="preserve">x + y </w:t>
+      </w:r>
+      <w:r>
+        <w:rPr>
+          <w:rFonts w:ascii="Calibri" w:hAnsi="Calibri" w:cs="Calibri"/>
+        </w:rPr>
+        <w:t>−</w:t>
+      </w:r>
+      <w:r>
+        <w:t xml:space="preserve">y </w:t>
+      </w:r>
+      <w:proofErr w:type="gramStart"/>
+      <w:r>
+        <w:t>( 1</w:t>
+      </w:r>
+      <w:proofErr w:type="gramEnd"/>
+      <w:r>
+        <w:t xml:space="preserve"> 2)2 </w:t>
+      </w:r>
+      <w:proofErr w:type="gramStart"/>
+      <w:r>
+        <w:t>( 1</w:t>
+      </w:r>
+      <w:proofErr w:type="gramEnd"/>
+      <w:r>
+        <w:t xml:space="preserve"> 2)2 </w:t>
+      </w:r>
+    </w:p>
+    <w:p>
+      <w:r>
+        <w:t>Generally, these two metrics are used to evaluate the effectiveness of the clusters formed by a clustering algorithm.</w:t>
       </w:r>
     </w:p>
     <w:p/>

</xml_diff>

<commit_message>
Difference between one hot and ordinal encoding
</commit_message>
<xml_diff>
--- a/ML_Interview_questions.docx
+++ b/ML_Interview_questions.docx
@@ -364,7 +364,15 @@
         <w:t>Example</w:t>
       </w:r>
       <w:r>
-        <w:t>: If a model learns weights [2, -3, 0.5], L1 would penalize |2| + |-3| + |0.5| = 5.5, while L2 would penalize 2² + (-3)² + 0.5² = 13.25.</w:t>
+        <w:t>: If a model learns weights [2, -3, 0.5], L1 would penalize |2| + |-3| + |0.5| = 5.5, while L2 would penalize 2² + (-</w:t>
+      </w:r>
+      <w:proofErr w:type="gramStart"/>
+      <w:r>
+        <w:t>3)²</w:t>
+      </w:r>
+      <w:proofErr w:type="gramEnd"/>
+      <w:r>
+        <w:t xml:space="preserve"> + 0.5² = 13.25.</w:t>
       </w:r>
     </w:p>
     <w:p/>
@@ -465,6 +473,7 @@
       <w:r>
         <w:t xml:space="preserve">A </w:t>
       </w:r>
+      <w:proofErr w:type="gramStart"/>
       <w:r>
         <w:rPr>
           <w:b/>
@@ -472,9 +481,11 @@
         </w:rPr>
         <w:t>local minima</w:t>
       </w:r>
+      <w:proofErr w:type="gramEnd"/>
       <w:r>
         <w:t xml:space="preserve"> is a point where a function’s value is lower than nearby points, while a </w:t>
       </w:r>
+      <w:proofErr w:type="gramStart"/>
       <w:r>
         <w:rPr>
           <w:b/>
@@ -482,6 +493,7 @@
         </w:rPr>
         <w:t>global minima</w:t>
       </w:r>
+      <w:proofErr w:type="gramEnd"/>
       <w:r>
         <w:t xml:space="preserve"> is the absolute lowest point across the entire function.</w:t>
       </w:r>
@@ -583,11 +595,24 @@
     </w:p>
     <w:p>
       <w:r>
-        <w:t xml:space="preserve">And also we can’t use linear regression loss function on classification, </w:t>
-      </w:r>
-      <w:r>
-        <w:t>because means square error only finds the distance between predicted data points and correct data points in continuous value manner(</w:t>
-      </w:r>
+        <w:t xml:space="preserve">And </w:t>
+      </w:r>
+      <w:proofErr w:type="gramStart"/>
+      <w:r>
+        <w:t>also</w:t>
+      </w:r>
+      <w:proofErr w:type="gramEnd"/>
+      <w:r>
+        <w:t xml:space="preserve"> we can’t use linear regression loss function on classification, </w:t>
+      </w:r>
+      <w:r>
+        <w:t xml:space="preserve">because means square error only finds the distance between predicted data points and correct data points in continuous value </w:t>
+      </w:r>
+      <w:proofErr w:type="gramStart"/>
+      <w:r>
+        <w:t>manner(</w:t>
+      </w:r>
+      <w:proofErr w:type="gramEnd"/>
       <w:r>
         <w:t>2.5, 3.7, etc.)</w:t>
       </w:r>
@@ -611,7 +636,15 @@
         <w:t>, following is the formula for cross entropy which will gives values from 0 or 1</w:t>
       </w:r>
       <w:r>
-        <w:t xml:space="preserve"> when we put 0 or 1 values to yi.</w:t>
+        <w:t xml:space="preserve"> when we put 0 or 1 values to </w:t>
+      </w:r>
+      <w:proofErr w:type="spellStart"/>
+      <w:r>
+        <w:t>yi</w:t>
+      </w:r>
+      <w:proofErr w:type="spellEnd"/>
+      <w:r>
+        <w:t>.</w:t>
       </w:r>
     </w:p>
     <w:p>
@@ -731,7 +764,23 @@
           <w:b/>
           <w:bCs/>
         </w:rPr>
-        <w:t xml:space="preserve">ratio between the true positives(TP) and all the positive examples (TP+FP) </w:t>
+        <w:t xml:space="preserve">ratio between the true </w:t>
+      </w:r>
+      <w:proofErr w:type="gramStart"/>
+      <w:r>
+        <w:rPr>
+          <w:b/>
+          <w:bCs/>
+        </w:rPr>
+        <w:t>positives(</w:t>
+      </w:r>
+      <w:proofErr w:type="gramEnd"/>
+      <w:r>
+        <w:rPr>
+          <w:b/>
+          <w:bCs/>
+        </w:rPr>
+        <w:t xml:space="preserve">TP) and all the positive examples (TP+FP) </w:t>
       </w:r>
       <w:r>
         <w:t xml:space="preserve">predicted by the model. In other words, precision measures how many of the predicted positive examples are </w:t>
@@ -835,13 +884,54 @@
           <w:sz w:val="28"/>
           <w:szCs w:val="28"/>
         </w:rPr>
-        <w:t>7. What is the difference between upsampling and downsampling?</w:t>
+        <w:t xml:space="preserve">7. What is the difference between </w:t>
+      </w:r>
+      <w:proofErr w:type="spellStart"/>
+      <w:r>
+        <w:rPr>
+          <w:b/>
+          <w:bCs/>
+          <w:sz w:val="28"/>
+          <w:szCs w:val="28"/>
+        </w:rPr>
+        <w:t>upsampling</w:t>
+      </w:r>
+      <w:proofErr w:type="spellEnd"/>
+      <w:r>
+        <w:rPr>
+          <w:b/>
+          <w:bCs/>
+          <w:sz w:val="28"/>
+          <w:szCs w:val="28"/>
+        </w:rPr>
+        <w:t xml:space="preserve"> and </w:t>
+      </w:r>
+      <w:proofErr w:type="spellStart"/>
+      <w:r>
+        <w:rPr>
+          <w:b/>
+          <w:bCs/>
+          <w:sz w:val="28"/>
+          <w:szCs w:val="28"/>
+        </w:rPr>
+        <w:t>downsampling</w:t>
+      </w:r>
+      <w:proofErr w:type="spellEnd"/>
+      <w:r>
+        <w:rPr>
+          <w:b/>
+          <w:bCs/>
+          <w:sz w:val="28"/>
+          <w:szCs w:val="28"/>
+        </w:rPr>
+        <w:t>?</w:t>
       </w:r>
     </w:p>
     <w:p>
       <w:r>
         <w:t xml:space="preserve"> In </w:t>
       </w:r>
+      <w:proofErr w:type="spellStart"/>
       <w:r>
         <w:rPr>
           <w:b/>
@@ -849,6 +939,7 @@
         </w:rPr>
         <w:t>upsampling</w:t>
       </w:r>
+      <w:proofErr w:type="spellEnd"/>
       <w:r>
         <w:t xml:space="preserve"> method, we </w:t>
       </w:r>
@@ -880,7 +971,15 @@
         <w:t>dataset gets balanced for each class</w:t>
       </w:r>
       <w:r>
-        <w:t xml:space="preserve">. But, here is a </w:t>
+        <w:t xml:space="preserve">. </w:t>
+      </w:r>
+      <w:proofErr w:type="gramStart"/>
+      <w:r>
+        <w:t>But,</w:t>
+      </w:r>
+      <w:proofErr w:type="gramEnd"/>
+      <w:r>
+        <w:t xml:space="preserve"> here is a </w:t>
       </w:r>
       <w:r>
         <w:rPr>
@@ -907,6 +1006,7 @@
       <w:r>
         <w:t xml:space="preserve">In </w:t>
       </w:r>
+      <w:proofErr w:type="spellStart"/>
       <w:r>
         <w:rPr>
           <w:b/>
@@ -914,6 +1014,7 @@
         </w:rPr>
         <w:t>downsampling</w:t>
       </w:r>
+      <w:proofErr w:type="spellEnd"/>
       <w:r>
         <w:t xml:space="preserve">, we </w:t>
       </w:r>
@@ -1044,7 +1145,23 @@
           <w:b/>
           <w:bCs/>
         </w:rPr>
-        <w:t xml:space="preserve"> Upsampling Example:</w:t>
+        <w:t xml:space="preserve"> </w:t>
+      </w:r>
+      <w:proofErr w:type="spellStart"/>
+      <w:r>
+        <w:rPr>
+          <w:b/>
+          <w:bCs/>
+        </w:rPr>
+        <w:t>Upsampling</w:t>
+      </w:r>
+      <w:proofErr w:type="spellEnd"/>
+      <w:r>
+        <w:rPr>
+          <w:b/>
+          <w:bCs/>
+        </w:rPr>
+        <w:t xml:space="preserve"> Example:</w:t>
       </w:r>
     </w:p>
     <w:p>
@@ -1092,8 +1209,21 @@
         </w:numPr>
       </w:pPr>
       <w:r>
-        <w:t>Spam: EmailA, EmailB</w:t>
-      </w:r>
+        <w:t xml:space="preserve">Spam: </w:t>
+      </w:r>
+      <w:proofErr w:type="spellStart"/>
+      <w:r>
+        <w:t>EmailA</w:t>
+      </w:r>
+      <w:proofErr w:type="spellEnd"/>
+      <w:r>
+        <w:t xml:space="preserve">, </w:t>
+      </w:r>
+      <w:proofErr w:type="spellStart"/>
+      <w:r>
+        <w:t>EmailB</w:t>
+      </w:r>
+      <w:proofErr w:type="spellEnd"/>
     </w:p>
     <w:p>
       <w:pPr>
@@ -1102,12 +1232,21 @@
           <w:numId w:val="4"/>
         </w:numPr>
       </w:pPr>
-      <w:r>
-        <w:rPr>
-          <w:b/>
-          <w:bCs/>
-        </w:rPr>
-        <w:t>Upsample Spam</w:t>
+      <w:proofErr w:type="spellStart"/>
+      <w:r>
+        <w:rPr>
+          <w:b/>
+          <w:bCs/>
+        </w:rPr>
+        <w:t>Upsample</w:t>
+      </w:r>
+      <w:proofErr w:type="spellEnd"/>
+      <w:r>
+        <w:rPr>
+          <w:b/>
+          <w:bCs/>
+        </w:rPr>
+        <w:t xml:space="preserve"> Spam</w:t>
       </w:r>
       <w:r>
         <w:t xml:space="preserve"> by randomly duplicating samples:</w:t>
@@ -1121,8 +1260,77 @@
         </w:numPr>
       </w:pPr>
       <w:r>
-        <w:t>Spam after upsampling: EmailA, EmailB, EmailA, EmailB, EmailA, EmailB, EmailA, EmailB</w:t>
-      </w:r>
+        <w:t xml:space="preserve">Spam after </w:t>
+      </w:r>
+      <w:proofErr w:type="spellStart"/>
+      <w:r>
+        <w:t>upsampling</w:t>
+      </w:r>
+      <w:proofErr w:type="spellEnd"/>
+      <w:r>
+        <w:t xml:space="preserve">: </w:t>
+      </w:r>
+      <w:proofErr w:type="spellStart"/>
+      <w:r>
+        <w:t>EmailA</w:t>
+      </w:r>
+      <w:proofErr w:type="spellEnd"/>
+      <w:r>
+        <w:t xml:space="preserve">, </w:t>
+      </w:r>
+      <w:proofErr w:type="spellStart"/>
+      <w:r>
+        <w:t>EmailB</w:t>
+      </w:r>
+      <w:proofErr w:type="spellEnd"/>
+      <w:r>
+        <w:t xml:space="preserve">, </w:t>
+      </w:r>
+      <w:proofErr w:type="spellStart"/>
+      <w:r>
+        <w:t>EmailA</w:t>
+      </w:r>
+      <w:proofErr w:type="spellEnd"/>
+      <w:r>
+        <w:t xml:space="preserve">, </w:t>
+      </w:r>
+      <w:proofErr w:type="spellStart"/>
+      <w:r>
+        <w:t>EmailB</w:t>
+      </w:r>
+      <w:proofErr w:type="spellEnd"/>
+      <w:r>
+        <w:t xml:space="preserve">, </w:t>
+      </w:r>
+      <w:proofErr w:type="spellStart"/>
+      <w:r>
+        <w:t>EmailA</w:t>
+      </w:r>
+      <w:proofErr w:type="spellEnd"/>
+      <w:r>
+        <w:t xml:space="preserve">, </w:t>
+      </w:r>
+      <w:proofErr w:type="spellStart"/>
+      <w:r>
+        <w:t>EmailB</w:t>
+      </w:r>
+      <w:proofErr w:type="spellEnd"/>
+      <w:r>
+        <w:t xml:space="preserve">, </w:t>
+      </w:r>
+      <w:proofErr w:type="spellStart"/>
+      <w:r>
+        <w:t>EmailA</w:t>
+      </w:r>
+      <w:proofErr w:type="spellEnd"/>
+      <w:r>
+        <w:t xml:space="preserve">, </w:t>
+      </w:r>
+      <w:proofErr w:type="spellStart"/>
+      <w:r>
+        <w:t>EmailB</w:t>
+      </w:r>
+      <w:proofErr w:type="spellEnd"/>
     </w:p>
     <w:p>
       <w:pPr>
@@ -1196,7 +1404,23 @@
           <w:b/>
           <w:bCs/>
         </w:rPr>
-        <w:t xml:space="preserve"> Downsampling Example:</w:t>
+        <w:t xml:space="preserve"> </w:t>
+      </w:r>
+      <w:proofErr w:type="spellStart"/>
+      <w:r>
+        <w:rPr>
+          <w:b/>
+          <w:bCs/>
+        </w:rPr>
+        <w:t>Downsampling</w:t>
+      </w:r>
+      <w:proofErr w:type="spellEnd"/>
+      <w:r>
+        <w:rPr>
+          <w:b/>
+          <w:bCs/>
+        </w:rPr>
+        <w:t xml:space="preserve"> Example:</w:t>
       </w:r>
     </w:p>
     <w:p>
@@ -1254,8 +1478,21 @@
         </w:numPr>
       </w:pPr>
       <w:r>
-        <w:t>Spam: EmailA, EmailB</w:t>
-      </w:r>
+        <w:t xml:space="preserve">Spam: </w:t>
+      </w:r>
+      <w:proofErr w:type="spellStart"/>
+      <w:r>
+        <w:t>EmailA</w:t>
+      </w:r>
+      <w:proofErr w:type="spellEnd"/>
+      <w:r>
+        <w:t xml:space="preserve">, </w:t>
+      </w:r>
+      <w:proofErr w:type="spellStart"/>
+      <w:r>
+        <w:t>EmailB</w:t>
+      </w:r>
+      <w:proofErr w:type="spellEnd"/>
     </w:p>
     <w:p>
       <w:pPr>
@@ -1264,12 +1501,21 @@
           <w:numId w:val="5"/>
         </w:numPr>
       </w:pPr>
-      <w:r>
-        <w:rPr>
-          <w:b/>
-          <w:bCs/>
-        </w:rPr>
-        <w:t>Downsample Not Spam</w:t>
+      <w:proofErr w:type="spellStart"/>
+      <w:r>
+        <w:rPr>
+          <w:b/>
+          <w:bCs/>
+        </w:rPr>
+        <w:t>Downsample</w:t>
+      </w:r>
+      <w:proofErr w:type="spellEnd"/>
+      <w:r>
+        <w:rPr>
+          <w:b/>
+          <w:bCs/>
+        </w:rPr>
+        <w:t xml:space="preserve"> Not Spam</w:t>
       </w:r>
       <w:r>
         <w:t xml:space="preserve"> by randomly selecting 2 emails:</w:t>
@@ -1283,7 +1529,15 @@
         </w:numPr>
       </w:pPr>
       <w:r>
-        <w:t>Not Spam after downsampling: Email3, Email7</w:t>
+        <w:t xml:space="preserve">Not Spam after </w:t>
+      </w:r>
+      <w:proofErr w:type="spellStart"/>
+      <w:r>
+        <w:t>downsampling</w:t>
+      </w:r>
+      <w:proofErr w:type="spellEnd"/>
+      <w:r>
+        <w:t>: Email3, Email7</w:t>
       </w:r>
     </w:p>
     <w:p>
@@ -1347,7 +1601,27 @@
           <w:sz w:val="28"/>
           <w:szCs w:val="28"/>
         </w:rPr>
-        <w:t>8. What is data leakage and how we can found it?</w:t>
+        <w:t xml:space="preserve">8. What is data leakage and how we can </w:t>
+      </w:r>
+      <w:proofErr w:type="gramStart"/>
+      <w:r>
+        <w:rPr>
+          <w:b/>
+          <w:bCs/>
+          <w:sz w:val="28"/>
+          <w:szCs w:val="28"/>
+        </w:rPr>
+        <w:t>found</w:t>
+      </w:r>
+      <w:proofErr w:type="gramEnd"/>
+      <w:r>
+        <w:rPr>
+          <w:b/>
+          <w:bCs/>
+          <w:sz w:val="28"/>
+          <w:szCs w:val="28"/>
+        </w:rPr>
+        <w:t xml:space="preserve"> it?</w:t>
       </w:r>
     </w:p>
     <w:p>
@@ -1671,8 +1945,13 @@
       </w:r>
     </w:p>
     <w:p>
-      <w:r>
-        <w:t xml:space="preserve">max_depth: Sometimes the larger depth of the tree can create overfitting. To overcome it, the depth should be limited. </w:t>
+      <w:proofErr w:type="spellStart"/>
+      <w:r>
+        <w:t>max_depth</w:t>
+      </w:r>
+      <w:proofErr w:type="spellEnd"/>
+      <w:r>
+        <w:t xml:space="preserve">: Sometimes the larger depth of the tree can create overfitting. To overcome it, the depth should be limited. </w:t>
       </w:r>
     </w:p>
     <w:p>
@@ -1684,8 +1963,13 @@
       </w:r>
     </w:p>
     <w:p>
-      <w:r>
-        <w:t>max_leaf_nodes: It helps the model to control the splitting of the nodes and in turn, the depth of the model is also restricted</w:t>
+      <w:proofErr w:type="spellStart"/>
+      <w:r>
+        <w:t>max_leaf_nodes</w:t>
+      </w:r>
+      <w:proofErr w:type="spellEnd"/>
+      <w:r>
+        <w:t>: It helps the model to control the splitting of the nodes and in turn, the depth of the model is also restricted</w:t>
       </w:r>
     </w:p>
     <w:p>
@@ -1799,7 +2083,27 @@
           <w:sz w:val="28"/>
           <w:szCs w:val="28"/>
         </w:rPr>
-        <w:t>What is the bias-variance tradeoff?</w:t>
+        <w:t xml:space="preserve">What is the bias-variance </w:t>
+      </w:r>
+      <w:proofErr w:type="spellStart"/>
+      <w:r>
+        <w:rPr>
+          <w:b/>
+          <w:bCs/>
+          <w:sz w:val="28"/>
+          <w:szCs w:val="28"/>
+        </w:rPr>
+        <w:t>tradeoff</w:t>
+      </w:r>
+      <w:proofErr w:type="spellEnd"/>
+      <w:r>
+        <w:rPr>
+          <w:b/>
+          <w:bCs/>
+          <w:sz w:val="28"/>
+          <w:szCs w:val="28"/>
+        </w:rPr>
+        <w:t>?</w:t>
       </w:r>
     </w:p>
     <w:p>
@@ -1866,7 +2170,15 @@
         <w:t xml:space="preserve">unable to learn the patterns </w:t>
       </w:r>
       <w:r>
-        <w:t xml:space="preserve">present in the data i.e the underfitting. </w:t>
+        <w:t xml:space="preserve">present in the data </w:t>
+      </w:r>
+      <w:proofErr w:type="spellStart"/>
+      <w:r>
+        <w:t>i.e</w:t>
+      </w:r>
+      <w:proofErr w:type="spellEnd"/>
+      <w:r>
+        <w:t xml:space="preserve"> the underfitting. </w:t>
       </w:r>
       <w:r>
         <w:t xml:space="preserve">It will </w:t>
@@ -1920,12 +2232,21 @@
       <w:r>
         <w:t xml:space="preserve">Variance is </w:t>
       </w:r>
-      <w:r>
-        <w:rPr>
-          <w:b/>
-          <w:bCs/>
-        </w:rPr>
-        <w:t>occur on test data</w:t>
+      <w:proofErr w:type="gramStart"/>
+      <w:r>
+        <w:rPr>
+          <w:b/>
+          <w:bCs/>
+        </w:rPr>
+        <w:t>occur</w:t>
+      </w:r>
+      <w:proofErr w:type="gramEnd"/>
+      <w:r>
+        <w:rPr>
+          <w:b/>
+          <w:bCs/>
+        </w:rPr>
+        <w:t xml:space="preserve"> on test data</w:t>
       </w:r>
       <w:r>
         <w:t xml:space="preserve">, </w:t>
@@ -2070,7 +2391,15 @@
     </w:p>
     <w:p>
       <w:r>
-        <w:t>No, there is no such necessary condition that the data must be split into 80:20 ratio. The main purpose of the splitting is to have some data which the model has not seen previously so, that we can evaluate the performance of the model. If the dataset contains let’s say 50,000 rows of data then only 1000 or maybe 2000 rows of data is enough to evaluate the model’s performance.</w:t>
+        <w:t xml:space="preserve">No, there is no such necessary condition that the data must be split into 80:20 ratio. The main purpose of the splitting is to have some data which the model has not seen previously so, that we can evaluate the performance of the model. If the dataset contains let’s say 50,000 rows of </w:t>
+      </w:r>
+      <w:proofErr w:type="gramStart"/>
+      <w:r>
+        <w:t>data</w:t>
+      </w:r>
+      <w:proofErr w:type="gramEnd"/>
+      <w:r>
+        <w:t xml:space="preserve"> then only 1000 or maybe 2000 rows of data is enough to evaluate the model’s performance.</w:t>
       </w:r>
     </w:p>
     <w:p/>
@@ -2095,7 +2424,15 @@
     </w:p>
     <w:p>
       <w:r>
-        <w:t>Principal Component Analysis (PCA) is an unsupervised machine learning technique used for dimensionality reduction. It reduces the number of features in a dataset while preserving most of its variance—often around 95%. This helps simplify the data, making it easier to visualize, analyze, or use in other algorithms. PCA is especially useful for high-dimensional data and is commonly applied in tasks like image compression and data visualization.</w:t>
+        <w:t xml:space="preserve">Principal Component Analysis (PCA) is an unsupervised machine learning technique used for dimensionality reduction. It reduces the number of features in a dataset while preserving most of its variance—often around 95%. This helps simplify the data, making it easier to visualize, </w:t>
+      </w:r>
+      <w:proofErr w:type="spellStart"/>
+      <w:r>
+        <w:t>analyze</w:t>
+      </w:r>
+      <w:proofErr w:type="spellEnd"/>
+      <w:r>
+        <w:t>, or use in other algorithms. PCA is especially useful for high-dimensional data and is commonly applied in tasks like image compression and data visualization.</w:t>
       </w:r>
     </w:p>
     <w:p>
@@ -2264,7 +2601,23 @@
         <w:t>−</w:t>
       </w:r>
       <w:r>
-        <w:t xml:space="preserve">y ( 1 2)2 ( 1 2)2 </w:t>
+        <w:t xml:space="preserve">y </w:t>
+      </w:r>
+      <w:proofErr w:type="gramStart"/>
+      <w:r>
+        <w:t>( 1</w:t>
+      </w:r>
+      <w:proofErr w:type="gramEnd"/>
+      <w:r>
+        <w:t xml:space="preserve"> 2)2 </w:t>
+      </w:r>
+      <w:proofErr w:type="gramStart"/>
+      <w:r>
+        <w:t>( 1</w:t>
+      </w:r>
+      <w:proofErr w:type="gramEnd"/>
+      <w:r>
+        <w:t xml:space="preserve"> 2)2 </w:t>
       </w:r>
     </w:p>
     <w:p>
@@ -2299,31 +2652,23 @@
           <w:szCs w:val="28"/>
         </w:rPr>
         <w:lastRenderedPageBreak/>
-        <w:t xml:space="preserve">17. </w:t>
-      </w:r>
-      <w:r>
+        <w:t>17. Difference Between AI, ML, and DL</w:t>
+      </w:r>
+    </w:p>
+    <w:p>
+      <w:pPr>
         <w:rPr>
           <w:b/>
           <w:bCs/>
           <w:sz w:val="28"/>
           <w:szCs w:val="28"/>
         </w:rPr>
-        <w:t>Difference Between AI, ML, and DL</w:t>
-      </w:r>
-    </w:p>
-    <w:p>
-      <w:pPr>
-        <w:rPr>
-          <w:b/>
-          <w:bCs/>
-          <w:sz w:val="28"/>
-          <w:szCs w:val="28"/>
-        </w:rPr>
-      </w:pPr>
-      <w:r>
-        <w:rPr>
-          <w:b/>
-          <w:bCs/>
+      </w:pPr>
+      <w:r>
+        <w:rPr>
+          <w:b/>
+          <w:bCs/>
+          <w:noProof/>
           <w:sz w:val="28"/>
           <w:szCs w:val="28"/>
         </w:rPr>
@@ -2377,6 +2722,7 @@
         <w:rPr>
           <w:b/>
           <w:bCs/>
+          <w:noProof/>
           <w:sz w:val="28"/>
           <w:szCs w:val="28"/>
         </w:rPr>
@@ -2430,6 +2776,7 @@
         <w:rPr>
           <w:b/>
           <w:bCs/>
+          <w:noProof/>
           <w:sz w:val="28"/>
           <w:szCs w:val="28"/>
         </w:rPr>
@@ -2470,6 +2817,163 @@
         </w:drawing>
       </w:r>
     </w:p>
+    <w:p>
+      <w:pPr>
+        <w:rPr>
+          <w:b/>
+          <w:bCs/>
+          <w:sz w:val="28"/>
+          <w:szCs w:val="28"/>
+        </w:rPr>
+      </w:pPr>
+      <w:r>
+        <w:rPr>
+          <w:b/>
+          <w:bCs/>
+          <w:sz w:val="28"/>
+          <w:szCs w:val="28"/>
+        </w:rPr>
+        <w:t>18. Difference between One Hot Encoding and Ordinal Encoding</w:t>
+      </w:r>
+    </w:p>
+    <w:p>
+      <w:r>
+        <w:t>Both one</w:t>
+      </w:r>
+      <w:r>
+        <w:noBreakHyphen/>
+        <w:t>hot encoding and ordinal encoding transform categorical features into numbers, but they serve different situations:</w:t>
+      </w:r>
+    </w:p>
+    <w:p>
+      <w:pPr>
+        <w:numPr>
+          <w:ilvl w:val="0"/>
+          <w:numId w:val="6"/>
+        </w:numPr>
+      </w:pPr>
+      <w:r>
+        <w:rPr>
+          <w:b/>
+          <w:bCs/>
+        </w:rPr>
+        <w:t>One</w:t>
+      </w:r>
+      <w:r>
+        <w:rPr>
+          <w:b/>
+          <w:bCs/>
+        </w:rPr>
+        <w:noBreakHyphen/>
+        <w:t>hot encoding</w:t>
+      </w:r>
+    </w:p>
+    <w:p>
+      <w:pPr>
+        <w:numPr>
+          <w:ilvl w:val="1"/>
+          <w:numId w:val="6"/>
+        </w:numPr>
+      </w:pPr>
+      <w:r>
+        <w:t>Creates a separate binary column for every category.</w:t>
+      </w:r>
+    </w:p>
+    <w:p>
+      <w:pPr>
+        <w:numPr>
+          <w:ilvl w:val="1"/>
+          <w:numId w:val="6"/>
+        </w:numPr>
+      </w:pPr>
+      <w:r>
+        <w:t>Each row gets a 1 in the column that matches its category and 0 in all others.</w:t>
+      </w:r>
+    </w:p>
+    <w:p>
+      <w:pPr>
+        <w:numPr>
+          <w:ilvl w:val="1"/>
+          <w:numId w:val="6"/>
+        </w:numPr>
+      </w:pPr>
+      <w:r>
+        <w:t xml:space="preserve">Best for nominal data where the categories have </w:t>
+      </w:r>
+      <w:r>
+        <w:rPr>
+          <w:b/>
+          <w:bCs/>
+        </w:rPr>
+        <w:t>no inherent order</w:t>
+      </w:r>
+      <w:r>
+        <w:t>.</w:t>
+      </w:r>
+    </w:p>
+    <w:p>
+      <w:pPr>
+        <w:numPr>
+          <w:ilvl w:val="0"/>
+          <w:numId w:val="6"/>
+        </w:numPr>
+      </w:pPr>
+      <w:r>
+        <w:rPr>
+          <w:b/>
+          <w:bCs/>
+        </w:rPr>
+        <w:t>Ordinal encoding</w:t>
+      </w:r>
+    </w:p>
+    <w:p>
+      <w:pPr>
+        <w:numPr>
+          <w:ilvl w:val="1"/>
+          <w:numId w:val="6"/>
+        </w:numPr>
+      </w:pPr>
+      <w:r>
+        <w:t>Maps each category to an integer from 0 … n</w:t>
+      </w:r>
+      <w:r>
+        <w:noBreakHyphen/>
+        <w:t>1, reflecting a defined order or rank.</w:t>
+      </w:r>
+    </w:p>
+    <w:p>
+      <w:pPr>
+        <w:numPr>
+          <w:ilvl w:val="1"/>
+          <w:numId w:val="6"/>
+        </w:numPr>
+      </w:pPr>
+      <w:r>
+        <w:t>Produces a single column of ordered numeric labels.</w:t>
+      </w:r>
+    </w:p>
+    <w:p>
+      <w:pPr>
+        <w:numPr>
+          <w:ilvl w:val="1"/>
+          <w:numId w:val="6"/>
+        </w:numPr>
+      </w:pPr>
+      <w:r>
+        <w:t xml:space="preserve">Suitable when the categories have a </w:t>
+      </w:r>
+      <w:r>
+        <w:rPr>
+          <w:b/>
+          <w:bCs/>
+        </w:rPr>
+        <w:t>meaningful order</w:t>
+      </w:r>
+      <w:r>
+        <w:t>.</w:t>
+      </w:r>
+    </w:p>
+    <w:p/>
     <w:p/>
     <w:p/>
     <w:p>
@@ -2492,6 +2996,155 @@
 <file path=word/numbering.xml><?xml version="1.0" encoding="utf-8"?>
 <w:numbering xmlns:wpc="http://schemas.microsoft.com/office/word/2010/wordprocessingCanvas" xmlns:cx="http://schemas.microsoft.com/office/drawing/2014/chartex" xmlns:cx1="http://schemas.microsoft.com/office/drawing/2015/9/8/chartex" xmlns:cx2="http://schemas.microsoft.com/office/drawing/2015/10/21/chartex" xmlns:cx3="http://schemas.microsoft.com/office/drawing/2016/5/9/chartex" xmlns:cx4="http://schemas.microsoft.com/office/drawing/2016/5/10/chartex" xmlns:cx5="http://schemas.microsoft.com/office/drawing/2016/5/11/chartex" xmlns:cx6="http://schemas.microsoft.com/office/drawing/2016/5/12/chartex" xmlns:cx7="http://schemas.microsoft.com/office/drawing/2016/5/13/chartex" xmlns:cx8="http://schemas.microsoft.com/office/drawing/2016/5/14/chartex" xmlns:mc="http://schemas.openxmlformats.org/markup-compatibility/2006" xmlns:aink="http://schemas.microsoft.com/office/drawing/2016/ink" xmlns:am3d="http://schemas.microsoft.com/office/drawing/2017/model3d" xmlns:o="urn:schemas-microsoft-com:office:office" xmlns:oel="http://schemas.microsoft.com/office/2019/extlst" xmlns:r="http://schemas.openxmlformats.org/officeDocument/2006/relationships" xmlns:m="http://schemas.openxmlformats.org/officeDocument/2006/math" xmlns:v="urn:schemas-microsoft-com:vml" xmlns:wp14="http://schemas.microsoft.com/office/word/2010/wordprocessingDrawing" xmlns:wp="http://schemas.openxmlformats.org/drawingml/2006/wordprocessingDrawing" xmlns:w10="urn:schemas-microsoft-com:office:word" xmlns:w="http://schemas.openxmlformats.org/wordprocessingml/2006/main" xmlns:w14="http://schemas.microsoft.com/office/word/2010/wordml" xmlns:w15="http://schemas.microsoft.com/office/word/2012/wordml" xmlns:w16cex="http://schemas.microsoft.com/office/word/2018/wordml/cex" xmlns:w16cid="http://schemas.microsoft.com/office/word/2016/wordml/cid" xmlns:w16="http://schemas.microsoft.com/office/word/2018/wordml" xmlns:w16du="http://schemas.microsoft.com/office/word/2023/wordml/word16du" xmlns:w16sdtdh="http://schemas.microsoft.com/office/word/2020/wordml/sdtdatahash" xmlns:w16sdtfl="http://schemas.microsoft.com/office/word/2024/wordml/sdtformatlock" xmlns:w16se="http://schemas.microsoft.com/office/word/2015/wordml/symex" xmlns:wpg="http://schemas.microsoft.com/office/word/2010/wordprocessingGroup" xmlns:wpi="http://schemas.microsoft.com/office/word/2010/wordprocessingInk" xmlns:wne="http://schemas.microsoft.com/office/word/2006/wordml" xmlns:wps="http://schemas.microsoft.com/office/word/2010/wordprocessingShape" mc:Ignorable="w14 w15 w16se w16cid w16 w16cex w16sdtdh w16sdtfl w16du wp14">
   <w:abstractNum w:abstractNumId="0" w15:restartNumberingAfterBreak="0">
+    <w:nsid w:val="02B047FD"/>
+    <w:multiLevelType w:val="multilevel"/>
+    <w:tmpl w:val="EE6EB668"/>
+    <w:lvl w:ilvl="0">
+      <w:start w:val="1"/>
+      <w:numFmt w:val="bullet"/>
+      <w:lvlText w:val=""/>
+      <w:lvlJc w:val="left"/>
+      <w:pPr>
+        <w:tabs>
+          <w:tab w:val="num" w:pos="720"/>
+        </w:tabs>
+        <w:ind w:left="720" w:hanging="360"/>
+      </w:pPr>
+      <w:rPr>
+        <w:rFonts w:ascii="Symbol" w:hAnsi="Symbol" w:hint="default"/>
+        <w:sz w:val="20"/>
+      </w:rPr>
+    </w:lvl>
+    <w:lvl w:ilvl="1">
+      <w:start w:val="1"/>
+      <w:numFmt w:val="bullet"/>
+      <w:lvlText w:val="o"/>
+      <w:lvlJc w:val="left"/>
+      <w:pPr>
+        <w:tabs>
+          <w:tab w:val="num" w:pos="1440"/>
+        </w:tabs>
+        <w:ind w:left="1440" w:hanging="360"/>
+      </w:pPr>
+      <w:rPr>
+        <w:rFonts w:ascii="Courier New" w:hAnsi="Courier New" w:hint="default"/>
+        <w:sz w:val="20"/>
+      </w:rPr>
+    </w:lvl>
+    <w:lvl w:ilvl="2" w:tentative="1">
+      <w:start w:val="1"/>
+      <w:numFmt w:val="bullet"/>
+      <w:lvlText w:val=""/>
+      <w:lvlJc w:val="left"/>
+      <w:pPr>
+        <w:tabs>
+          <w:tab w:val="num" w:pos="2160"/>
+        </w:tabs>
+        <w:ind w:left="2160" w:hanging="360"/>
+      </w:pPr>
+      <w:rPr>
+        <w:rFonts w:ascii="Wingdings" w:hAnsi="Wingdings" w:hint="default"/>
+        <w:sz w:val="20"/>
+      </w:rPr>
+    </w:lvl>
+    <w:lvl w:ilvl="3" w:tentative="1">
+      <w:start w:val="1"/>
+      <w:numFmt w:val="bullet"/>
+      <w:lvlText w:val=""/>
+      <w:lvlJc w:val="left"/>
+      <w:pPr>
+        <w:tabs>
+          <w:tab w:val="num" w:pos="2880"/>
+        </w:tabs>
+        <w:ind w:left="2880" w:hanging="360"/>
+      </w:pPr>
+      <w:rPr>
+        <w:rFonts w:ascii="Wingdings" w:hAnsi="Wingdings" w:hint="default"/>
+        <w:sz w:val="20"/>
+      </w:rPr>
+    </w:lvl>
+    <w:lvl w:ilvl="4" w:tentative="1">
+      <w:start w:val="1"/>
+      <w:numFmt w:val="bullet"/>
+      <w:lvlText w:val=""/>
+      <w:lvlJc w:val="left"/>
+      <w:pPr>
+        <w:tabs>
+          <w:tab w:val="num" w:pos="3600"/>
+        </w:tabs>
+        <w:ind w:left="3600" w:hanging="360"/>
+      </w:pPr>
+      <w:rPr>
+        <w:rFonts w:ascii="Wingdings" w:hAnsi="Wingdings" w:hint="default"/>
+        <w:sz w:val="20"/>
+      </w:rPr>
+    </w:lvl>
+    <w:lvl w:ilvl="5" w:tentative="1">
+      <w:start w:val="1"/>
+      <w:numFmt w:val="bullet"/>
+      <w:lvlText w:val=""/>
+      <w:lvlJc w:val="left"/>
+      <w:pPr>
+        <w:tabs>
+          <w:tab w:val="num" w:pos="4320"/>
+        </w:tabs>
+        <w:ind w:left="4320" w:hanging="360"/>
+      </w:pPr>
+      <w:rPr>
+        <w:rFonts w:ascii="Wingdings" w:hAnsi="Wingdings" w:hint="default"/>
+        <w:sz w:val="20"/>
+      </w:rPr>
+    </w:lvl>
+    <w:lvl w:ilvl="6" w:tentative="1">
+      <w:start w:val="1"/>
+      <w:numFmt w:val="bullet"/>
+      <w:lvlText w:val=""/>
+      <w:lvlJc w:val="left"/>
+      <w:pPr>
+        <w:tabs>
+          <w:tab w:val="num" w:pos="5040"/>
+        </w:tabs>
+        <w:ind w:left="5040" w:hanging="360"/>
+      </w:pPr>
+      <w:rPr>
+        <w:rFonts w:ascii="Wingdings" w:hAnsi="Wingdings" w:hint="default"/>
+        <w:sz w:val="20"/>
+      </w:rPr>
+    </w:lvl>
+    <w:lvl w:ilvl="7" w:tentative="1">
+      <w:start w:val="1"/>
+      <w:numFmt w:val="bullet"/>
+      <w:lvlText w:val=""/>
+      <w:lvlJc w:val="left"/>
+      <w:pPr>
+        <w:tabs>
+          <w:tab w:val="num" w:pos="5760"/>
+        </w:tabs>
+        <w:ind w:left="5760" w:hanging="360"/>
+      </w:pPr>
+      <w:rPr>
+        <w:rFonts w:ascii="Wingdings" w:hAnsi="Wingdings" w:hint="default"/>
+        <w:sz w:val="20"/>
+      </w:rPr>
+    </w:lvl>
+    <w:lvl w:ilvl="8" w:tentative="1">
+      <w:start w:val="1"/>
+      <w:numFmt w:val="bullet"/>
+      <w:lvlText w:val=""/>
+      <w:lvlJc w:val="left"/>
+      <w:pPr>
+        <w:tabs>
+          <w:tab w:val="num" w:pos="6480"/>
+        </w:tabs>
+        <w:ind w:left="6480" w:hanging="360"/>
+      </w:pPr>
+      <w:rPr>
+        <w:rFonts w:ascii="Wingdings" w:hAnsi="Wingdings" w:hint="default"/>
+        <w:sz w:val="20"/>
+      </w:rPr>
+    </w:lvl>
+  </w:abstractNum>
+  <w:abstractNum w:abstractNumId="1" w15:restartNumberingAfterBreak="0">
     <w:nsid w:val="3F44461C"/>
     <w:multiLevelType w:val="multilevel"/>
     <w:tmpl w:val="B11E7A34"/>
@@ -2640,7 +3293,7 @@
       </w:rPr>
     </w:lvl>
   </w:abstractNum>
-  <w:abstractNum w:abstractNumId="1" w15:restartNumberingAfterBreak="0">
+  <w:abstractNum w:abstractNumId="2" w15:restartNumberingAfterBreak="0">
     <w:nsid w:val="551C4D31"/>
     <w:multiLevelType w:val="hybridMultilevel"/>
     <w:tmpl w:val="4FEEC4A8"/>
@@ -2729,7 +3382,7 @@
       </w:pPr>
     </w:lvl>
   </w:abstractNum>
-  <w:abstractNum w:abstractNumId="2" w15:restartNumberingAfterBreak="0">
+  <w:abstractNum w:abstractNumId="3" w15:restartNumberingAfterBreak="0">
     <w:nsid w:val="63015D29"/>
     <w:multiLevelType w:val="multilevel"/>
     <w:tmpl w:val="908CB6B6"/>
@@ -2846,7 +3499,7 @@
       </w:pPr>
     </w:lvl>
   </w:abstractNum>
-  <w:abstractNum w:abstractNumId="3" w15:restartNumberingAfterBreak="0">
+  <w:abstractNum w:abstractNumId="4" w15:restartNumberingAfterBreak="0">
     <w:nsid w:val="6B530D3C"/>
     <w:multiLevelType w:val="multilevel"/>
     <w:tmpl w:val="E8047F22"/>
@@ -2995,7 +3648,7 @@
       </w:rPr>
     </w:lvl>
   </w:abstractNum>
-  <w:abstractNum w:abstractNumId="4" w15:restartNumberingAfterBreak="0">
+  <w:abstractNum w:abstractNumId="5" w15:restartNumberingAfterBreak="0">
     <w:nsid w:val="6C16636F"/>
     <w:multiLevelType w:val="multilevel"/>
     <w:tmpl w:val="B818FEC8"/>
@@ -3113,19 +3766,22 @@
     </w:lvl>
   </w:abstractNum>
   <w:num w:numId="1" w16cid:durableId="464086617">
+    <w:abstractNumId w:val="2"/>
+  </w:num>
+  <w:num w:numId="2" w16cid:durableId="1538541439">
     <w:abstractNumId w:val="1"/>
   </w:num>
-  <w:num w:numId="2" w16cid:durableId="1538541439">
-    <w:abstractNumId w:val="0"/>
+  <w:num w:numId="3" w16cid:durableId="1565481785">
+    <w:abstractNumId w:val="4"/>
   </w:num>
-  <w:num w:numId="3" w16cid:durableId="1565481785">
+  <w:num w:numId="4" w16cid:durableId="1980719279">
     <w:abstractNumId w:val="3"/>
   </w:num>
-  <w:num w:numId="4" w16cid:durableId="1980719279">
-    <w:abstractNumId w:val="2"/>
+  <w:num w:numId="5" w16cid:durableId="71199282">
+    <w:abstractNumId w:val="5"/>
   </w:num>
-  <w:num w:numId="5" w16cid:durableId="71199282">
-    <w:abstractNumId w:val="4"/>
+  <w:num w:numId="6" w16cid:durableId="360597893">
+    <w:abstractNumId w:val="0"/>
   </w:num>
 </w:numbering>
 </file>

</xml_diff>

<commit_message>
How do you conclude model's performance with confusion matrix
</commit_message>
<xml_diff>
--- a/ML_Interview_questions.docx
+++ b/ML_Interview_questions.docx
@@ -2971,6 +2971,40 @@
       </w:r>
       <w:r>
         <w:t>.</w:t>
+      </w:r>
+    </w:p>
+    <w:p>
+      <w:pPr>
+        <w:rPr>
+          <w:b/>
+          <w:bCs/>
+          <w:sz w:val="28"/>
+          <w:szCs w:val="28"/>
+        </w:rPr>
+      </w:pPr>
+      <w:r>
+        <w:rPr>
+          <w:b/>
+          <w:bCs/>
+          <w:sz w:val="28"/>
+          <w:szCs w:val="28"/>
+        </w:rPr>
+        <w:lastRenderedPageBreak/>
+        <w:t xml:space="preserve">19. </w:t>
+      </w:r>
+      <w:r>
+        <w:rPr>
+          <w:b/>
+          <w:bCs/>
+          <w:sz w:val="28"/>
+          <w:szCs w:val="28"/>
+        </w:rPr>
+        <w:t xml:space="preserve">How can you conclude about the model’s performance using the confusion matrix? </w:t>
+      </w:r>
+    </w:p>
+    <w:p>
+      <w:r>
+        <w:t>Confusion matrix summarizes the performance of a classification model. In a confusion matrix, we get four types of output (in case of a binary classification problem) which are TP, TN, FP, and FN. As we know that there are two diagonals possible in a square, and one of these two diagonals represents the numbers for which our model’s prediction and the true labels are the same. Our target is also to maximize the values along these diagonals. From the confusion matrix, we can calculate various evaluation metrics like accuracy, precision, recall, F1 score, etc</w:t>
       </w:r>
     </w:p>
     <w:p/>

</xml_diff>

<commit_message>
Explain the working principle of SVM
</commit_message>
<xml_diff>
--- a/ML_Interview_questions.docx
+++ b/ML_Interview_questions.docx
@@ -2990,24 +2990,75 @@
           <w:szCs w:val="28"/>
         </w:rPr>
         <w:lastRenderedPageBreak/>
-        <w:t xml:space="preserve">19. </w:t>
-      </w:r>
-      <w:r>
-        <w:rPr>
-          <w:b/>
-          <w:bCs/>
-          <w:sz w:val="28"/>
-          <w:szCs w:val="28"/>
-        </w:rPr>
-        <w:t xml:space="preserve">How can you conclude about the model’s performance using the confusion matrix? </w:t>
+        <w:t xml:space="preserve">19. How can you conclude about the model’s performance using the confusion matrix? </w:t>
       </w:r>
     </w:p>
     <w:p>
       <w:r>
         <w:t>Confusion matrix summarizes the performance of a classification model. In a confusion matrix, we get four types of output (in case of a binary classification problem) which are TP, TN, FP, and FN. As we know that there are two diagonals possible in a square, and one of these two diagonals represents the numbers for which our model’s prediction and the true labels are the same. Our target is also to maximize the values along these diagonals. From the confusion matrix, we can calculate various evaluation metrics like accuracy, precision, recall, F1 score, etc</w:t>
       </w:r>
-    </w:p>
-    <w:p/>
+      <w:r>
+        <w:t>.</w:t>
+      </w:r>
+    </w:p>
+    <w:p>
+      <w:r>
+        <w:rPr>
+          <w:b/>
+          <w:bCs/>
+          <w:sz w:val="28"/>
+          <w:szCs w:val="28"/>
+        </w:rPr>
+        <w:t>20</w:t>
+      </w:r>
+      <w:r>
+        <w:rPr>
+          <w:b/>
+          <w:bCs/>
+          <w:sz w:val="28"/>
+          <w:szCs w:val="28"/>
+        </w:rPr>
+        <w:t>. Explain the working principle of SVM.</w:t>
+      </w:r>
+      <w:r>
+        <w:t xml:space="preserve"> </w:t>
+      </w:r>
+    </w:p>
+    <w:p>
+      <w:r>
+        <w:t xml:space="preserve">Support Vector Machine (SVM) is a machine learning model that classifies data by finding the best dividing line (called a </w:t>
+      </w:r>
+      <w:r>
+        <w:rPr>
+          <w:b/>
+          <w:bCs/>
+        </w:rPr>
+        <w:t>hyperplane</w:t>
+      </w:r>
+      <w:r>
+        <w:t xml:space="preserve">) between different categories. If the data cannot be separated in its original form (low dimension), SVM uses </w:t>
+      </w:r>
+      <w:r>
+        <w:rPr>
+          <w:b/>
+          <w:bCs/>
+        </w:rPr>
+        <w:t>kernels</w:t>
+      </w:r>
+      <w:r>
+        <w:t xml:space="preserve"> to transform it into a higher-dimensional space where it becomes easier to separate. This helps SVM handle </w:t>
+      </w:r>
+      <w:r>
+        <w:rPr>
+          <w:b/>
+          <w:bCs/>
+        </w:rPr>
+        <w:t>non-linear</w:t>
+      </w:r>
+      <w:r>
+        <w:t xml:space="preserve"> problems.</w:t>
+      </w:r>
+    </w:p>
     <w:p/>
     <w:p/>
     <w:p>

</xml_diff>

<commit_message>
Difference between K-mean,K-mean++ algorithms, What is centeroids, What are the measures used in k-means++ for NLP and Object detection
</commit_message>
<xml_diff>
--- a/ML_Interview_questions.docx
+++ b/ML_Interview_questions.docx
@@ -3009,56 +3009,655 @@
           <w:sz w:val="28"/>
           <w:szCs w:val="28"/>
         </w:rPr>
-        <w:t>20</w:t>
-      </w:r>
-      <w:r>
+        <w:t>20. Explain the working principle of SVM.</w:t>
+      </w:r>
+      <w:r>
+        <w:t xml:space="preserve"> </w:t>
+      </w:r>
+    </w:p>
+    <w:p>
+      <w:r>
+        <w:t xml:space="preserve">Support Vector Machine (SVM) is a machine learning model that classifies data by finding the best dividing line (called a </w:t>
+      </w:r>
+      <w:r>
+        <w:rPr>
+          <w:b/>
+          <w:bCs/>
+        </w:rPr>
+        <w:t>hyperplane</w:t>
+      </w:r>
+      <w:r>
+        <w:t xml:space="preserve">) between different categories. If the data cannot be separated in its original form (low dimension), SVM uses </w:t>
+      </w:r>
+      <w:r>
+        <w:rPr>
+          <w:b/>
+          <w:bCs/>
+        </w:rPr>
+        <w:t>kernels</w:t>
+      </w:r>
+      <w:r>
+        <w:t xml:space="preserve"> to transform it into a higher-dimensional space where it becomes easier to separate. This helps SVM handle </w:t>
+      </w:r>
+      <w:r>
+        <w:rPr>
+          <w:b/>
+          <w:bCs/>
+        </w:rPr>
+        <w:t>non-linear</w:t>
+      </w:r>
+      <w:r>
+        <w:t xml:space="preserve"> problems.</w:t>
+      </w:r>
+    </w:p>
+    <w:p>
+      <w:pPr>
         <w:rPr>
           <w:b/>
           <w:bCs/>
           <w:sz w:val="28"/>
           <w:szCs w:val="28"/>
         </w:rPr>
-        <w:t>. Explain the working principle of SVM.</w:t>
+      </w:pPr>
+      <w:r>
+        <w:rPr>
+          <w:b/>
+          <w:bCs/>
+          <w:sz w:val="28"/>
+          <w:szCs w:val="28"/>
+        </w:rPr>
+        <w:t>2</w:t>
+      </w:r>
+      <w:r>
+        <w:rPr>
+          <w:b/>
+          <w:bCs/>
+          <w:sz w:val="28"/>
+          <w:szCs w:val="28"/>
+        </w:rPr>
+        <w:t>1</w:t>
+      </w:r>
+      <w:r>
+        <w:rPr>
+          <w:b/>
+          <w:bCs/>
+          <w:sz w:val="28"/>
+          <w:szCs w:val="28"/>
+        </w:rPr>
+        <w:t>. What is the difference between the k-means and k-means++ algorithms</w:t>
+      </w:r>
+    </w:p>
+    <w:p>
+      <w:r>
+        <w:rPr>
+          <w:b/>
+          <w:bCs/>
+        </w:rPr>
+        <w:t xml:space="preserve">K-means – </w:t>
+      </w:r>
+      <w:r>
+        <w:t>May choose closely together centroid points</w:t>
+      </w:r>
+    </w:p>
+    <w:p>
+      <w:r>
+        <w:rPr>
+          <w:b/>
+          <w:bCs/>
+        </w:rPr>
+        <w:t>EX:</w:t>
       </w:r>
       <w:r>
         <w:t xml:space="preserve"> </w:t>
       </w:r>
-    </w:p>
-    <w:p>
-      <w:r>
-        <w:t xml:space="preserve">Support Vector Machine (SVM) is a machine learning model that classifies data by finding the best dividing line (called a </w:t>
-      </w:r>
-      <w:r>
-        <w:rPr>
-          <w:b/>
-          <w:bCs/>
-        </w:rPr>
-        <w:t>hyperplane</w:t>
-      </w:r>
-      <w:r>
-        <w:t xml:space="preserve">) between different categories. If the data cannot be separated in its original form (low dimension), SVM uses </w:t>
-      </w:r>
-      <w:r>
-        <w:rPr>
-          <w:b/>
-          <w:bCs/>
-        </w:rPr>
-        <w:t>kernels</w:t>
-      </w:r>
-      <w:r>
-        <w:t xml:space="preserve"> to transform it into a higher-dimensional space where it becomes easier to separate. This helps SVM handle </w:t>
-      </w:r>
-      <w:r>
-        <w:rPr>
-          <w:b/>
-          <w:bCs/>
-        </w:rPr>
-        <w:t>non-linear</w:t>
-      </w:r>
-      <w:r>
-        <w:t xml:space="preserve"> problems.</w:t>
-      </w:r>
-    </w:p>
+      <w:r>
+        <w:t>(1,2</w:t>
+      </w:r>
+      <w:proofErr w:type="gramStart"/>
+      <w:r>
+        <w:t>),(</w:t>
+      </w:r>
+      <w:proofErr w:type="gramEnd"/>
+      <w:r>
+        <w:t>2,3</w:t>
+      </w:r>
+      <w:proofErr w:type="gramStart"/>
+      <w:r>
+        <w:t>),(</w:t>
+      </w:r>
+      <w:proofErr w:type="gramEnd"/>
+      <w:r>
+        <w:t>3,4), the centroid is the average point, which is (2,3).</w:t>
+      </w:r>
+    </w:p>
+    <w:p>
+      <w:r>
+        <w:rPr>
+          <w:b/>
+          <w:bCs/>
+        </w:rPr>
+        <w:t xml:space="preserve">K-means ++ - </w:t>
+      </w:r>
+      <w:r>
+        <w:t xml:space="preserve">Chooses very </w:t>
+      </w:r>
+      <w:proofErr w:type="gramStart"/>
+      <w:r>
+        <w:t>long distance</w:t>
+      </w:r>
+      <w:proofErr w:type="gramEnd"/>
+      <w:r>
+        <w:t xml:space="preserve"> centroid points to spread out well</w:t>
+      </w:r>
+    </w:p>
+    <w:p>
+      <w:pPr>
+        <w:rPr>
+          <w:b/>
+          <w:bCs/>
+        </w:rPr>
+      </w:pPr>
+      <w:r>
+        <w:rPr>
+          <w:b/>
+          <w:bCs/>
+        </w:rPr>
+        <w:t>EX:</w:t>
+      </w:r>
+    </w:p>
+    <w:p>
+      <w:pPr>
+        <w:rPr>
+          <w:b/>
+          <w:bCs/>
+        </w:rPr>
+      </w:pPr>
+      <w:r>
+        <w:rPr>
+          <w:b/>
+          <w:bCs/>
+        </w:rPr>
+        <w:drawing>
+          <wp:inline distT="0" distB="0" distL="0" distR="0" wp14:anchorId="7AB29BB1" wp14:editId="0481D3FD">
+            <wp:extent cx="3879273" cy="1644372"/>
+            <wp:effectExtent l="0" t="0" r="6985" b="0"/>
+            <wp:docPr id="283983366" name="Picture 1"/>
+            <wp:cNvGraphicFramePr>
+              <a:graphicFrameLocks xmlns:a="http://schemas.openxmlformats.org/drawingml/2006/main" noChangeAspect="1"/>
+            </wp:cNvGraphicFramePr>
+            <a:graphic xmlns:a="http://schemas.openxmlformats.org/drawingml/2006/main">
+              <a:graphicData uri="http://schemas.openxmlformats.org/drawingml/2006/picture">
+                <pic:pic xmlns:pic="http://schemas.openxmlformats.org/drawingml/2006/picture">
+                  <pic:nvPicPr>
+                    <pic:cNvPr id="283983366" name=""/>
+                    <pic:cNvPicPr/>
+                  </pic:nvPicPr>
+                  <pic:blipFill>
+                    <a:blip r:embed="rId21"/>
+                    <a:stretch>
+                      <a:fillRect/>
+                    </a:stretch>
+                  </pic:blipFill>
+                  <pic:spPr>
+                    <a:xfrm>
+                      <a:off x="0" y="0"/>
+                      <a:ext cx="3894983" cy="1651031"/>
+                    </a:xfrm>
+                    <a:prstGeom prst="rect">
+                      <a:avLst/>
+                    </a:prstGeom>
+                  </pic:spPr>
+                </pic:pic>
+              </a:graphicData>
+            </a:graphic>
+          </wp:inline>
+        </w:drawing>
+      </w:r>
+    </w:p>
+    <w:p>
+      <w:pPr>
+        <w:rPr>
+          <w:b/>
+          <w:bCs/>
+        </w:rPr>
+      </w:pPr>
+      <w:r>
+        <w:rPr>
+          <w:b/>
+          <w:bCs/>
+        </w:rPr>
+        <w:t>MESAURE FORMULA TO SELECT FAR CENTEROID:</w:t>
+      </w:r>
+    </w:p>
+    <w:p>
+      <w:pPr>
+        <w:rPr>
+          <w:b/>
+          <w:bCs/>
+        </w:rPr>
+      </w:pPr>
+      <w:r>
+        <w:rPr>
+          <w:b/>
+          <w:bCs/>
+        </w:rPr>
+        <w:lastRenderedPageBreak/>
+        <w:drawing>
+          <wp:inline distT="0" distB="0" distL="0" distR="0" wp14:anchorId="46895918" wp14:editId="3D21F78D">
+            <wp:extent cx="5731510" cy="2910205"/>
+            <wp:effectExtent l="0" t="0" r="2540" b="4445"/>
+            <wp:docPr id="1999197232" name="Picture 1"/>
+            <wp:cNvGraphicFramePr>
+              <a:graphicFrameLocks xmlns:a="http://schemas.openxmlformats.org/drawingml/2006/main" noChangeAspect="1"/>
+            </wp:cNvGraphicFramePr>
+            <a:graphic xmlns:a="http://schemas.openxmlformats.org/drawingml/2006/main">
+              <a:graphicData uri="http://schemas.openxmlformats.org/drawingml/2006/picture">
+                <pic:pic xmlns:pic="http://schemas.openxmlformats.org/drawingml/2006/picture">
+                  <pic:nvPicPr>
+                    <pic:cNvPr id="1999197232" name=""/>
+                    <pic:cNvPicPr/>
+                  </pic:nvPicPr>
+                  <pic:blipFill>
+                    <a:blip r:embed="rId22"/>
+                    <a:stretch>
+                      <a:fillRect/>
+                    </a:stretch>
+                  </pic:blipFill>
+                  <pic:spPr>
+                    <a:xfrm>
+                      <a:off x="0" y="0"/>
+                      <a:ext cx="5731510" cy="2910205"/>
+                    </a:xfrm>
+                    <a:prstGeom prst="rect">
+                      <a:avLst/>
+                    </a:prstGeom>
+                  </pic:spPr>
+                </pic:pic>
+              </a:graphicData>
+            </a:graphic>
+          </wp:inline>
+        </w:drawing>
+      </w:r>
+    </w:p>
+    <w:tbl>
+      <w:tblPr>
+        <w:tblW w:w="0" w:type="auto"/>
+        <w:tblCellSpacing w:w="15" w:type="dxa"/>
+        <w:tblCellMar>
+          <w:top w:w="15" w:type="dxa"/>
+          <w:left w:w="15" w:type="dxa"/>
+          <w:bottom w:w="15" w:type="dxa"/>
+          <w:right w:w="15" w:type="dxa"/>
+        </w:tblCellMar>
+        <w:tblLook w:val="04A0" w:firstRow="1" w:lastRow="0" w:firstColumn="1" w:lastColumn="0" w:noHBand="0" w:noVBand="1"/>
+      </w:tblPr>
+      <w:tblGrid>
+        <w:gridCol w:w="1894"/>
+        <w:gridCol w:w="2709"/>
+        <w:gridCol w:w="4423"/>
+      </w:tblGrid>
+      <w:tr>
+        <w:trPr>
+          <w:tblHeader/>
+          <w:tblCellSpacing w:w="15" w:type="dxa"/>
+        </w:trPr>
+        <w:tc>
+          <w:tcPr>
+            <w:tcW w:w="0" w:type="auto"/>
+            <w:vAlign w:val="center"/>
+            <w:hideMark/>
+          </w:tcPr>
+          <w:p>
+            <w:pPr>
+              <w:rPr>
+                <w:b/>
+                <w:bCs/>
+              </w:rPr>
+            </w:pPr>
+            <w:r>
+              <w:rPr>
+                <w:b/>
+                <w:bCs/>
+              </w:rPr>
+              <w:t>Feature</w:t>
+            </w:r>
+          </w:p>
+        </w:tc>
+        <w:tc>
+          <w:tcPr>
+            <w:tcW w:w="0" w:type="auto"/>
+            <w:vAlign w:val="center"/>
+            <w:hideMark/>
+          </w:tcPr>
+          <w:p>
+            <w:pPr>
+              <w:rPr>
+                <w:b/>
+                <w:bCs/>
+              </w:rPr>
+            </w:pPr>
+            <w:r>
+              <w:rPr>
+                <w:b/>
+                <w:bCs/>
+              </w:rPr>
+              <w:t>K-means</w:t>
+            </w:r>
+          </w:p>
+        </w:tc>
+        <w:tc>
+          <w:tcPr>
+            <w:tcW w:w="0" w:type="auto"/>
+            <w:vAlign w:val="center"/>
+            <w:hideMark/>
+          </w:tcPr>
+          <w:p>
+            <w:pPr>
+              <w:rPr>
+                <w:b/>
+                <w:bCs/>
+              </w:rPr>
+            </w:pPr>
+            <w:r>
+              <w:rPr>
+                <w:b/>
+                <w:bCs/>
+              </w:rPr>
+              <w:t>K-means++</w:t>
+            </w:r>
+          </w:p>
+        </w:tc>
+      </w:tr>
+      <w:tr>
+        <w:trPr>
+          <w:tblCellSpacing w:w="15" w:type="dxa"/>
+        </w:trPr>
+        <w:tc>
+          <w:tcPr>
+            <w:tcW w:w="0" w:type="auto"/>
+            <w:vAlign w:val="center"/>
+            <w:hideMark/>
+          </w:tcPr>
+          <w:p>
+            <w:r>
+              <w:rPr>
+                <w:b/>
+                <w:bCs/>
+              </w:rPr>
+              <w:t>Centroid Initialization</w:t>
+            </w:r>
+          </w:p>
+        </w:tc>
+        <w:tc>
+          <w:tcPr>
+            <w:tcW w:w="0" w:type="auto"/>
+            <w:vAlign w:val="center"/>
+            <w:hideMark/>
+          </w:tcPr>
+          <w:p>
+            <w:r>
+              <w:t>Randomly chosen from data points</w:t>
+            </w:r>
+          </w:p>
+        </w:tc>
+        <w:tc>
+          <w:tcPr>
+            <w:tcW w:w="0" w:type="auto"/>
+            <w:vAlign w:val="center"/>
+            <w:hideMark/>
+          </w:tcPr>
+          <w:p>
+            <w:r>
+              <w:t>First point random; others chosen based on distance from existing centroids</w:t>
+            </w:r>
+          </w:p>
+        </w:tc>
+      </w:tr>
+      <w:tr>
+        <w:trPr>
+          <w:tblCellSpacing w:w="15" w:type="dxa"/>
+        </w:trPr>
+        <w:tc>
+          <w:tcPr>
+            <w:tcW w:w="0" w:type="auto"/>
+            <w:vAlign w:val="center"/>
+            <w:hideMark/>
+          </w:tcPr>
+          <w:p>
+            <w:r>
+              <w:rPr>
+                <w:b/>
+                <w:bCs/>
+              </w:rPr>
+              <w:t>Chance of Poor Clustering</w:t>
+            </w:r>
+          </w:p>
+        </w:tc>
+        <w:tc>
+          <w:tcPr>
+            <w:tcW w:w="0" w:type="auto"/>
+            <w:vAlign w:val="center"/>
+            <w:hideMark/>
+          </w:tcPr>
+          <w:p>
+            <w:r>
+              <w:t>High (may choose centroids close together)</w:t>
+            </w:r>
+          </w:p>
+        </w:tc>
+        <w:tc>
+          <w:tcPr>
+            <w:tcW w:w="0" w:type="auto"/>
+            <w:vAlign w:val="center"/>
+            <w:hideMark/>
+          </w:tcPr>
+          <w:p>
+            <w:r>
+              <w:t>Low (ensures centroids are spread out)</w:t>
+            </w:r>
+          </w:p>
+        </w:tc>
+      </w:tr>
+      <w:tr>
+        <w:trPr>
+          <w:tblCellSpacing w:w="15" w:type="dxa"/>
+        </w:trPr>
+        <w:tc>
+          <w:tcPr>
+            <w:tcW w:w="0" w:type="auto"/>
+            <w:vAlign w:val="center"/>
+            <w:hideMark/>
+          </w:tcPr>
+          <w:p>
+            <w:r>
+              <w:rPr>
+                <w:b/>
+                <w:bCs/>
+              </w:rPr>
+              <w:t>Selection Strategy</w:t>
+            </w:r>
+          </w:p>
+        </w:tc>
+        <w:tc>
+          <w:tcPr>
+            <w:tcW w:w="0" w:type="auto"/>
+            <w:vAlign w:val="center"/>
+            <w:hideMark/>
+          </w:tcPr>
+          <w:p>
+            <w:r>
+              <w:t>No logic, just random</w:t>
+            </w:r>
+          </w:p>
+        </w:tc>
+        <w:tc>
+          <w:tcPr>
+            <w:tcW w:w="0" w:type="auto"/>
+            <w:vAlign w:val="center"/>
+            <w:hideMark/>
+          </w:tcPr>
+          <w:p>
+            <w:r>
+              <w:t xml:space="preserve">Probability </w:t>
+            </w:r>
+            <w:r>
+              <w:rPr>
+                <w:rFonts w:ascii="Cambria Math" w:hAnsi="Cambria Math" w:cs="Cambria Math"/>
+              </w:rPr>
+              <w:t>∝</w:t>
+            </w:r>
+            <w:r>
+              <w:t xml:space="preserve"> (Distance</w:t>
+            </w:r>
+            <w:r>
+              <w:rPr>
+                <w:rFonts w:ascii="Calibri" w:hAnsi="Calibri" w:cs="Calibri"/>
+              </w:rPr>
+              <w:t>²</w:t>
+            </w:r>
+            <w:r>
+              <w:t xml:space="preserve"> to nearest existing centroid)</w:t>
+            </w:r>
+          </w:p>
+        </w:tc>
+      </w:tr>
+      <w:tr>
+        <w:trPr>
+          <w:tblCellSpacing w:w="15" w:type="dxa"/>
+        </w:trPr>
+        <w:tc>
+          <w:tcPr>
+            <w:tcW w:w="0" w:type="auto"/>
+            <w:vAlign w:val="center"/>
+            <w:hideMark/>
+          </w:tcPr>
+          <w:p>
+            <w:r>
+              <w:rPr>
+                <w:b/>
+                <w:bCs/>
+              </w:rPr>
+              <w:t>Cluster Quality</w:t>
+            </w:r>
+          </w:p>
+        </w:tc>
+        <w:tc>
+          <w:tcPr>
+            <w:tcW w:w="0" w:type="auto"/>
+            <w:vAlign w:val="center"/>
+            <w:hideMark/>
+          </w:tcPr>
+          <w:p>
+            <w:r>
+              <w:t>May get stuck in local minima</w:t>
+            </w:r>
+          </w:p>
+        </w:tc>
+        <w:tc>
+          <w:tcPr>
+            <w:tcW w:w="0" w:type="auto"/>
+            <w:vAlign w:val="center"/>
+            <w:hideMark/>
+          </w:tcPr>
+          <w:p>
+            <w:r>
+              <w:t>More likely to reach global optimum</w:t>
+            </w:r>
+          </w:p>
+        </w:tc>
+      </w:tr>
+      <w:tr>
+        <w:trPr>
+          <w:tblCellSpacing w:w="15" w:type="dxa"/>
+        </w:trPr>
+        <w:tc>
+          <w:tcPr>
+            <w:tcW w:w="0" w:type="auto"/>
+            <w:vAlign w:val="center"/>
+            <w:hideMark/>
+          </w:tcPr>
+          <w:p>
+            <w:r>
+              <w:rPr>
+                <w:b/>
+                <w:bCs/>
+              </w:rPr>
+              <w:t>Convergence Speed</w:t>
+            </w:r>
+          </w:p>
+        </w:tc>
+        <w:tc>
+          <w:tcPr>
+            <w:tcW w:w="0" w:type="auto"/>
+            <w:vAlign w:val="center"/>
+            <w:hideMark/>
+          </w:tcPr>
+          <w:p>
+            <w:r>
+              <w:t>Slower and varies</w:t>
+            </w:r>
+          </w:p>
+        </w:tc>
+        <w:tc>
+          <w:tcPr>
+            <w:tcW w:w="0" w:type="auto"/>
+            <w:vAlign w:val="center"/>
+            <w:hideMark/>
+          </w:tcPr>
+          <w:p>
+            <w:r>
+              <w:t>Faster and more stable</w:t>
+            </w:r>
+          </w:p>
+        </w:tc>
+      </w:tr>
+      <w:tr>
+        <w:trPr>
+          <w:tblCellSpacing w:w="15" w:type="dxa"/>
+        </w:trPr>
+        <w:tc>
+          <w:tcPr>
+            <w:tcW w:w="0" w:type="auto"/>
+            <w:vAlign w:val="center"/>
+            <w:hideMark/>
+          </w:tcPr>
+          <w:p>
+            <w:r>
+              <w:rPr>
+                <w:b/>
+                <w:bCs/>
+              </w:rPr>
+              <w:t>When to Use</w:t>
+            </w:r>
+          </w:p>
+        </w:tc>
+        <w:tc>
+          <w:tcPr>
+            <w:tcW w:w="0" w:type="auto"/>
+            <w:vAlign w:val="center"/>
+            <w:hideMark/>
+          </w:tcPr>
+          <w:p>
+            <w:r>
+              <w:t>Small/simple datasets</w:t>
+            </w:r>
+          </w:p>
+        </w:tc>
+        <w:tc>
+          <w:tcPr>
+            <w:tcW w:w="0" w:type="auto"/>
+            <w:vAlign w:val="center"/>
+            <w:hideMark/>
+          </w:tcPr>
+          <w:p>
+            <w:r>
+              <w:t>Always recommended, especially for complex or high-dimensional data</w:t>
+            </w:r>
+          </w:p>
+        </w:tc>
+      </w:tr>
+    </w:tbl>
+    <w:p/>
     <w:p/>
     <w:p/>
     <w:p>

</xml_diff>

<commit_message>
. Whether decision tree or random forest is more robust to the  outliers
</commit_message>
<xml_diff>
--- a/ML_Interview_questions.docx
+++ b/ML_Interview_questions.docx
@@ -3066,25 +3066,7 @@
           <w:sz w:val="28"/>
           <w:szCs w:val="28"/>
         </w:rPr>
-        <w:t>2</w:t>
-      </w:r>
-      <w:r>
-        <w:rPr>
-          <w:b/>
-          <w:bCs/>
-          <w:sz w:val="28"/>
-          <w:szCs w:val="28"/>
-        </w:rPr>
-        <w:t>1</w:t>
-      </w:r>
-      <w:r>
-        <w:rPr>
-          <w:b/>
-          <w:bCs/>
-          <w:sz w:val="28"/>
-          <w:szCs w:val="28"/>
-        </w:rPr>
-        <w:t>. What is the difference between the k-means and k-means++ algorithms</w:t>
+        <w:t>21. What is the difference between the k-means and k-means++ algorithms</w:t>
       </w:r>
     </w:p>
     <w:p>
@@ -3108,10 +3090,7 @@
         <w:t>EX:</w:t>
       </w:r>
       <w:r>
-        <w:t xml:space="preserve"> </w:t>
-      </w:r>
-      <w:r>
-        <w:t>(1,2</w:t>
+        <w:t xml:space="preserve"> (1,2</w:t>
       </w:r>
       <w:proofErr w:type="gramStart"/>
       <w:r>
@@ -3176,6 +3155,7 @@
         <w:rPr>
           <w:b/>
           <w:bCs/>
+          <w:noProof/>
         </w:rPr>
         <w:drawing>
           <wp:inline distT="0" distB="0" distL="0" distR="0" wp14:anchorId="7AB29BB1" wp14:editId="0481D3FD">
@@ -3240,6 +3220,7 @@
         <w:rPr>
           <w:b/>
           <w:bCs/>
+          <w:noProof/>
         </w:rPr>
         <w:lastRenderedPageBreak/>
         <w:drawing>
@@ -3658,14 +3639,42 @@
       </w:tr>
     </w:tbl>
     <w:p/>
-    <w:p/>
-    <w:p/>
+    <w:p>
+      <w:pPr>
+        <w:rPr>
+          <w:b/>
+          <w:bCs/>
+          <w:sz w:val="28"/>
+          <w:szCs w:val="28"/>
+        </w:rPr>
+      </w:pPr>
+      <w:r>
+        <w:rPr>
+          <w:b/>
+          <w:bCs/>
+          <w:sz w:val="28"/>
+          <w:szCs w:val="28"/>
+        </w:rPr>
+        <w:t xml:space="preserve">22. Whether decision tree or random forest is more robust to the outliers. </w:t>
+      </w:r>
+    </w:p>
     <w:p>
       <w:pPr>
         <w:rPr>
           <w:lang w:val="en-US"/>
         </w:rPr>
       </w:pPr>
+      <w:r>
+        <w:t xml:space="preserve">Decision trees and random forests are both relatively robust to outliers. A random forest model is an ensemble of multiple decision trees so, the output of a random forest model is an aggregate of multiple decision trees. So, when we average the results the chances of overfitting get reduced. </w:t>
+      </w:r>
+      <w:proofErr w:type="gramStart"/>
+      <w:r>
+        <w:t>Hence</w:t>
+      </w:r>
+      <w:proofErr w:type="gramEnd"/>
+      <w:r>
+        <w:t xml:space="preserve"> we can say that the random forest models are more robust to outliers</w:t>
+      </w:r>
     </w:p>
     <w:sectPr>
       <w:pgSz w:w="11906" w:h="16838"/>

</xml_diff>

<commit_message>
What is the difference between L1 and L2 regularization? What is their significance?
</commit_message>
<xml_diff>
--- a/ML_Interview_questions.docx
+++ b/ML_Interview_questions.docx
@@ -3659,22 +3659,65 @@
       </w:r>
     </w:p>
     <w:p>
+      <w:r>
+        <w:t xml:space="preserve">Decision trees and random forests are both relatively robust to outliers. A random forest model is an ensemble of multiple decision trees so, the output of a random forest model is an aggregate of multiple decision trees. So, when we average the results the chances of overfitting get reduced. </w:t>
+      </w:r>
+      <w:proofErr w:type="gramStart"/>
+      <w:r>
+        <w:t>Hence</w:t>
+      </w:r>
+      <w:proofErr w:type="gramEnd"/>
+      <w:r>
+        <w:t xml:space="preserve"> we can say that the random forest models are more robust to outliers</w:t>
+      </w:r>
+      <w:r>
+        <w:t>.</w:t>
+      </w:r>
+    </w:p>
+    <w:p>
+      <w:pPr>
+        <w:rPr>
+          <w:b/>
+          <w:bCs/>
+          <w:sz w:val="28"/>
+          <w:szCs w:val="28"/>
+        </w:rPr>
+      </w:pPr>
+      <w:r>
+        <w:rPr>
+          <w:b/>
+          <w:bCs/>
+          <w:sz w:val="28"/>
+          <w:szCs w:val="28"/>
+        </w:rPr>
+        <w:t xml:space="preserve">23. What is the difference between L1 and L2 regularization? What is their significance? </w:t>
+      </w:r>
+    </w:p>
+    <w:p>
+      <w:r>
+        <w:t xml:space="preserve">L1 regularization (Lasso </w:t>
+      </w:r>
+      <w:proofErr w:type="gramStart"/>
+      <w:r>
+        <w:t>regularization)adds</w:t>
+      </w:r>
+      <w:proofErr w:type="gramEnd"/>
+      <w:r>
+        <w:t xml:space="preserve"> the sum of the absolute values of the model’s weights to the loss function. This penalty encourages sparsity in the model by pushing the weights of less important features to exactly zero.</w:t>
+      </w:r>
+    </w:p>
+    <w:p>
+      <w:r>
+        <w:lastRenderedPageBreak/>
+        <w:t>L2 regularization (Ridge regularization) in which we add the square of the weights to the loss function. In both of these regularization methods, weights are penalized but there is a subtle difference between the objective they help to achieve.  In L2 regularization the weights are not penalized to 0 but they are near zero for irrelevant features. It is often used to prevent overfitting by shrinking the weights towards zero, especially when there are many features and the data is noisy</w:t>
+      </w:r>
+    </w:p>
+    <w:p>
       <w:pPr>
         <w:rPr>
           <w:lang w:val="en-US"/>
         </w:rPr>
       </w:pPr>
-      <w:r>
-        <w:t xml:space="preserve">Decision trees and random forests are both relatively robust to outliers. A random forest model is an ensemble of multiple decision trees so, the output of a random forest model is an aggregate of multiple decision trees. So, when we average the results the chances of overfitting get reduced. </w:t>
-      </w:r>
-      <w:proofErr w:type="gramStart"/>
-      <w:r>
-        <w:t>Hence</w:t>
-      </w:r>
-      <w:proofErr w:type="gramEnd"/>
-      <w:r>
-        <w:t xml:space="preserve"> we can say that the random forest models are more robust to outliers</w:t>
-      </w:r>
     </w:p>
     <w:sectPr>
       <w:pgSz w:w="11906" w:h="16838"/>

</xml_diff>

<commit_message>
What is radial basis function in ML
</commit_message>
<xml_diff>
--- a/ML_Interview_questions.docx
+++ b/ML_Interview_questions.docx
@@ -3717,6 +3717,196 @@
         <w:t>In L2 regularization the weights are not penalized to 0 but they are near zero for irrelevant features. It is often used to prevent overfitting by shrinking the weights towards zero, especially when there are many features and the data is noisy</w:t>
       </w:r>
     </w:p>
+    <w:p>
+      <w:pPr>
+        <w:rPr>
+          <w:b/>
+          <w:bCs/>
+          <w:sz w:val="28"/>
+          <w:szCs w:val="28"/>
+        </w:rPr>
+      </w:pPr>
+      <w:r>
+        <w:rPr>
+          <w:b/>
+          <w:bCs/>
+          <w:sz w:val="28"/>
+          <w:szCs w:val="28"/>
+        </w:rPr>
+        <w:t xml:space="preserve">24. </w:t>
+      </w:r>
+      <w:r>
+        <w:rPr>
+          <w:b/>
+          <w:bCs/>
+          <w:sz w:val="28"/>
+          <w:szCs w:val="28"/>
+        </w:rPr>
+        <w:t>What is a radial basis function</w:t>
+      </w:r>
+    </w:p>
+    <w:p>
+      <w:r>
+        <w:t xml:space="preserve">The </w:t>
+      </w:r>
+      <w:r>
+        <w:rPr>
+          <w:b/>
+          <w:bCs/>
+        </w:rPr>
+        <w:t>Radial Basis Function (RBF)</w:t>
+      </w:r>
+      <w:r>
+        <w:t xml:space="preserve"> is a real-valued function whose output depends on the </w:t>
+      </w:r>
+      <w:r>
+        <w:rPr>
+          <w:b/>
+          <w:bCs/>
+        </w:rPr>
+        <w:t>distance</w:t>
+      </w:r>
+      <w:r>
+        <w:t xml:space="preserve"> between the input x and a fixed point (called the </w:t>
+      </w:r>
+      <w:proofErr w:type="spellStart"/>
+      <w:r>
+        <w:rPr>
+          <w:b/>
+          <w:bCs/>
+        </w:rPr>
+        <w:t>center</w:t>
+      </w:r>
+      <w:proofErr w:type="spellEnd"/>
+      <w:r>
+        <w:t xml:space="preserve">). It's commonly used in machine learning for </w:t>
+      </w:r>
+      <w:r>
+        <w:rPr>
+          <w:b/>
+          <w:bCs/>
+        </w:rPr>
+        <w:t>function approximation</w:t>
+      </w:r>
+      <w:r>
+        <w:t xml:space="preserve">, </w:t>
+      </w:r>
+      <w:r>
+        <w:rPr>
+          <w:b/>
+          <w:bCs/>
+        </w:rPr>
+        <w:t>clustering</w:t>
+      </w:r>
+      <w:r>
+        <w:t xml:space="preserve">, and </w:t>
+      </w:r>
+      <w:r>
+        <w:rPr>
+          <w:b/>
+          <w:bCs/>
+        </w:rPr>
+        <w:t>classification</w:t>
+      </w:r>
+      <w:r>
+        <w:t>.</w:t>
+      </w:r>
+    </w:p>
+    <w:p>
+      <w:r>
+        <w:t>The formula for RBF:</w:t>
+      </w:r>
+    </w:p>
+    <w:p>
+      <w:r>
+        <w:drawing>
+          <wp:inline distT="0" distB="0" distL="0" distR="0" wp14:anchorId="07D8ABA0" wp14:editId="0EDFB4F4">
+            <wp:extent cx="3438383" cy="2505075"/>
+            <wp:effectExtent l="0" t="0" r="0" b="0"/>
+            <wp:docPr id="398622165" name="Picture 1"/>
+            <wp:cNvGraphicFramePr>
+              <a:graphicFrameLocks xmlns:a="http://schemas.openxmlformats.org/drawingml/2006/main" noChangeAspect="1"/>
+            </wp:cNvGraphicFramePr>
+            <a:graphic xmlns:a="http://schemas.openxmlformats.org/drawingml/2006/main">
+              <a:graphicData uri="http://schemas.openxmlformats.org/drawingml/2006/picture">
+                <pic:pic xmlns:pic="http://schemas.openxmlformats.org/drawingml/2006/picture">
+                  <pic:nvPicPr>
+                    <pic:cNvPr id="398622165" name=""/>
+                    <pic:cNvPicPr/>
+                  </pic:nvPicPr>
+                  <pic:blipFill>
+                    <a:blip r:embed="rId23"/>
+                    <a:stretch>
+                      <a:fillRect/>
+                    </a:stretch>
+                  </pic:blipFill>
+                  <pic:spPr>
+                    <a:xfrm>
+                      <a:off x="0" y="0"/>
+                      <a:ext cx="3449164" cy="2512929"/>
+                    </a:xfrm>
+                    <a:prstGeom prst="rect">
+                      <a:avLst/>
+                    </a:prstGeom>
+                  </pic:spPr>
+                </pic:pic>
+              </a:graphicData>
+            </a:graphic>
+          </wp:inline>
+        </w:drawing>
+      </w:r>
+    </w:p>
+    <w:p>
+      <w:pPr>
+        <w:rPr>
+          <w:b/>
+          <w:bCs/>
+        </w:rPr>
+      </w:pPr>
+      <w:r>
+        <w:rPr>
+          <w:b/>
+          <w:bCs/>
+        </w:rPr>
+        <w:t>Conclusion:</w:t>
+      </w:r>
+    </w:p>
+    <w:p>
+      <w:r>
+        <w:t xml:space="preserve">RBF is a powerful tool in machine learning for </w:t>
+      </w:r>
+      <w:r>
+        <w:rPr>
+          <w:b/>
+          <w:bCs/>
+        </w:rPr>
+        <w:t>capturing local similarities</w:t>
+      </w:r>
+      <w:r>
+        <w:t xml:space="preserve">, enabling better performance in tasks like </w:t>
+      </w:r>
+      <w:r>
+        <w:rPr>
+          <w:b/>
+          <w:bCs/>
+        </w:rPr>
+        <w:t>classification and clustering</w:t>
+      </w:r>
+      <w:r>
+        <w:t xml:space="preserve">, especially when used with algorithms like </w:t>
+      </w:r>
+      <w:r>
+        <w:rPr>
+          <w:b/>
+          <w:bCs/>
+        </w:rPr>
+        <w:t>SVM</w:t>
+      </w:r>
+      <w:r>
+        <w:t>.</w:t>
+      </w:r>
+    </w:p>
+    <w:p/>
     <w:p>
       <w:pPr>
         <w:rPr>

</xml_diff>

<commit_message>
Does the accuracy score always a good metric to measure  the performance of a classification model?
</commit_message>
<xml_diff>
--- a/ML_Interview_questions.docx
+++ b/ML_Interview_questions.docx
@@ -364,7 +364,15 @@
         <w:t>Example</w:t>
       </w:r>
       <w:r>
-        <w:t>: If a model learns weights [2, -3, 0.5], L1 would penalize |2| + |-3| + |0.5| = 5.5, while L2 would penalize 2² + (-3)² + 0.5² = 13.25.</w:t>
+        <w:t>: If a model learns weights [2, -3, 0.5], L1 would penalize |2| + |-3| + |0.5| = 5.5, while L2 would penalize 2² + (-</w:t>
+      </w:r>
+      <w:proofErr w:type="gramStart"/>
+      <w:r>
+        <w:t>3)²</w:t>
+      </w:r>
+      <w:proofErr w:type="gramEnd"/>
+      <w:r>
+        <w:t xml:space="preserve"> + 0.5² = 13.25.</w:t>
       </w:r>
     </w:p>
     <w:p/>
@@ -465,6 +473,7 @@
       <w:r>
         <w:t xml:space="preserve">A </w:t>
       </w:r>
+      <w:proofErr w:type="gramStart"/>
       <w:r>
         <w:rPr>
           <w:b/>
@@ -472,9 +481,11 @@
         </w:rPr>
         <w:t>local minima</w:t>
       </w:r>
+      <w:proofErr w:type="gramEnd"/>
       <w:r>
         <w:t xml:space="preserve"> is a point where a function’s value is lower than nearby points, while a </w:t>
       </w:r>
+      <w:proofErr w:type="gramStart"/>
       <w:r>
         <w:rPr>
           <w:b/>
@@ -482,6 +493,7 @@
         </w:rPr>
         <w:t>global minima</w:t>
       </w:r>
+      <w:proofErr w:type="gramEnd"/>
       <w:r>
         <w:t xml:space="preserve"> is the absolute lowest point across the entire function.</w:t>
       </w:r>
@@ -583,11 +595,24 @@
     </w:p>
     <w:p>
       <w:r>
-        <w:t xml:space="preserve">And also we can’t use linear regression loss function on classification, </w:t>
-      </w:r>
-      <w:r>
-        <w:t>because means square error only finds the distance between predicted data points and correct data points in continuous value manner(</w:t>
-      </w:r>
+        <w:t xml:space="preserve">And </w:t>
+      </w:r>
+      <w:proofErr w:type="gramStart"/>
+      <w:r>
+        <w:t>also</w:t>
+      </w:r>
+      <w:proofErr w:type="gramEnd"/>
+      <w:r>
+        <w:t xml:space="preserve"> we can’t use linear regression loss function on classification, </w:t>
+      </w:r>
+      <w:r>
+        <w:t xml:space="preserve">because means square error only finds the distance between predicted data points and correct data points in continuous value </w:t>
+      </w:r>
+      <w:proofErr w:type="gramStart"/>
+      <w:r>
+        <w:t>manner(</w:t>
+      </w:r>
+      <w:proofErr w:type="gramEnd"/>
       <w:r>
         <w:t>2.5, 3.7, etc.)</w:t>
       </w:r>
@@ -611,7 +636,15 @@
         <w:t>, following is the formula for cross entropy which will gives values from 0 or 1</w:t>
       </w:r>
       <w:r>
-        <w:t xml:space="preserve"> when we put 0 or 1 values to yi.</w:t>
+        <w:t xml:space="preserve"> when we put 0 or 1 values to </w:t>
+      </w:r>
+      <w:proofErr w:type="spellStart"/>
+      <w:r>
+        <w:t>yi</w:t>
+      </w:r>
+      <w:proofErr w:type="spellEnd"/>
+      <w:r>
+        <w:t>.</w:t>
       </w:r>
     </w:p>
     <w:p>
@@ -731,7 +764,23 @@
           <w:b/>
           <w:bCs/>
         </w:rPr>
-        <w:t xml:space="preserve">ratio between the true positives(TP) and all the positive examples (TP+FP) </w:t>
+        <w:t xml:space="preserve">ratio between the true </w:t>
+      </w:r>
+      <w:proofErr w:type="gramStart"/>
+      <w:r>
+        <w:rPr>
+          <w:b/>
+          <w:bCs/>
+        </w:rPr>
+        <w:t>positives(</w:t>
+      </w:r>
+      <w:proofErr w:type="gramEnd"/>
+      <w:r>
+        <w:rPr>
+          <w:b/>
+          <w:bCs/>
+        </w:rPr>
+        <w:t xml:space="preserve">TP) and all the positive examples (TP+FP) </w:t>
       </w:r>
       <w:r>
         <w:t xml:space="preserve">predicted by the model. In other words, precision measures how many of the predicted positive examples are </w:t>
@@ -835,13 +884,54 @@
           <w:sz w:val="28"/>
           <w:szCs w:val="28"/>
         </w:rPr>
-        <w:t>7. What is the difference between upsampling and downsampling?</w:t>
+        <w:t xml:space="preserve">7. What is the difference between </w:t>
+      </w:r>
+      <w:proofErr w:type="spellStart"/>
+      <w:r>
+        <w:rPr>
+          <w:b/>
+          <w:bCs/>
+          <w:sz w:val="28"/>
+          <w:szCs w:val="28"/>
+        </w:rPr>
+        <w:t>upsampling</w:t>
+      </w:r>
+      <w:proofErr w:type="spellEnd"/>
+      <w:r>
+        <w:rPr>
+          <w:b/>
+          <w:bCs/>
+          <w:sz w:val="28"/>
+          <w:szCs w:val="28"/>
+        </w:rPr>
+        <w:t xml:space="preserve"> and </w:t>
+      </w:r>
+      <w:proofErr w:type="spellStart"/>
+      <w:r>
+        <w:rPr>
+          <w:b/>
+          <w:bCs/>
+          <w:sz w:val="28"/>
+          <w:szCs w:val="28"/>
+        </w:rPr>
+        <w:t>downsampling</w:t>
+      </w:r>
+      <w:proofErr w:type="spellEnd"/>
+      <w:r>
+        <w:rPr>
+          <w:b/>
+          <w:bCs/>
+          <w:sz w:val="28"/>
+          <w:szCs w:val="28"/>
+        </w:rPr>
+        <w:t>?</w:t>
       </w:r>
     </w:p>
     <w:p>
       <w:r>
         <w:t xml:space="preserve"> In </w:t>
       </w:r>
+      <w:proofErr w:type="spellStart"/>
       <w:r>
         <w:rPr>
           <w:b/>
@@ -849,6 +939,7 @@
         </w:rPr>
         <w:t>upsampling</w:t>
       </w:r>
+      <w:proofErr w:type="spellEnd"/>
       <w:r>
         <w:t xml:space="preserve"> method, we </w:t>
       </w:r>
@@ -880,7 +971,15 @@
         <w:t>dataset gets balanced for each class</w:t>
       </w:r>
       <w:r>
-        <w:t xml:space="preserve">. But, here is a </w:t>
+        <w:t xml:space="preserve">. </w:t>
+      </w:r>
+      <w:proofErr w:type="gramStart"/>
+      <w:r>
+        <w:t>But,</w:t>
+      </w:r>
+      <w:proofErr w:type="gramEnd"/>
+      <w:r>
+        <w:t xml:space="preserve"> here is a </w:t>
       </w:r>
       <w:r>
         <w:rPr>
@@ -907,6 +1006,7 @@
       <w:r>
         <w:t xml:space="preserve">In </w:t>
       </w:r>
+      <w:proofErr w:type="spellStart"/>
       <w:r>
         <w:rPr>
           <w:b/>
@@ -914,6 +1014,7 @@
         </w:rPr>
         <w:t>downsampling</w:t>
       </w:r>
+      <w:proofErr w:type="spellEnd"/>
       <w:r>
         <w:t xml:space="preserve">, we </w:t>
       </w:r>
@@ -1044,7 +1145,23 @@
           <w:b/>
           <w:bCs/>
         </w:rPr>
-        <w:t xml:space="preserve"> Upsampling Example:</w:t>
+        <w:t xml:space="preserve"> </w:t>
+      </w:r>
+      <w:proofErr w:type="spellStart"/>
+      <w:r>
+        <w:rPr>
+          <w:b/>
+          <w:bCs/>
+        </w:rPr>
+        <w:t>Upsampling</w:t>
+      </w:r>
+      <w:proofErr w:type="spellEnd"/>
+      <w:r>
+        <w:rPr>
+          <w:b/>
+          <w:bCs/>
+        </w:rPr>
+        <w:t xml:space="preserve"> Example:</w:t>
       </w:r>
     </w:p>
     <w:p>
@@ -1092,8 +1209,21 @@
         </w:numPr>
       </w:pPr>
       <w:r>
-        <w:t>Spam: EmailA, EmailB</w:t>
-      </w:r>
+        <w:t xml:space="preserve">Spam: </w:t>
+      </w:r>
+      <w:proofErr w:type="spellStart"/>
+      <w:r>
+        <w:t>EmailA</w:t>
+      </w:r>
+      <w:proofErr w:type="spellEnd"/>
+      <w:r>
+        <w:t xml:space="preserve">, </w:t>
+      </w:r>
+      <w:proofErr w:type="spellStart"/>
+      <w:r>
+        <w:t>EmailB</w:t>
+      </w:r>
+      <w:proofErr w:type="spellEnd"/>
     </w:p>
     <w:p>
       <w:pPr>
@@ -1102,12 +1232,21 @@
           <w:numId w:val="4"/>
         </w:numPr>
       </w:pPr>
-      <w:r>
-        <w:rPr>
-          <w:b/>
-          <w:bCs/>
-        </w:rPr>
-        <w:t>Upsample Spam</w:t>
+      <w:proofErr w:type="spellStart"/>
+      <w:r>
+        <w:rPr>
+          <w:b/>
+          <w:bCs/>
+        </w:rPr>
+        <w:t>Upsample</w:t>
+      </w:r>
+      <w:proofErr w:type="spellEnd"/>
+      <w:r>
+        <w:rPr>
+          <w:b/>
+          <w:bCs/>
+        </w:rPr>
+        <w:t xml:space="preserve"> Spam</w:t>
       </w:r>
       <w:r>
         <w:t xml:space="preserve"> by randomly duplicating samples:</w:t>
@@ -1121,8 +1260,77 @@
         </w:numPr>
       </w:pPr>
       <w:r>
-        <w:t>Spam after upsampling: EmailA, EmailB, EmailA, EmailB, EmailA, EmailB, EmailA, EmailB</w:t>
-      </w:r>
+        <w:t xml:space="preserve">Spam after </w:t>
+      </w:r>
+      <w:proofErr w:type="spellStart"/>
+      <w:r>
+        <w:t>upsampling</w:t>
+      </w:r>
+      <w:proofErr w:type="spellEnd"/>
+      <w:r>
+        <w:t xml:space="preserve">: </w:t>
+      </w:r>
+      <w:proofErr w:type="spellStart"/>
+      <w:r>
+        <w:t>EmailA</w:t>
+      </w:r>
+      <w:proofErr w:type="spellEnd"/>
+      <w:r>
+        <w:t xml:space="preserve">, </w:t>
+      </w:r>
+      <w:proofErr w:type="spellStart"/>
+      <w:r>
+        <w:t>EmailB</w:t>
+      </w:r>
+      <w:proofErr w:type="spellEnd"/>
+      <w:r>
+        <w:t xml:space="preserve">, </w:t>
+      </w:r>
+      <w:proofErr w:type="spellStart"/>
+      <w:r>
+        <w:t>EmailA</w:t>
+      </w:r>
+      <w:proofErr w:type="spellEnd"/>
+      <w:r>
+        <w:t xml:space="preserve">, </w:t>
+      </w:r>
+      <w:proofErr w:type="spellStart"/>
+      <w:r>
+        <w:t>EmailB</w:t>
+      </w:r>
+      <w:proofErr w:type="spellEnd"/>
+      <w:r>
+        <w:t xml:space="preserve">, </w:t>
+      </w:r>
+      <w:proofErr w:type="spellStart"/>
+      <w:r>
+        <w:t>EmailA</w:t>
+      </w:r>
+      <w:proofErr w:type="spellEnd"/>
+      <w:r>
+        <w:t xml:space="preserve">, </w:t>
+      </w:r>
+      <w:proofErr w:type="spellStart"/>
+      <w:r>
+        <w:t>EmailB</w:t>
+      </w:r>
+      <w:proofErr w:type="spellEnd"/>
+      <w:r>
+        <w:t xml:space="preserve">, </w:t>
+      </w:r>
+      <w:proofErr w:type="spellStart"/>
+      <w:r>
+        <w:t>EmailA</w:t>
+      </w:r>
+      <w:proofErr w:type="spellEnd"/>
+      <w:r>
+        <w:t xml:space="preserve">, </w:t>
+      </w:r>
+      <w:proofErr w:type="spellStart"/>
+      <w:r>
+        <w:t>EmailB</w:t>
+      </w:r>
+      <w:proofErr w:type="spellEnd"/>
     </w:p>
     <w:p>
       <w:pPr>
@@ -1196,7 +1404,23 @@
           <w:b/>
           <w:bCs/>
         </w:rPr>
-        <w:t xml:space="preserve"> Downsampling Example:</w:t>
+        <w:t xml:space="preserve"> </w:t>
+      </w:r>
+      <w:proofErr w:type="spellStart"/>
+      <w:r>
+        <w:rPr>
+          <w:b/>
+          <w:bCs/>
+        </w:rPr>
+        <w:t>Downsampling</w:t>
+      </w:r>
+      <w:proofErr w:type="spellEnd"/>
+      <w:r>
+        <w:rPr>
+          <w:b/>
+          <w:bCs/>
+        </w:rPr>
+        <w:t xml:space="preserve"> Example:</w:t>
       </w:r>
     </w:p>
     <w:p>
@@ -1254,8 +1478,21 @@
         </w:numPr>
       </w:pPr>
       <w:r>
-        <w:t>Spam: EmailA, EmailB</w:t>
-      </w:r>
+        <w:t xml:space="preserve">Spam: </w:t>
+      </w:r>
+      <w:proofErr w:type="spellStart"/>
+      <w:r>
+        <w:t>EmailA</w:t>
+      </w:r>
+      <w:proofErr w:type="spellEnd"/>
+      <w:r>
+        <w:t xml:space="preserve">, </w:t>
+      </w:r>
+      <w:proofErr w:type="spellStart"/>
+      <w:r>
+        <w:t>EmailB</w:t>
+      </w:r>
+      <w:proofErr w:type="spellEnd"/>
     </w:p>
     <w:p>
       <w:pPr>
@@ -1264,12 +1501,21 @@
           <w:numId w:val="5"/>
         </w:numPr>
       </w:pPr>
-      <w:r>
-        <w:rPr>
-          <w:b/>
-          <w:bCs/>
-        </w:rPr>
-        <w:t>Downsample Not Spam</w:t>
+      <w:proofErr w:type="spellStart"/>
+      <w:r>
+        <w:rPr>
+          <w:b/>
+          <w:bCs/>
+        </w:rPr>
+        <w:t>Downsample</w:t>
+      </w:r>
+      <w:proofErr w:type="spellEnd"/>
+      <w:r>
+        <w:rPr>
+          <w:b/>
+          <w:bCs/>
+        </w:rPr>
+        <w:t xml:space="preserve"> Not Spam</w:t>
       </w:r>
       <w:r>
         <w:t xml:space="preserve"> by randomly selecting 2 emails:</w:t>
@@ -1283,7 +1529,15 @@
         </w:numPr>
       </w:pPr>
       <w:r>
-        <w:t>Not Spam after downsampling: Email3, Email7</w:t>
+        <w:t xml:space="preserve">Not Spam after </w:t>
+      </w:r>
+      <w:proofErr w:type="spellStart"/>
+      <w:r>
+        <w:t>downsampling</w:t>
+      </w:r>
+      <w:proofErr w:type="spellEnd"/>
+      <w:r>
+        <w:t>: Email3, Email7</w:t>
       </w:r>
     </w:p>
     <w:p>
@@ -1347,7 +1601,27 @@
           <w:sz w:val="28"/>
           <w:szCs w:val="28"/>
         </w:rPr>
-        <w:t>8. What is data leakage and how we can found it?</w:t>
+        <w:t xml:space="preserve">8. What is data leakage and how we can </w:t>
+      </w:r>
+      <w:proofErr w:type="gramStart"/>
+      <w:r>
+        <w:rPr>
+          <w:b/>
+          <w:bCs/>
+          <w:sz w:val="28"/>
+          <w:szCs w:val="28"/>
+        </w:rPr>
+        <w:t>found</w:t>
+      </w:r>
+      <w:proofErr w:type="gramEnd"/>
+      <w:r>
+        <w:rPr>
+          <w:b/>
+          <w:bCs/>
+          <w:sz w:val="28"/>
+          <w:szCs w:val="28"/>
+        </w:rPr>
+        <w:t xml:space="preserve"> it?</w:t>
       </w:r>
     </w:p>
     <w:p>
@@ -1671,8 +1945,13 @@
       </w:r>
     </w:p>
     <w:p>
-      <w:r>
-        <w:t xml:space="preserve">max_depth: Sometimes the larger depth of the tree can create overfitting. To overcome it, the depth should be limited. </w:t>
+      <w:proofErr w:type="spellStart"/>
+      <w:r>
+        <w:t>max_depth</w:t>
+      </w:r>
+      <w:proofErr w:type="spellEnd"/>
+      <w:r>
+        <w:t xml:space="preserve">: Sometimes the larger depth of the tree can create overfitting. To overcome it, the depth should be limited. </w:t>
       </w:r>
     </w:p>
     <w:p>
@@ -1684,8 +1963,13 @@
       </w:r>
     </w:p>
     <w:p>
-      <w:r>
-        <w:t>max_leaf_nodes: It helps the model to control the splitting of the nodes and in turn, the depth of the model is also restricted</w:t>
+      <w:proofErr w:type="spellStart"/>
+      <w:r>
+        <w:t>max_leaf_nodes</w:t>
+      </w:r>
+      <w:proofErr w:type="spellEnd"/>
+      <w:r>
+        <w:t>: It helps the model to control the splitting of the nodes and in turn, the depth of the model is also restricted</w:t>
       </w:r>
     </w:p>
     <w:p>
@@ -1799,7 +2083,27 @@
           <w:sz w:val="28"/>
           <w:szCs w:val="28"/>
         </w:rPr>
-        <w:t>What is the bias-variance tradeoff?</w:t>
+        <w:t xml:space="preserve">What is the bias-variance </w:t>
+      </w:r>
+      <w:proofErr w:type="spellStart"/>
+      <w:r>
+        <w:rPr>
+          <w:b/>
+          <w:bCs/>
+          <w:sz w:val="28"/>
+          <w:szCs w:val="28"/>
+        </w:rPr>
+        <w:t>tradeoff</w:t>
+      </w:r>
+      <w:proofErr w:type="spellEnd"/>
+      <w:r>
+        <w:rPr>
+          <w:b/>
+          <w:bCs/>
+          <w:sz w:val="28"/>
+          <w:szCs w:val="28"/>
+        </w:rPr>
+        <w:t>?</w:t>
       </w:r>
     </w:p>
     <w:p>
@@ -1866,7 +2170,15 @@
         <w:t xml:space="preserve">unable to learn the patterns </w:t>
       </w:r>
       <w:r>
-        <w:t xml:space="preserve">present in the data i.e the underfitting. </w:t>
+        <w:t xml:space="preserve">present in the data </w:t>
+      </w:r>
+      <w:proofErr w:type="spellStart"/>
+      <w:r>
+        <w:t>i.e</w:t>
+      </w:r>
+      <w:proofErr w:type="spellEnd"/>
+      <w:r>
+        <w:t xml:space="preserve"> the underfitting. </w:t>
       </w:r>
       <w:r>
         <w:t xml:space="preserve">It will </w:t>
@@ -1920,12 +2232,21 @@
       <w:r>
         <w:t xml:space="preserve">Variance is </w:t>
       </w:r>
-      <w:r>
-        <w:rPr>
-          <w:b/>
-          <w:bCs/>
-        </w:rPr>
-        <w:t>occur on test data</w:t>
+      <w:proofErr w:type="gramStart"/>
+      <w:r>
+        <w:rPr>
+          <w:b/>
+          <w:bCs/>
+        </w:rPr>
+        <w:t>occur</w:t>
+      </w:r>
+      <w:proofErr w:type="gramEnd"/>
+      <w:r>
+        <w:rPr>
+          <w:b/>
+          <w:bCs/>
+        </w:rPr>
+        <w:t xml:space="preserve"> on test data</w:t>
       </w:r>
       <w:r>
         <w:t xml:space="preserve">, </w:t>
@@ -2070,7 +2391,15 @@
     </w:p>
     <w:p>
       <w:r>
-        <w:t>No, there is no such necessary condition that the data must be split into 80:20 ratio. The main purpose of the splitting is to have some data which the model has not seen previously so, that we can evaluate the performance of the model. If the dataset contains let’s say 50,000 rows of data then only 1000 or maybe 2000 rows of data is enough to evaluate the model’s performance.</w:t>
+        <w:t xml:space="preserve">No, there is no such necessary condition that the data must be split into 80:20 ratio. The main purpose of the splitting is to have some data which the model has not seen previously so, that we can evaluate the performance of the model. If the dataset contains let’s say 50,000 rows of </w:t>
+      </w:r>
+      <w:proofErr w:type="gramStart"/>
+      <w:r>
+        <w:t>data</w:t>
+      </w:r>
+      <w:proofErr w:type="gramEnd"/>
+      <w:r>
+        <w:t xml:space="preserve"> then only 1000 or maybe 2000 rows of data is enough to evaluate the model’s performance.</w:t>
       </w:r>
     </w:p>
     <w:p/>
@@ -2095,7 +2424,15 @@
     </w:p>
     <w:p>
       <w:r>
-        <w:t>Principal Component Analysis (PCA) is an unsupervised machine learning technique used for dimensionality reduction. It reduces the number of features in a dataset while preserving most of its variance—often around 95%. This helps simplify the data, making it easier to visualize, analyze, or use in other algorithms. PCA is especially useful for high-dimensional data and is commonly applied in tasks like image compression and data visualization.</w:t>
+        <w:t xml:space="preserve">Principal Component Analysis (PCA) is an unsupervised machine learning technique used for dimensionality reduction. It reduces the number of features in a dataset while preserving most of its variance—often around 95%. This helps simplify the data, making it easier to visualize, </w:t>
+      </w:r>
+      <w:proofErr w:type="spellStart"/>
+      <w:r>
+        <w:t>analyze</w:t>
+      </w:r>
+      <w:proofErr w:type="spellEnd"/>
+      <w:r>
+        <w:t>, or use in other algorithms. PCA is especially useful for high-dimensional data and is commonly applied in tasks like image compression and data visualization.</w:t>
       </w:r>
     </w:p>
     <w:p>
@@ -2264,7 +2601,23 @@
         <w:t>−</w:t>
       </w:r>
       <w:r>
-        <w:t xml:space="preserve">y ( 1 2)2 ( 1 2)2 </w:t>
+        <w:t xml:space="preserve">y </w:t>
+      </w:r>
+      <w:proofErr w:type="gramStart"/>
+      <w:r>
+        <w:t>( 1</w:t>
+      </w:r>
+      <w:proofErr w:type="gramEnd"/>
+      <w:r>
+        <w:t xml:space="preserve"> 2)2 </w:t>
+      </w:r>
+      <w:proofErr w:type="gramStart"/>
+      <w:r>
+        <w:t>( 1</w:t>
+      </w:r>
+      <w:proofErr w:type="gramEnd"/>
+      <w:r>
+        <w:t xml:space="preserve"> 2)2 </w:t>
       </w:r>
     </w:p>
     <w:p>
@@ -2737,7 +3090,23 @@
         <w:t>EX:</w:t>
       </w:r>
       <w:r>
-        <w:t xml:space="preserve"> (1,2),(2,3),(3,4), the centroid is the average point, which is (2,3).</w:t>
+        <w:t xml:space="preserve"> (1,2</w:t>
+      </w:r>
+      <w:proofErr w:type="gramStart"/>
+      <w:r>
+        <w:t>),(</w:t>
+      </w:r>
+      <w:proofErr w:type="gramEnd"/>
+      <w:r>
+        <w:t>2,3</w:t>
+      </w:r>
+      <w:proofErr w:type="gramStart"/>
+      <w:r>
+        <w:t>),(</w:t>
+      </w:r>
+      <w:proofErr w:type="gramEnd"/>
+      <w:r>
+        <w:t>3,4), the centroid is the average point, which is (2,3).</w:t>
       </w:r>
     </w:p>
     <w:p>
@@ -2749,7 +3118,15 @@
         <w:t xml:space="preserve">K-means ++ - </w:t>
       </w:r>
       <w:r>
-        <w:t>Chooses very long distance centroid points to spread out well</w:t>
+        <w:t xml:space="preserve">Chooses very </w:t>
+      </w:r>
+      <w:proofErr w:type="gramStart"/>
+      <w:r>
+        <w:t>long distance</w:t>
+      </w:r>
+      <w:proofErr w:type="gramEnd"/>
+      <w:r>
+        <w:t xml:space="preserve"> centroid points to spread out well</w:t>
       </w:r>
     </w:p>
     <w:p>
@@ -3283,7 +3660,15 @@
     </w:p>
     <w:p>
       <w:r>
-        <w:t>Decision trees and random forests are both relatively robust to outliers. A random forest model is an ensemble of multiple decision trees so, the output of a random forest model is an aggregate of multiple decision trees. So, when we average the results the chances of overfitting get reduced. Hence we can say that the random forest models are more robust to outliers</w:t>
+        <w:t xml:space="preserve">Decision trees and random forests are both relatively robust to outliers. A random forest model is an ensemble of multiple decision trees so, the output of a random forest model is an aggregate of multiple decision trees. So, when we average the results the chances of overfitting get reduced. </w:t>
+      </w:r>
+      <w:proofErr w:type="gramStart"/>
+      <w:r>
+        <w:t>Hence</w:t>
+      </w:r>
+      <w:proofErr w:type="gramEnd"/>
+      <w:r>
+        <w:t xml:space="preserve"> we can say that the random forest models are more robust to outliers</w:t>
       </w:r>
       <w:r>
         <w:t>.</w:t>
@@ -3310,7 +3695,15 @@
     </w:p>
     <w:p>
       <w:r>
-        <w:t>L1 regularization (Lasso regularization)adds the sum of the absolute values of the model’s weights to the loss function. This penalty encourages sparsity in the model by pushing the weights of less important features to exactly zero.</w:t>
+        <w:t xml:space="preserve">L1 regularization (Lasso </w:t>
+      </w:r>
+      <w:proofErr w:type="gramStart"/>
+      <w:r>
+        <w:t>regularization)adds</w:t>
+      </w:r>
+      <w:proofErr w:type="gramEnd"/>
+      <w:r>
+        <w:t xml:space="preserve"> the sum of the absolute values of the model’s weights to the loss function. This penalty encourages sparsity in the model by pushing the weights of less important features to exactly zero.</w:t>
       </w:r>
     </w:p>
     <w:p>
@@ -3376,6 +3769,7 @@
       <w:r>
         <w:t xml:space="preserve"> between the input x and a fixed point (called the </w:t>
       </w:r>
+      <w:proofErr w:type="spellStart"/>
       <w:r>
         <w:rPr>
           <w:b/>
@@ -3383,6 +3777,7 @@
         </w:rPr>
         <w:t>center</w:t>
       </w:r>
+      <w:proofErr w:type="spellEnd"/>
       <w:r>
         <w:t xml:space="preserve">). It's commonly used in machine learning for </w:t>
       </w:r>
@@ -3576,6 +3971,9 @@
         </w:tabs>
       </w:pPr>
       <w:r>
+        <w:rPr>
+          <w:noProof/>
+        </w:rPr>
         <w:lastRenderedPageBreak/>
         <w:drawing>
           <wp:inline distT="0" distB="0" distL="0" distR="0" wp14:anchorId="75C722DB" wp14:editId="613FD301">
@@ -3622,13 +4020,84 @@
         </w:rPr>
       </w:pPr>
     </w:p>
-    <w:p/>
+    <w:p>
+      <w:pPr>
+        <w:rPr>
+          <w:b/>
+          <w:bCs/>
+          <w:sz w:val="28"/>
+          <w:szCs w:val="28"/>
+        </w:rPr>
+      </w:pPr>
+      <w:r>
+        <w:rPr>
+          <w:b/>
+          <w:bCs/>
+          <w:sz w:val="28"/>
+          <w:szCs w:val="28"/>
+        </w:rPr>
+        <w:t>26. Does the accuracy score always a good metric to measure the performance of a classification model</w:t>
+      </w:r>
+    </w:p>
     <w:p>
       <w:pPr>
         <w:rPr>
           <w:lang w:val="en-US"/>
         </w:rPr>
       </w:pPr>
+      <w:r>
+        <w:t xml:space="preserve">Accuracy is </w:t>
+      </w:r>
+      <w:r>
+        <w:rPr>
+          <w:b/>
+          <w:bCs/>
+        </w:rPr>
+        <w:t>not always a reliable metric</w:t>
+      </w:r>
+      <w:r>
+        <w:t xml:space="preserve">, especially with </w:t>
+      </w:r>
+      <w:r>
+        <w:rPr>
+          <w:b/>
+          <w:bCs/>
+        </w:rPr>
+        <w:t>imbalanced datasets</w:t>
+      </w:r>
+      <w:r>
+        <w:t xml:space="preserve">. In such cases, </w:t>
+      </w:r>
+      <w:r>
+        <w:rPr>
+          <w:b/>
+          <w:bCs/>
+        </w:rPr>
+        <w:t>precision</w:t>
+      </w:r>
+      <w:r>
+        <w:t xml:space="preserve">, </w:t>
+      </w:r>
+      <w:r>
+        <w:rPr>
+          <w:b/>
+          <w:bCs/>
+        </w:rPr>
+        <w:t>recall</w:t>
+      </w:r>
+      <w:r>
+        <w:t xml:space="preserve">, and the </w:t>
+      </w:r>
+      <w:r>
+        <w:rPr>
+          <w:b/>
+          <w:bCs/>
+        </w:rPr>
+        <w:t>F1-score</w:t>
+      </w:r>
+      <w:r>
+        <w:t xml:space="preserve"> (harmonic mean of precision and recall) provide better insight into a classification model's performance.</w:t>
+      </w:r>
     </w:p>
     <w:sectPr>
       <w:pgSz w:w="11906" w:h="16838"/>

</xml_diff>

<commit_message>
What is KNN Imputer and how does it work?
</commit_message>
<xml_diff>
--- a/ML_Interview_questions.docx
+++ b/ML_Interview_questions.docx
@@ -4040,63 +4040,147 @@
       </w:r>
     </w:p>
     <w:p>
+      <w:r>
+        <w:t xml:space="preserve">Accuracy is </w:t>
+      </w:r>
+      <w:r>
+        <w:rPr>
+          <w:b/>
+          <w:bCs/>
+        </w:rPr>
+        <w:t>not always a reliable metric</w:t>
+      </w:r>
+      <w:r>
+        <w:t xml:space="preserve">, especially with </w:t>
+      </w:r>
+      <w:r>
+        <w:rPr>
+          <w:b/>
+          <w:bCs/>
+        </w:rPr>
+        <w:t>imbalanced datasets</w:t>
+      </w:r>
+      <w:r>
+        <w:t xml:space="preserve">. In such cases, </w:t>
+      </w:r>
+      <w:r>
+        <w:rPr>
+          <w:b/>
+          <w:bCs/>
+        </w:rPr>
+        <w:t>precision</w:t>
+      </w:r>
+      <w:r>
+        <w:t xml:space="preserve">, </w:t>
+      </w:r>
+      <w:r>
+        <w:rPr>
+          <w:b/>
+          <w:bCs/>
+        </w:rPr>
+        <w:t>recall</w:t>
+      </w:r>
+      <w:r>
+        <w:t xml:space="preserve">, and the </w:t>
+      </w:r>
+      <w:r>
+        <w:rPr>
+          <w:b/>
+          <w:bCs/>
+        </w:rPr>
+        <w:t>F1-score</w:t>
+      </w:r>
+      <w:r>
+        <w:t xml:space="preserve"> (harmonic mean of precision and recall) provide better insight into a classification model's performance.</w:t>
+      </w:r>
+    </w:p>
+    <w:p>
+      <w:pPr>
+        <w:rPr>
+          <w:b/>
+          <w:bCs/>
+          <w:sz w:val="28"/>
+          <w:szCs w:val="28"/>
+        </w:rPr>
+      </w:pPr>
+      <w:r>
+        <w:rPr>
+          <w:b/>
+          <w:bCs/>
+          <w:sz w:val="28"/>
+          <w:szCs w:val="28"/>
+        </w:rPr>
+        <w:t xml:space="preserve">27. What is KNN Imputer and how does it work? </w:t>
+      </w:r>
+    </w:p>
+    <w:p>
+      <w:r>
+        <w:t xml:space="preserve">KNN Imputer imputes missing values in a dataset compared to traditional methods like using mean, median, or mode. It is based on the K-Nearest </w:t>
+      </w:r>
+      <w:proofErr w:type="spellStart"/>
+      <w:r>
+        <w:t>Neighbors</w:t>
+      </w:r>
+      <w:proofErr w:type="spellEnd"/>
+      <w:r>
+        <w:t xml:space="preserve"> (KNN) algorithm, which fills missing values by referencing the values of the nearest </w:t>
+      </w:r>
+      <w:proofErr w:type="spellStart"/>
+      <w:r>
+        <w:t>neighbors</w:t>
+      </w:r>
+      <w:proofErr w:type="spellEnd"/>
+      <w:r>
+        <w:t xml:space="preserve">. </w:t>
+      </w:r>
+    </w:p>
+    <w:p>
+      <w:r>
+        <w:t xml:space="preserve">Here’s how it works: </w:t>
+      </w:r>
+    </w:p>
+    <w:p>
+      <w:proofErr w:type="spellStart"/>
+      <w:r>
+        <w:t>Neighborhood</w:t>
+      </w:r>
+      <w:proofErr w:type="spellEnd"/>
+      <w:r>
+        <w:t xml:space="preserve">-based Imputation: The KNN Imputer identifies the k nearest </w:t>
+      </w:r>
+      <w:proofErr w:type="spellStart"/>
+      <w:r>
+        <w:t>neighbors</w:t>
+      </w:r>
+      <w:proofErr w:type="spellEnd"/>
+      <w:r>
+        <w:t xml:space="preserve"> to the data point with the missing value, based on a distance metric (e.g., Euclidean distance).</w:t>
+      </w:r>
+    </w:p>
+    <w:p>
       <w:pPr>
         <w:rPr>
           <w:lang w:val="en-US"/>
         </w:rPr>
       </w:pPr>
       <w:r>
-        <w:t xml:space="preserve">Accuracy is </w:t>
-      </w:r>
-      <w:r>
-        <w:rPr>
-          <w:b/>
-          <w:bCs/>
-        </w:rPr>
-        <w:t>not always a reliable metric</w:t>
-      </w:r>
-      <w:r>
-        <w:t xml:space="preserve">, especially with </w:t>
-      </w:r>
-      <w:r>
-        <w:rPr>
-          <w:b/>
-          <w:bCs/>
-        </w:rPr>
-        <w:t>imbalanced datasets</w:t>
-      </w:r>
-      <w:r>
-        <w:t xml:space="preserve">. In such cases, </w:t>
-      </w:r>
-      <w:r>
-        <w:rPr>
-          <w:b/>
-          <w:bCs/>
-        </w:rPr>
-        <w:t>precision</w:t>
-      </w:r>
-      <w:r>
-        <w:t xml:space="preserve">, </w:t>
-      </w:r>
-      <w:r>
-        <w:rPr>
-          <w:b/>
-          <w:bCs/>
-        </w:rPr>
-        <w:t>recall</w:t>
-      </w:r>
-      <w:r>
-        <w:t xml:space="preserve">, and the </w:t>
-      </w:r>
-      <w:r>
-        <w:rPr>
-          <w:b/>
-          <w:bCs/>
-        </w:rPr>
-        <w:t>F1-score</w:t>
-      </w:r>
-      <w:r>
-        <w:t xml:space="preserve"> (harmonic mean of precision and recall) provide better insight into a classification model's performance.</w:t>
+        <w:t xml:space="preserve"> Imputation Process: Once the nearest </w:t>
+      </w:r>
+      <w:proofErr w:type="spellStart"/>
+      <w:r>
+        <w:t>neighbors</w:t>
+      </w:r>
+      <w:proofErr w:type="spellEnd"/>
+      <w:r>
+        <w:t xml:space="preserve"> are found, the missing value is imputed (filled) using a statistical measure, such as the mean or median, of the values from these </w:t>
+      </w:r>
+      <w:proofErr w:type="spellStart"/>
+      <w:r>
+        <w:t>neighbors</w:t>
+      </w:r>
+      <w:proofErr w:type="spellEnd"/>
+      <w:r>
+        <w:t>.</w:t>
       </w:r>
     </w:p>
     <w:sectPr>

</xml_diff>